<commit_message>
report: integrate model training and submission mapping
</commit_message>
<xml_diff>
--- a/report/experiment3_lab_report_group17_en.docx
+++ b/report/experiment3_lab_report_group17_en.docx
@@ -54,7 +54,7 @@
                 <w:rFonts w:ascii="Times New Roman" w:hAnsi="Times New Roman" w:eastAsia="Times New Roman"/>
                 <w:b w:val="0"/>
                 <w:color w:val="232323"/>
-                <w:sz w:val="18"/>
+                <w:sz w:val="17"/>
               </w:rPr>
               <w:t>ROBOTICS INTEGRATION GROUP PROJECT</w:t>
             </w:r>
@@ -88,7 +88,7 @@
                 <w:rFonts w:ascii="Times New Roman" w:hAnsi="Times New Roman" w:eastAsia="Times New Roman"/>
                 <w:b w:val="0"/>
                 <w:color w:val="232323"/>
-                <w:sz w:val="18"/>
+                <w:sz w:val="17"/>
               </w:rPr>
               <w:t>GROUP 17</w:t>
             </w:r>
@@ -104,9 +104,9 @@
       <w:r>
         <w:rPr>
           <w:rFonts w:ascii="Times New Roman" w:hAnsi="Times New Roman" w:eastAsia="Times New Roman"/>
-          <w:b/>
-          <w:color w:val="1F4E79"/>
-          <w:sz w:val="24"/>
+          <w:b w:val="0"/>
+          <w:color w:val="232323"/>
+          <w:sz w:val="20"/>
         </w:rPr>
         <w:t>EXPERIMENT 3</w:t>
       </w:r>
@@ -120,9 +120,9 @@
       <w:r>
         <w:rPr>
           <w:rFonts w:ascii="Times New Roman" w:hAnsi="Times New Roman" w:eastAsia="Times New Roman"/>
-          <w:b/>
-          <w:color w:val="1F4E79"/>
-          <w:sz w:val="46"/>
+          <w:b w:val="0"/>
+          <w:color w:val="232323"/>
+          <w:sz w:val="20"/>
         </w:rPr>
         <w:t>Desktop Object Automatic Sorting and Organization</w:t>
       </w:r>
@@ -137,7 +137,7 @@
           <w:rFonts w:ascii="Times New Roman" w:hAnsi="Times New Roman" w:eastAsia="Times New Roman"/>
           <w:b w:val="0"/>
           <w:color w:val="232323"/>
-          <w:sz w:val="24"/>
+          <w:sz w:val="20"/>
         </w:rPr>
         <w:t>Experiment 3  ·  laboratory report</w:t>
       </w:r>
@@ -150,9 +150,9 @@
       <w:r>
         <w:rPr>
           <w:rFonts w:ascii="Times New Roman" w:hAnsi="Times New Roman" w:eastAsia="Times New Roman"/>
-          <w:b/>
+          <w:b w:val="0"/>
           <w:color w:val="232323"/>
-          <w:sz w:val="28"/>
+          <w:sz w:val="20"/>
         </w:rPr>
         <w:t>Group laboratory report</w:t>
       </w:r>
@@ -477,8 +477,8 @@
         <w:rPr>
           <w:rFonts w:ascii="Times New Roman" w:hAnsi="Times New Roman" w:eastAsia="Times New Roman"/>
           <w:b w:val="0"/>
-          <w:color w:val="1F4E79"/>
-          <w:sz w:val="19"/>
+          <w:color w:val="232323"/>
+          <w:sz w:val="20"/>
         </w:rPr>
         <w:t>GitHub: https://github.com/9161942-boop/robotics-experiment-3</w:t>
       </w:r>
@@ -9842,6 +9842,138 @@
     </w:p>
     <w:p>
       <w:pPr>
+        <w:pStyle w:val="Heading2"/>
+        <w:spacing w:line="276" w:lineRule="auto" w:after="100"/>
+      </w:pPr>
+      <w:r>
+        <w:rPr>
+          <w:rFonts w:ascii="Times New Roman" w:hAnsi="Times New Roman" w:eastAsia="Times New Roman"/>
+          <w:b/>
+          <w:color w:val="1F4E79"/>
+          <w:sz w:val="23"/>
+        </w:rPr>
+        <w:t>6.4 Visual Detection Model Training and Deployment</w:t>
+      </w:r>
+    </w:p>
+    <w:p>
+      <w:pPr>
+        <w:spacing w:line="276" w:lineRule="auto" w:after="100"/>
+      </w:pPr>
+      <w:r>
+        <w:rPr>
+          <w:rFonts w:ascii="Times New Roman" w:hAnsi="Times New Roman" w:eastAsia="Times New Roman"/>
+          <w:b w:val="0"/>
+          <w:color w:val="232323"/>
+          <w:sz w:val="20"/>
+        </w:rPr>
+        <w:t>The perception module uses a YOLOv8n detector for three classes: eraser, lock, and stapler. The model outputs each class label, bounding box, and confidence. All images were collected by the group, with no public-dataset images mixed into the training set. The dataset includes single objects, mixed objects, different poses, positions, and lighting conditions; labelImg was used for manual annotation.</w:t>
+      </w:r>
+    </w:p>
+    <w:p>
+      <w:pPr>
+        <w:spacing w:line="276" w:lineRule="auto" w:after="100"/>
+      </w:pPr>
+      <w:r>
+        <w:rPr>
+          <w:rFonts w:ascii="Times New Roman" w:hAnsi="Times New Roman" w:eastAsia="Times New Roman"/>
+          <w:b w:val="0"/>
+          <w:color w:val="232323"/>
+          <w:sz w:val="20"/>
+        </w:rPr>
+        <w:t>Training used a 640-pixel input, 60 epochs, batch size 16, and an RTX 4070 Laptop GPU. Mosaic composition, hue perturbation, random scaling, and random erasing were used during training, while the independently split validation images were kept unaugmented. The final weight is 6.25 MB (about 6.3 MB) with approximately three million parameters. The supplied training record reports mAP50=0.995 and mAP50-95=0.995 for the overall set and all three classes, with precision=1.0 and recall=1.0.</w:t>
+      </w:r>
+    </w:p>
+    <w:p>
+      <w:pPr>
+        <w:spacing w:line="276" w:lineRule="auto" w:after="100"/>
+      </w:pPr>
+      <w:r>
+        <w:rPr>
+          <w:rFonts w:ascii="Times New Roman" w:hAnsi="Times New Roman" w:eastAsia="Times New Roman"/>
+          <w:b w:val="0"/>
+          <w:color w:val="232323"/>
+          <w:sz w:val="20"/>
+        </w:rPr>
+        <w:t>The iteration process addressed lock–stapler confusion, stapler–eraser confusion at specific angles, dilution of early samples after new data were added, and the gap between validation images and external-camera scenes. The corresponding actions were class-balanced sampling, same-frame comparison samples, a stronger classification-loss contribution, higher sampling weight for early samples, and targeted camera-data collection. Overall mAP50-95 improved from 0.938 to 0.995. In the supplied external-camera frame, all three classes are detected with confidence 0.89–0.94 and a displayed 31.2 FPS. The reported 1.1 ms is the single-model inference time, while 31.2 FPS is the end-to-end camera display rate.</w:t>
+      </w:r>
+    </w:p>
+    <w:p>
+      <w:pPr>
+        <w:spacing w:line="276" w:lineRule="auto" w:after="100"/>
+      </w:pPr>
+      <w:r>
+        <w:rPr>
+          <w:rFonts w:ascii="Times New Roman" w:hAnsi="Times New Roman" w:eastAsia="Times New Roman"/>
+          <w:b w:val="0"/>
+          <w:color w:val="232323"/>
+          <w:sz w:val="20"/>
+        </w:rPr>
+        <w:t>For simulation, the monitor continues to generate deterministic Detection2DArray messages from Gazebo model states so that the task and execution interfaces remain repeatable. The trained weight is archived separately in models/ for real-camera integration and hardware validation.</w:t>
+      </w:r>
+    </w:p>
+    <w:p>
+      <w:pPr>
+        <w:spacing w:line="276" w:lineRule="auto" w:after="100"/>
+        <w:jc w:val="center"/>
+      </w:pPr>
+      <w:r>
+        <w:rPr>
+          <w:rFonts w:ascii="Times New Roman" w:hAnsi="Times New Roman" w:eastAsia="Times New Roman"/>
+          <w:b w:val="0"/>
+          <w:color w:val="232323"/>
+          <w:sz w:val="20"/>
+        </w:rPr>
+        <w:drawing>
+          <wp:inline xmlns:a="http://schemas.openxmlformats.org/drawingml/2006/main" xmlns:pic="http://schemas.openxmlformats.org/drawingml/2006/picture">
+            <wp:extent cx="5257800" cy="3541083"/>
+            <wp:docPr id="10" name="Picture 10"/>
+            <wp:cNvGraphicFramePr>
+              <a:graphicFrameLocks noChangeAspect="1"/>
+            </wp:cNvGraphicFramePr>
+            <a:graphic>
+              <a:graphicData uri="http://schemas.openxmlformats.org/drawingml/2006/picture">
+                <pic:pic>
+                  <pic:nvPicPr>
+                    <pic:cNvPr id="0" name="b028d3f11213205b74b2a37d8148411b.jpg"/>
+                    <pic:cNvPicPr/>
+                  </pic:nvPicPr>
+                  <pic:blipFill>
+                    <a:blip r:embed="rId20"/>
+                    <a:stretch>
+                      <a:fillRect/>
+                    </a:stretch>
+                  </pic:blipFill>
+                  <pic:spPr>
+                    <a:xfrm>
+                      <a:off x="0" y="0"/>
+                      <a:ext cx="5257800" cy="3541083"/>
+                    </a:xfrm>
+                    <a:prstGeom prst="rect"/>
+                  </pic:spPr>
+                </pic:pic>
+              </a:graphicData>
+            </a:graphic>
+          </wp:inline>
+        </w:drawing>
+      </w:r>
+    </w:p>
+    <w:p>
+      <w:pPr>
+        <w:pStyle w:val="CaptionCustom"/>
+        <w:jc w:val="center"/>
+      </w:pPr>
+      <w:r>
+        <w:rPr>
+          <w:rFonts w:ascii="Times New Roman" w:hAnsi="Times New Roman" w:eastAsia="Times New Roman"/>
+          <w:b w:val="0"/>
+          <w:color w:val="5A5A5A"/>
+          <w:sz w:val="18"/>
+        </w:rPr>
+        <w:t>Fig. 8  External-camera detection of erasers, a lock, and a stapler</w:t>
+      </w:r>
+    </w:p>
+    <w:p>
+      <w:pPr>
         <w:pStyle w:val="Heading1"/>
         <w:keepNext/>
         <w:spacing w:before="180" w:after="80"/>
@@ -10053,11 +10185,6 @@
             <w:vAlign w:val="center"/>
           </w:tcPr>
           <w:p>
-            <w:pPr>
-              <w:spacing w:before="0" w:after="0" w:line="240" w:lineRule="auto"/>
-              <w:ind w:left="0" w:right="0" w:firstLine="0"/>
-              <w:jc w:val="left"/>
-            </w:pPr>
             <w:r>
               <w:rPr>
                 <w:rFonts w:ascii="Times New Roman" w:hAnsi="Times New Roman" w:eastAsia="Times New Roman"/>
@@ -10065,7 +10192,7 @@
                 <w:color w:val="232323"/>
                 <w:sz w:val="17"/>
               </w:rPr>
-              <w:t>Gazebo scene, six-cell grid, and bin adjustment; manual teaching; grasp, attachment, vertical release, and evidence review</w:t>
+              <w:t>Gazebo scene, six-cell grid, and bin adjustment; YOLOv8n data collection, training, external-camera validation; manual teaching; grasp, attachment, vertical release, and evidence review</w:t>
             </w:r>
           </w:p>
         </w:tc>
@@ -10088,11 +10215,6 @@
             <w:vAlign w:val="center"/>
           </w:tcPr>
           <w:p>
-            <w:pPr>
-              <w:spacing w:before="0" w:after="0" w:line="240" w:lineRule="auto"/>
-              <w:ind w:left="0" w:right="0" w:firstLine="0"/>
-              <w:jc w:val="left"/>
-            </w:pPr>
             <w:r>
               <w:rPr>
                 <w:rFonts w:ascii="Times New Roman" w:hAnsi="Times New Roman" w:eastAsia="Times New Roman"/>
@@ -10100,7 +10222,7 @@
                 <w:color w:val="232323"/>
                 <w:sz w:val="17"/>
               </w:rPr>
-              <w:t>sorting_desktop.world; manual_animation.json; GUI and CSV verification</w:t>
+              <w:t>sorting_desktop.world; manual_animation.json; models/best_yolov8n_eraser_lock_stapler.pt; detection screenshot; GUI and CSV verification</w:t>
             </w:r>
           </w:p>
         </w:tc>
@@ -11128,6 +11250,72 @@
           </w:p>
         </w:tc>
       </w:tr>
+      <w:tr>
+        <w:trPr>
+          <w:cantSplit/>
+          <w:trHeight w:val="432" w:hRule="atLeast"/>
+        </w:trPr>
+        <w:tc>
+          <w:tcPr>
+            <w:tcW w:type="dxa" w:w="2376"/>
+            <w:tcMar>
+              <w:top w:w="90" w:type="dxa"/>
+              <w:start w:w="90" w:type="dxa"/>
+              <w:bottom w:w="90" w:type="dxa"/>
+              <w:end w:w="90" w:type="dxa"/>
+            </w:tcMar>
+            <w:tcBorders>
+              <w:top w:val="single" w:sz="4" w:color="B8C2CC"/>
+              <w:left w:val="single" w:sz="4" w:color="B8C2CC"/>
+              <w:bottom w:val="single" w:sz="4" w:color="B8C2CC"/>
+              <w:right w:val="single" w:sz="4" w:color="B8C2CC"/>
+            </w:tcBorders>
+            <w:shd w:fill="F7FAFC"/>
+            <w:vAlign w:val="center"/>
+          </w:tcPr>
+          <w:p>
+            <w:r>
+              <w:rPr>
+                <w:rFonts w:ascii="Times New Roman" w:hAnsi="Times New Roman" w:eastAsia="Times New Roman"/>
+                <w:b w:val="0"/>
+                <w:color w:val="232323"/>
+                <w:sz w:val="17"/>
+              </w:rPr>
+              <w:t>Detection model and camera evidence</w:t>
+            </w:r>
+          </w:p>
+        </w:tc>
+        <w:tc>
+          <w:tcPr>
+            <w:tcW w:type="dxa" w:w="6983"/>
+            <w:tcMar>
+              <w:top w:w="90" w:type="dxa"/>
+              <w:start w:w="90" w:type="dxa"/>
+              <w:bottom w:w="90" w:type="dxa"/>
+              <w:end w:w="90" w:type="dxa"/>
+            </w:tcMar>
+            <w:tcBorders>
+              <w:top w:val="single" w:sz="4" w:color="B8C2CC"/>
+              <w:left w:val="single" w:sz="4" w:color="B8C2CC"/>
+              <w:bottom w:val="single" w:sz="4" w:color="B8C2CC"/>
+              <w:right w:val="single" w:sz="4" w:color="B8C2CC"/>
+            </w:tcBorders>
+            <w:shd w:fill="F7FAFC"/>
+            <w:vAlign w:val="center"/>
+          </w:tcPr>
+          <w:p>
+            <w:r>
+              <w:rPr>
+                <w:rFonts w:ascii="Times New Roman" w:hAnsi="Times New Roman" w:eastAsia="Times New Roman"/>
+                <w:b w:val="0"/>
+                <w:color w:val="232323"/>
+                <w:sz w:val="17"/>
+              </w:rPr>
+              <w:t>models/best_yolov8n_eraser_lock_stapler.pt; models/README.md; evidence/model_detection_realtime.png</w:t>
+            </w:r>
+          </w:p>
+        </w:tc>
+      </w:tr>
     </w:tbl>
     <w:p>
       <w:pPr>
@@ -11203,7 +11391,7 @@
           <w:color w:val="232323"/>
           <w:sz w:val="20"/>
         </w:rPr>
-        <w:t>The repository is organized into code, evidence, report, and videos directories, with a commit manifest, run instructions, and multiple commits retained. The two Gazebo demonstration videos are stored at videos/experiment3_gazebo_sorting_run_01.webm and videos/experiment3_gazebo_sorting_run_02.webm. The reports, PDFs, and screenshots are also included as GitHub evidence so that the submitted content, source, and commit times can be reviewed from the repository page.</w:t>
+        <w:t>The repository is organized into code, models, evidence, report, and videos directories, with a commit manifest, run instructions, and multiple commits retained. The two Gazebo demonstration videos are stored at videos/experiment3_gazebo_sorting_run_01.webm and videos/experiment3_gazebo_sorting_run_02.webm. The reports, PDFs, and screenshots are also included as GitHub evidence so that the submitted content, source, and commit times can be reviewed from the repository page.</w:t>
       </w:r>
     </w:p>
     <w:p>
@@ -11265,7 +11453,7 @@
           <w:color w:val="232323"/>
           <w:sz w:val="20"/>
         </w:rPr>
-        <w:t>Fig. 8  GitHub Experiment 3 repository commit history</w:t>
+        <w:t>Fig. 9  GitHub Experiment 3 repository commit history</w:t>
       </w:r>
     </w:p>
     <w:sectPr>

</xml_diff>

<commit_message>
report: unify English group report typography
</commit_message>
<xml_diff>
--- a/report/experiment3_lab_report_group17_en.docx
+++ b/report/experiment3_lab_report_group17_en.docx
@@ -9,7 +9,7 @@
       </w:pPr>
       <w:r>
         <w:rPr>
-          <w:rFonts w:ascii="Times New Roman" w:hAnsi="Times New Roman" w:eastAsia="Microsoft YaHei"/>
+          <w:rFonts w:ascii="Times New Roman" w:hAnsi="Times New Roman" w:eastAsia="Times New Roman" w:cs="Times New Roman"/>
           <w:b/>
           <w:color w:val="107B7E"/>
           <w:sz w:val="19"/>
@@ -24,7 +24,7 @@
       </w:pPr>
       <w:r>
         <w:rPr>
-          <w:rFonts w:ascii="Times New Roman" w:hAnsi="Times New Roman" w:eastAsia="Microsoft YaHei"/>
+          <w:rFonts w:ascii="Times New Roman" w:hAnsi="Times New Roman" w:eastAsia="Times New Roman" w:cs="Times New Roman"/>
           <w:b/>
           <w:color w:val="107B7E"/>
           <w:sz w:val="22"/>
@@ -40,7 +40,7 @@
       </w:pPr>
       <w:r>
         <w:rPr>
-          <w:rFonts w:ascii="Georgia" w:hAnsi="Georgia" w:eastAsia="Microsoft YaHei"/>
+          <w:rFonts w:ascii="Georgia" w:hAnsi="Georgia" w:eastAsia="Georgia" w:cs="Georgia"/>
           <w:b/>
           <w:color w:val="1B3E5B"/>
           <w:sz w:val="52"/>
@@ -57,7 +57,7 @@
       </w:pPr>
       <w:r>
         <w:rPr>
-          <w:rFonts w:ascii="Times New Roman" w:hAnsi="Times New Roman" w:eastAsia="Microsoft YaHei"/>
+          <w:rFonts w:ascii="Times New Roman" w:hAnsi="Times New Roman" w:eastAsia="Times New Roman" w:cs="Times New Roman"/>
           <w:b/>
           <w:color w:val="4B5560"/>
           <w:sz w:val="22"/>
@@ -98,7 +98,7 @@
             </w:pPr>
             <w:r>
               <w:rPr>
-                <w:rFonts w:ascii="Times New Roman" w:hAnsi="Times New Roman" w:eastAsia="Microsoft YaHei"/>
+                <w:rFonts w:ascii="Times New Roman" w:hAnsi="Times New Roman" w:eastAsia="Times New Roman" w:cs="Times New Roman"/>
                 <w:b/>
                 <w:color w:val="1B3E5B"/>
                 <w:sz w:val="18"/>
@@ -113,7 +113,7 @@
             </w:pPr>
             <w:r>
               <w:rPr>
-                <w:rFonts w:ascii="Times New Roman" w:hAnsi="Times New Roman" w:eastAsia="Microsoft YaHei"/>
+                <w:rFonts w:ascii="Times New Roman" w:hAnsi="Times New Roman" w:eastAsia="Times New Roman" w:cs="Times New Roman"/>
                 <w:b w:val="0"/>
                 <w:color w:val="4B5560"/>
                 <w:sz w:val="16"/>
@@ -135,7 +135,7 @@
             </w:pPr>
             <w:r>
               <w:rPr>
-                <w:rFonts w:ascii="Times New Roman" w:hAnsi="Times New Roman" w:eastAsia="Microsoft YaHei"/>
+                <w:rFonts w:ascii="Times New Roman" w:hAnsi="Times New Roman" w:eastAsia="Times New Roman" w:cs="Times New Roman"/>
                 <w:b/>
                 <w:color w:val="1B3E5B"/>
                 <w:sz w:val="18"/>
@@ -150,7 +150,7 @@
             </w:pPr>
             <w:r>
               <w:rPr>
-                <w:rFonts w:ascii="Times New Roman" w:hAnsi="Times New Roman" w:eastAsia="Microsoft YaHei"/>
+                <w:rFonts w:ascii="Times New Roman" w:hAnsi="Times New Roman" w:eastAsia="Times New Roman" w:cs="Times New Roman"/>
                 <w:b w:val="0"/>
                 <w:color w:val="4B5560"/>
                 <w:sz w:val="16"/>
@@ -172,7 +172,7 @@
             </w:pPr>
             <w:r>
               <w:rPr>
-                <w:rFonts w:ascii="Times New Roman" w:hAnsi="Times New Roman" w:eastAsia="Microsoft YaHei"/>
+                <w:rFonts w:ascii="Times New Roman" w:hAnsi="Times New Roman" w:eastAsia="Times New Roman" w:cs="Times New Roman"/>
                 <w:b/>
                 <w:color w:val="1B3E5B"/>
                 <w:sz w:val="18"/>
@@ -187,7 +187,7 @@
             </w:pPr>
             <w:r>
               <w:rPr>
-                <w:rFonts w:ascii="Times New Roman" w:hAnsi="Times New Roman" w:eastAsia="Microsoft YaHei"/>
+                <w:rFonts w:ascii="Times New Roman" w:hAnsi="Times New Roman" w:eastAsia="Times New Roman" w:cs="Times New Roman"/>
                 <w:b w:val="0"/>
                 <w:color w:val="4B5560"/>
                 <w:sz w:val="16"/>
@@ -245,7 +245,7 @@
       </w:pPr>
       <w:r>
         <w:rPr>
-          <w:rFonts w:ascii="Times New Roman" w:hAnsi="Times New Roman" w:eastAsia="Microsoft YaHei"/>
+          <w:rFonts w:ascii="Times New Roman" w:hAnsi="Times New Roman" w:eastAsia="Times New Roman" w:cs="Times New Roman"/>
           <w:b w:val="0"/>
           <w:color w:val="4B5560"/>
           <w:sz w:val="16"/>
@@ -283,7 +283,7 @@
             </w:pPr>
             <w:r>
               <w:rPr>
-                <w:rFonts w:ascii="Times New Roman" w:hAnsi="Times New Roman" w:eastAsia="Microsoft YaHei"/>
+                <w:rFonts w:ascii="Times New Roman" w:hAnsi="Times New Roman" w:eastAsia="Times New Roman" w:cs="Times New Roman"/>
                 <w:b/>
                 <w:color w:val="107B7E"/>
                 <w:sz w:val="18"/>
@@ -303,7 +303,7 @@
             </w:pPr>
             <w:r>
               <w:rPr>
-                <w:rFonts w:ascii="Times New Roman" w:hAnsi="Times New Roman" w:eastAsia="Microsoft YaHei"/>
+                <w:rFonts w:ascii="Times New Roman" w:hAnsi="Times New Roman" w:eastAsia="Times New Roman" w:cs="Times New Roman"/>
                 <w:b w:val="0"/>
                 <w:color w:val="1B3E5B"/>
                 <w:sz w:val="18"/>
@@ -325,7 +325,7 @@
             </w:pPr>
             <w:r>
               <w:rPr>
-                <w:rFonts w:ascii="Times New Roman" w:hAnsi="Times New Roman" w:eastAsia="Microsoft YaHei"/>
+                <w:rFonts w:ascii="Times New Roman" w:hAnsi="Times New Roman" w:eastAsia="Times New Roman" w:cs="Times New Roman"/>
                 <w:b/>
                 <w:color w:val="107B7E"/>
                 <w:sz w:val="18"/>
@@ -345,7 +345,7 @@
             </w:pPr>
             <w:r>
               <w:rPr>
-                <w:rFonts w:ascii="Times New Roman" w:hAnsi="Times New Roman" w:eastAsia="Microsoft YaHei"/>
+                <w:rFonts w:ascii="Times New Roman" w:hAnsi="Times New Roman" w:eastAsia="Times New Roman" w:cs="Times New Roman"/>
                 <w:b w:val="0"/>
                 <w:color w:val="1B3E5B"/>
                 <w:sz w:val="18"/>
@@ -363,7 +363,7 @@
       </w:pPr>
       <w:r>
         <w:rPr>
-          <w:rFonts w:ascii="Times New Roman" w:hAnsi="Times New Roman" w:eastAsia="Microsoft YaHei"/>
+          <w:rFonts w:ascii="Times New Roman" w:hAnsi="Times New Roman" w:eastAsia="Times New Roman" w:cs="Times New Roman"/>
           <w:b/>
           <w:color w:val="107B7E"/>
           <w:sz w:val="17"/>
@@ -378,7 +378,7 @@
       </w:pPr>
       <w:r>
         <w:rPr>
-          <w:rFonts w:ascii="Times New Roman" w:hAnsi="Times New Roman" w:eastAsia="Microsoft YaHei"/>
+          <w:rFonts w:ascii="Times New Roman" w:hAnsi="Times New Roman" w:eastAsia="Times New Roman" w:cs="Times New Roman"/>
           <w:b w:val="0"/>
           <w:color w:val="1B3E5B"/>
           <w:sz w:val="19"/>
@@ -393,7 +393,7 @@
       </w:pPr>
       <w:r>
         <w:rPr>
-          <w:rFonts w:ascii="Times New Roman" w:hAnsi="Times New Roman" w:eastAsia="Microsoft YaHei"/>
+          <w:rFonts w:ascii="Times New Roman" w:hAnsi="Times New Roman" w:eastAsia="Times New Roman" w:cs="Times New Roman"/>
           <w:b w:val="0"/>
           <w:color w:val="4B5560"/>
           <w:sz w:val="18"/>
@@ -410,7 +410,7 @@
       </w:pPr>
       <w:r>
         <w:rPr>
-          <w:rFonts w:ascii="Times New Roman" w:hAnsi="Times New Roman" w:eastAsia="Times New Roman"/>
+          <w:rFonts w:ascii="Times New Roman" w:hAnsi="Times New Roman" w:eastAsia="Times New Roman" w:cs="Times New Roman"/>
           <w:b/>
           <w:color w:val="1F4E79"/>
           <w:sz w:val="30"/>
@@ -424,7 +424,7 @@
       </w:pPr>
       <w:r>
         <w:rPr>
-          <w:rFonts w:ascii="Times New Roman" w:hAnsi="Times New Roman" w:eastAsia="SimSun"/>
+          <w:rFonts w:ascii="Times New Roman" w:hAnsi="Times New Roman" w:eastAsia="Times New Roman" w:cs="Times New Roman"/>
           <w:sz w:val="20"/>
         </w:rPr>
         <w:t>This experiment develops a ROS 2 system for automatic tabletop sorting around perception, grid localization, class decisions, and robot execution. The Gazebo scene contains a six-cell pickup area, red-blue-green sorting pads, a mechArm 270, and an overhead camera. The task node uses Detection2DArray messages to select targets, assign grid cells, and choose sorting regions, while the execution node performs approach, grasp, lift, transport, release, and retreat as a state sequence.</w:t>
@@ -436,7 +436,7 @@
       </w:pPr>
       <w:r>
         <w:rPr>
-          <w:rFonts w:ascii="Times New Roman" w:hAnsi="Times New Roman" w:eastAsia="SimSun"/>
+          <w:rFonts w:ascii="Times New Roman" w:hAnsi="Times New Roman" w:eastAsia="Times New Roman" w:cs="Times New Roman"/>
           <w:sz w:val="20"/>
         </w:rPr>
         <w:t>The six-object red-blue simulation baseline completed 6/6, with object-level records for the grid, target bin, grasp, release, and final state. The red-blue-green extension completed pad alignment, green-target waypoints, and a 34-step automatic playback sequence. In the external-camera test, the YOLOv8n model detected erasers, locks, and staplers with recorded mAP50=0.995 and mAP50-95=0.995, while the displayed camera rate reached 31.2 FPS.</w:t>
@@ -448,7 +448,7 @@
       </w:pPr>
       <w:r>
         <w:rPr>
-          <w:rFonts w:ascii="Times New Roman" w:hAnsi="Times New Roman" w:eastAsia="SimSun"/>
+          <w:rFonts w:ascii="Times New Roman" w:hAnsi="Times New Roman" w:eastAsia="Times New Roman" w:cs="Times New Roman"/>
           <w:sz w:val="20"/>
         </w:rPr>
         <w:t>The hardware validation completed target approach, grasp, and lift above the taped tabletop grid. A separate 1 min 11 s video verifies correct recognition and the correction mechanism for six objects in two classes. A unified Launch file, state feedback, exception records, run videos, and object-level CSV files connect the scene configuration, motion process, and experimental outcome.</w:t>
@@ -461,7 +461,7 @@
       </w:pPr>
       <w:r>
         <w:rPr>
-          <w:rFonts w:ascii="Times New Roman" w:hAnsi="Times New Roman" w:eastAsia="Times New Roman"/>
+          <w:rFonts w:ascii="Times New Roman" w:hAnsi="Times New Roman" w:eastAsia="Times New Roman" w:cs="Times New Roman"/>
           <w:b w:val="0"/>
           <w:color w:val="232323"/>
           <w:sz w:val="20"/>
@@ -477,7 +477,7 @@
       </w:pPr>
       <w:r>
         <w:rPr>
-          <w:rFonts w:ascii="Times New Roman" w:hAnsi="Times New Roman" w:eastAsia="Times New Roman"/>
+          <w:rFonts w:ascii="Times New Roman" w:hAnsi="Times New Roman" w:eastAsia="Times New Roman" w:cs="Times New Roman"/>
           <w:b/>
           <w:color w:val="1F4E79"/>
           <w:sz w:val="30"/>
@@ -493,7 +493,7 @@
       </w:pPr>
       <w:r>
         <w:rPr>
-          <w:rFonts w:ascii="Times New Roman" w:hAnsi="Times New Roman" w:eastAsia="Times New Roman"/>
+          <w:rFonts w:ascii="Times New Roman" w:hAnsi="Times New Roman" w:eastAsia="Times New Roman" w:cs="Times New Roman"/>
           <w:b/>
           <w:color w:val="1F4E79"/>
           <w:sz w:val="23"/>
@@ -507,7 +507,7 @@
       </w:pPr>
       <w:r>
         <w:rPr>
-          <w:rFonts w:ascii="Times New Roman" w:hAnsi="Times New Roman" w:eastAsia="Times New Roman"/>
+          <w:rFonts w:ascii="Times New Roman" w:hAnsi="Times New Roman" w:eastAsia="Times New Roman" w:cs="Times New Roman"/>
           <w:b w:val="0"/>
           <w:color w:val="232323"/>
           <w:sz w:val="20"/>
@@ -521,7 +521,7 @@
       </w:pPr>
       <w:r>
         <w:rPr>
-          <w:rFonts w:ascii="Times New Roman" w:hAnsi="Times New Roman" w:eastAsia="Times New Roman"/>
+          <w:rFonts w:ascii="Times New Roman" w:hAnsi="Times New Roman" w:eastAsia="Times New Roman" w:cs="Times New Roman"/>
           <w:b w:val="0"/>
           <w:color w:val="232323"/>
           <w:sz w:val="20"/>
@@ -537,7 +537,7 @@
       </w:pPr>
       <w:r>
         <w:rPr>
-          <w:rFonts w:ascii="Times New Roman" w:hAnsi="Times New Roman" w:eastAsia="Times New Roman"/>
+          <w:rFonts w:ascii="Times New Roman" w:hAnsi="Times New Roman" w:eastAsia="Times New Roman" w:cs="Times New Roman"/>
           <w:b/>
           <w:color w:val="1F4E79"/>
           <w:sz w:val="23"/>
@@ -590,7 +590,7 @@
             </w:pPr>
             <w:r>
               <w:rPr>
-                <w:rFonts w:ascii="Times New Roman" w:hAnsi="Times New Roman" w:eastAsia="Times New Roman"/>
+                <w:rFonts w:ascii="Times New Roman" w:hAnsi="Times New Roman" w:eastAsia="Times New Roman" w:cs="Times New Roman"/>
                 <w:b/>
                 <w:color w:val="FFFFFF"/>
                 <w:sz w:val="17"/>
@@ -625,7 +625,7 @@
             </w:pPr>
             <w:r>
               <w:rPr>
-                <w:rFonts w:ascii="Times New Roman" w:hAnsi="Times New Roman" w:eastAsia="Times New Roman"/>
+                <w:rFonts w:ascii="Times New Roman" w:hAnsi="Times New Roman" w:eastAsia="Times New Roman" w:cs="Times New Roman"/>
                 <w:b/>
                 <w:color w:val="FFFFFF"/>
                 <w:sz w:val="17"/>
@@ -660,7 +660,7 @@
             </w:pPr>
             <w:r>
               <w:rPr>
-                <w:rFonts w:ascii="Times New Roman" w:hAnsi="Times New Roman" w:eastAsia="Times New Roman"/>
+                <w:rFonts w:ascii="Times New Roman" w:hAnsi="Times New Roman" w:eastAsia="Times New Roman" w:cs="Times New Roman"/>
                 <w:b/>
                 <w:color w:val="FFFFFF"/>
                 <w:sz w:val="17"/>
@@ -695,7 +695,7 @@
             </w:pPr>
             <w:r>
               <w:rPr>
-                <w:rFonts w:ascii="Times New Roman" w:hAnsi="Times New Roman" w:eastAsia="Times New Roman"/>
+                <w:rFonts w:ascii="Times New Roman" w:hAnsi="Times New Roman" w:eastAsia="Times New Roman" w:cs="Times New Roman"/>
                 <w:b/>
                 <w:color w:val="FFFFFF"/>
                 <w:sz w:val="17"/>
@@ -736,7 +736,7 @@
             </w:pPr>
             <w:r>
               <w:rPr>
-                <w:rFonts w:ascii="Times New Roman" w:hAnsi="Times New Roman" w:eastAsia="Times New Roman"/>
+                <w:rFonts w:ascii="Times New Roman" w:hAnsi="Times New Roman" w:eastAsia="Times New Roman" w:cs="Times New Roman"/>
                 <w:b w:val="0"/>
                 <w:color w:val="232323"/>
                 <w:sz w:val="17"/>
@@ -771,7 +771,7 @@
             </w:pPr>
             <w:r>
               <w:rPr>
-                <w:rFonts w:ascii="Times New Roman" w:hAnsi="Times New Roman" w:eastAsia="Times New Roman"/>
+                <w:rFonts w:ascii="Times New Roman" w:hAnsi="Times New Roman" w:eastAsia="Times New Roman" w:cs="Times New Roman"/>
                 <w:b w:val="0"/>
                 <w:color w:val="232323"/>
                 <w:sz w:val="17"/>
@@ -806,7 +806,7 @@
             </w:pPr>
             <w:r>
               <w:rPr>
-                <w:rFonts w:ascii="Times New Roman" w:hAnsi="Times New Roman" w:eastAsia="Times New Roman"/>
+                <w:rFonts w:ascii="Times New Roman" w:hAnsi="Times New Roman" w:eastAsia="Times New Roman" w:cs="Times New Roman"/>
                 <w:b w:val="0"/>
                 <w:color w:val="232323"/>
                 <w:sz w:val="17"/>
@@ -841,7 +841,7 @@
             </w:pPr>
             <w:r>
               <w:rPr>
-                <w:rFonts w:ascii="Times New Roman" w:hAnsi="Times New Roman" w:eastAsia="Times New Roman"/>
+                <w:rFonts w:ascii="Times New Roman" w:hAnsi="Times New Roman" w:eastAsia="Times New Roman" w:cs="Times New Roman"/>
                 <w:b w:val="0"/>
                 <w:color w:val="232323"/>
                 <w:sz w:val="17"/>
@@ -881,7 +881,7 @@
             </w:pPr>
             <w:r>
               <w:rPr>
-                <w:rFonts w:ascii="Times New Roman" w:hAnsi="Times New Roman" w:eastAsia="Times New Roman"/>
+                <w:rFonts w:ascii="Times New Roman" w:hAnsi="Times New Roman" w:eastAsia="Times New Roman" w:cs="Times New Roman"/>
                 <w:b w:val="0"/>
                 <w:color w:val="232323"/>
                 <w:sz w:val="17"/>
@@ -915,7 +915,7 @@
             </w:pPr>
             <w:r>
               <w:rPr>
-                <w:rFonts w:ascii="Times New Roman" w:hAnsi="Times New Roman" w:eastAsia="Times New Roman"/>
+                <w:rFonts w:ascii="Times New Roman" w:hAnsi="Times New Roman" w:eastAsia="Times New Roman" w:cs="Times New Roman"/>
                 <w:b w:val="0"/>
                 <w:color w:val="232323"/>
                 <w:sz w:val="17"/>
@@ -949,7 +949,7 @@
             </w:pPr>
             <w:r>
               <w:rPr>
-                <w:rFonts w:ascii="Times New Roman" w:hAnsi="Times New Roman" w:eastAsia="Times New Roman"/>
+                <w:rFonts w:ascii="Times New Roman" w:hAnsi="Times New Roman" w:eastAsia="Times New Roman" w:cs="Times New Roman"/>
                 <w:b w:val="0"/>
                 <w:color w:val="232323"/>
                 <w:sz w:val="17"/>
@@ -983,7 +983,7 @@
             </w:pPr>
             <w:r>
               <w:rPr>
-                <w:rFonts w:ascii="Times New Roman" w:hAnsi="Times New Roman" w:eastAsia="Times New Roman"/>
+                <w:rFonts w:ascii="Times New Roman" w:hAnsi="Times New Roman" w:eastAsia="Times New Roman" w:cs="Times New Roman"/>
                 <w:b w:val="0"/>
                 <w:color w:val="232323"/>
                 <w:sz w:val="17"/>
@@ -1024,7 +1024,7 @@
             </w:pPr>
             <w:r>
               <w:rPr>
-                <w:rFonts w:ascii="Times New Roman" w:hAnsi="Times New Roman" w:eastAsia="Times New Roman"/>
+                <w:rFonts w:ascii="Times New Roman" w:hAnsi="Times New Roman" w:eastAsia="Times New Roman" w:cs="Times New Roman"/>
                 <w:b w:val="0"/>
                 <w:color w:val="232323"/>
                 <w:sz w:val="17"/>
@@ -1059,7 +1059,7 @@
             </w:pPr>
             <w:r>
               <w:rPr>
-                <w:rFonts w:ascii="Times New Roman" w:hAnsi="Times New Roman" w:eastAsia="Times New Roman"/>
+                <w:rFonts w:ascii="Times New Roman" w:hAnsi="Times New Roman" w:eastAsia="Times New Roman" w:cs="Times New Roman"/>
                 <w:b w:val="0"/>
                 <w:color w:val="232323"/>
                 <w:sz w:val="17"/>
@@ -1094,7 +1094,7 @@
             </w:pPr>
             <w:r>
               <w:rPr>
-                <w:rFonts w:ascii="Times New Roman" w:hAnsi="Times New Roman" w:eastAsia="Times New Roman"/>
+                <w:rFonts w:ascii="Times New Roman" w:hAnsi="Times New Roman" w:eastAsia="Times New Roman" w:cs="Times New Roman"/>
                 <w:b w:val="0"/>
                 <w:color w:val="232323"/>
                 <w:sz w:val="17"/>
@@ -1129,7 +1129,7 @@
             </w:pPr>
             <w:r>
               <w:rPr>
-                <w:rFonts w:ascii="Times New Roman" w:hAnsi="Times New Roman" w:eastAsia="Times New Roman"/>
+                <w:rFonts w:ascii="Times New Roman" w:hAnsi="Times New Roman" w:eastAsia="Times New Roman" w:cs="Times New Roman"/>
                 <w:b w:val="0"/>
                 <w:color w:val="232323"/>
                 <w:sz w:val="17"/>
@@ -1169,7 +1169,7 @@
             </w:pPr>
             <w:r>
               <w:rPr>
-                <w:rFonts w:ascii="Times New Roman" w:hAnsi="Times New Roman" w:eastAsia="Times New Roman"/>
+                <w:rFonts w:ascii="Times New Roman" w:hAnsi="Times New Roman" w:eastAsia="Times New Roman" w:cs="Times New Roman"/>
                 <w:b w:val="0"/>
                 <w:color w:val="232323"/>
                 <w:sz w:val="17"/>
@@ -1203,7 +1203,7 @@
             </w:pPr>
             <w:r>
               <w:rPr>
-                <w:rFonts w:ascii="Times New Roman" w:hAnsi="Times New Roman" w:eastAsia="Times New Roman"/>
+                <w:rFonts w:ascii="Times New Roman" w:hAnsi="Times New Roman" w:eastAsia="Times New Roman" w:cs="Times New Roman"/>
                 <w:b w:val="0"/>
                 <w:color w:val="232323"/>
                 <w:sz w:val="17"/>
@@ -1237,7 +1237,7 @@
             </w:pPr>
             <w:r>
               <w:rPr>
-                <w:rFonts w:ascii="Times New Roman" w:hAnsi="Times New Roman" w:eastAsia="Times New Roman"/>
+                <w:rFonts w:ascii="Times New Roman" w:hAnsi="Times New Roman" w:eastAsia="Times New Roman" w:cs="Times New Roman"/>
                 <w:b w:val="0"/>
                 <w:color w:val="232323"/>
                 <w:sz w:val="17"/>
@@ -1271,7 +1271,7 @@
             </w:pPr>
             <w:r>
               <w:rPr>
-                <w:rFonts w:ascii="Times New Roman" w:hAnsi="Times New Roman" w:eastAsia="Times New Roman"/>
+                <w:rFonts w:ascii="Times New Roman" w:hAnsi="Times New Roman" w:eastAsia="Times New Roman" w:cs="Times New Roman"/>
                 <w:b w:val="0"/>
                 <w:color w:val="232323"/>
                 <w:sz w:val="17"/>
@@ -1312,7 +1312,7 @@
             </w:pPr>
             <w:r>
               <w:rPr>
-                <w:rFonts w:ascii="Times New Roman" w:hAnsi="Times New Roman" w:eastAsia="Times New Roman"/>
+                <w:rFonts w:ascii="Times New Roman" w:hAnsi="Times New Roman" w:eastAsia="Times New Roman" w:cs="Times New Roman"/>
                 <w:b w:val="0"/>
                 <w:color w:val="232323"/>
                 <w:sz w:val="17"/>
@@ -1347,7 +1347,7 @@
             </w:pPr>
             <w:r>
               <w:rPr>
-                <w:rFonts w:ascii="Times New Roman" w:hAnsi="Times New Roman" w:eastAsia="Times New Roman"/>
+                <w:rFonts w:ascii="Times New Roman" w:hAnsi="Times New Roman" w:eastAsia="Times New Roman" w:cs="Times New Roman"/>
                 <w:b w:val="0"/>
                 <w:color w:val="232323"/>
                 <w:sz w:val="17"/>
@@ -1382,7 +1382,7 @@
             </w:pPr>
             <w:r>
               <w:rPr>
-                <w:rFonts w:ascii="Times New Roman" w:hAnsi="Times New Roman" w:eastAsia="Times New Roman"/>
+                <w:rFonts w:ascii="Times New Roman" w:hAnsi="Times New Roman" w:eastAsia="Times New Roman" w:cs="Times New Roman"/>
                 <w:b w:val="0"/>
                 <w:color w:val="232323"/>
                 <w:sz w:val="17"/>
@@ -1417,7 +1417,7 @@
             </w:pPr>
             <w:r>
               <w:rPr>
-                <w:rFonts w:ascii="Times New Roman" w:hAnsi="Times New Roman" w:eastAsia="Times New Roman"/>
+                <w:rFonts w:ascii="Times New Roman" w:hAnsi="Times New Roman" w:eastAsia="Times New Roman" w:cs="Times New Roman"/>
                 <w:b w:val="0"/>
                 <w:color w:val="232323"/>
                 <w:sz w:val="17"/>
@@ -1457,7 +1457,7 @@
             </w:pPr>
             <w:r>
               <w:rPr>
-                <w:rFonts w:ascii="Times New Roman" w:hAnsi="Times New Roman" w:eastAsia="Times New Roman"/>
+                <w:rFonts w:ascii="Times New Roman" w:hAnsi="Times New Roman" w:eastAsia="Times New Roman" w:cs="Times New Roman"/>
                 <w:b w:val="0"/>
                 <w:color w:val="232323"/>
                 <w:sz w:val="17"/>
@@ -1491,7 +1491,7 @@
             </w:pPr>
             <w:r>
               <w:rPr>
-                <w:rFonts w:ascii="Times New Roman" w:hAnsi="Times New Roman" w:eastAsia="Times New Roman"/>
+                <w:rFonts w:ascii="Times New Roman" w:hAnsi="Times New Roman" w:eastAsia="Times New Roman" w:cs="Times New Roman"/>
                 <w:b w:val="0"/>
                 <w:color w:val="232323"/>
                 <w:sz w:val="17"/>
@@ -1525,7 +1525,7 @@
             </w:pPr>
             <w:r>
               <w:rPr>
-                <w:rFonts w:ascii="Times New Roman" w:hAnsi="Times New Roman" w:eastAsia="Times New Roman"/>
+                <w:rFonts w:ascii="Times New Roman" w:hAnsi="Times New Roman" w:eastAsia="Times New Roman" w:cs="Times New Roman"/>
                 <w:b w:val="0"/>
                 <w:color w:val="232323"/>
                 <w:sz w:val="17"/>
@@ -1559,7 +1559,7 @@
             </w:pPr>
             <w:r>
               <w:rPr>
-                <w:rFonts w:ascii="Times New Roman" w:hAnsi="Times New Roman" w:eastAsia="Times New Roman"/>
+                <w:rFonts w:ascii="Times New Roman" w:hAnsi="Times New Roman" w:eastAsia="Times New Roman" w:cs="Times New Roman"/>
                 <w:b w:val="0"/>
                 <w:color w:val="232323"/>
                 <w:sz w:val="17"/>
@@ -1583,7 +1583,7 @@
       </w:pPr>
       <w:r>
         <w:rPr>
-          <w:rFonts w:ascii="Times New Roman" w:hAnsi="Times New Roman" w:eastAsia="Times New Roman"/>
+          <w:rFonts w:ascii="Times New Roman" w:hAnsi="Times New Roman" w:eastAsia="Times New Roman" w:cs="Times New Roman"/>
           <w:b/>
           <w:color w:val="1F4E79"/>
           <w:sz w:val="30"/>
@@ -1599,7 +1599,7 @@
       </w:pPr>
       <w:r>
         <w:rPr>
-          <w:rFonts w:ascii="Times New Roman" w:hAnsi="Times New Roman" w:eastAsia="Times New Roman"/>
+          <w:rFonts w:ascii="Times New Roman" w:hAnsi="Times New Roman" w:eastAsia="Times New Roman" w:cs="Times New Roman"/>
           <w:b/>
           <w:color w:val="1F4E79"/>
           <w:sz w:val="23"/>
@@ -1613,7 +1613,7 @@
       </w:pPr>
       <w:r>
         <w:rPr>
-          <w:rFonts w:ascii="Times New Roman" w:hAnsi="Times New Roman" w:eastAsia="SimSun"/>
+          <w:rFonts w:ascii="Times New Roman" w:hAnsi="Times New Roman" w:eastAsia="Times New Roman" w:cs="Times New Roman"/>
           <w:sz w:val="20"/>
         </w:rPr>
         <w:t>Figure 1 distinguishes the two verified paths. The Gazebo scene monitor reads colored-cylinder model states and publishes synthetic detections in Detection2DArray format; the task node uses those messages for grid assignment, class-to-bin selection, and arm control. The external RGB camera and YOLOv8n model produce detections for erasers, locks, and staplers. A shared message format is the planned connection point, while object-class mapping and pixel-to-grid calibration must be completed before a camera-driven sorting run.</w:t>
@@ -1671,6 +1671,10 @@
         <w:jc w:val="center"/>
       </w:pPr>
       <w:r>
+        <w:rPr>
+          <w:rFonts w:ascii="Times New Roman" w:hAnsi="Times New Roman" w:eastAsia="Times New Roman" w:cs="Times New Roman"/>
+          <w:sz w:val="18"/>
+        </w:rPr>
         <w:t>Fig. 1  Gazebo sorting and external-camera detection as separate validation paths</w:t>
       </w:r>
     </w:p>
@@ -1679,6 +1683,10 @@
         <w:pStyle w:val="Heading2"/>
       </w:pPr>
       <w:r>
+        <w:rPr>
+          <w:rFonts w:ascii="Times New Roman" w:hAnsi="Times New Roman" w:eastAsia="Times New Roman" w:cs="Times New Roman"/>
+          <w:sz w:val="23"/>
+        </w:rPr>
         <w:t>2.2 Visual Detection and Message Interface</w:t>
       </w:r>
     </w:p>
@@ -1688,7 +1696,7 @@
       </w:pPr>
       <w:r>
         <w:rPr>
-          <w:rFonts w:ascii="Times New Roman" w:hAnsi="Times New Roman" w:eastAsia="SimSun"/>
+          <w:rFonts w:ascii="Times New Roman" w:hAnsi="Times New Roman" w:eastAsia="Times New Roman" w:cs="Times New Roman"/>
           <w:sz w:val="20"/>
         </w:rPr>
         <w:t>The task node consumes class, bounding box, and confidence from Detection2DArray. The recorded Gazebo sorting run used fields generated from simulator model states by sorting_scene_monitor. The separately trained YOLOv8n model was tested with an external camera. Its eraser, lock, and stapler labels require a new class-to-bin configuration for sorting physical objects.</w:t>
@@ -1701,6 +1709,10 @@
         <w:spacing w:before="100" w:after="80"/>
       </w:pPr>
       <w:r>
+        <w:rPr>
+          <w:rFonts w:ascii="Times New Roman" w:hAnsi="Times New Roman" w:eastAsia="Times New Roman" w:cs="Times New Roman"/>
+          <w:sz w:val="23"/>
+        </w:rPr>
         <w:t>2.3 Key messages and interfaces</w:t>
       </w:r>
     </w:p>
@@ -1748,7 +1760,7 @@
             </w:pPr>
             <w:r>
               <w:rPr>
-                <w:rFonts w:ascii="Times New Roman" w:hAnsi="Times New Roman" w:eastAsia="Times New Roman"/>
+                <w:rFonts w:ascii="Times New Roman" w:hAnsi="Times New Roman" w:eastAsia="Times New Roman" w:cs="Times New Roman"/>
                 <w:b/>
                 <w:color w:val="FFFFFF"/>
                 <w:sz w:val="17"/>
@@ -1783,7 +1795,7 @@
             </w:pPr>
             <w:r>
               <w:rPr>
-                <w:rFonts w:ascii="Times New Roman" w:hAnsi="Times New Roman" w:eastAsia="Times New Roman"/>
+                <w:rFonts w:ascii="Times New Roman" w:hAnsi="Times New Roman" w:eastAsia="Times New Roman" w:cs="Times New Roman"/>
                 <w:b/>
                 <w:color w:val="FFFFFF"/>
                 <w:sz w:val="17"/>
@@ -1818,7 +1830,7 @@
             </w:pPr>
             <w:r>
               <w:rPr>
-                <w:rFonts w:ascii="Times New Roman" w:hAnsi="Times New Roman" w:eastAsia="Times New Roman"/>
+                <w:rFonts w:ascii="Times New Roman" w:hAnsi="Times New Roman" w:eastAsia="Times New Roman" w:cs="Times New Roman"/>
                 <w:b/>
                 <w:color w:val="FFFFFF"/>
                 <w:sz w:val="17"/>
@@ -1859,7 +1871,7 @@
             </w:pPr>
             <w:r>
               <w:rPr>
-                <w:rFonts w:ascii="Times New Roman" w:hAnsi="Times New Roman" w:eastAsia="Times New Roman"/>
+                <w:rFonts w:ascii="Times New Roman" w:hAnsi="Times New Roman" w:eastAsia="Times New Roman" w:cs="Times New Roman"/>
                 <w:b w:val="0"/>
                 <w:color w:val="232323"/>
                 <w:sz w:val="17"/>
@@ -1894,7 +1906,7 @@
             </w:pPr>
             <w:r>
               <w:rPr>
-                <w:rFonts w:ascii="Times New Roman" w:hAnsi="Times New Roman" w:eastAsia="Times New Roman"/>
+                <w:rFonts w:ascii="Times New Roman" w:hAnsi="Times New Roman" w:eastAsia="Times New Roman" w:cs="Times New Roman"/>
                 <w:b w:val="0"/>
                 <w:color w:val="232323"/>
                 <w:sz w:val="17"/>
@@ -1929,7 +1941,7 @@
             </w:pPr>
             <w:r>
               <w:rPr>
-                <w:rFonts w:ascii="Times New Roman" w:hAnsi="Times New Roman" w:eastAsia="Times New Roman"/>
+                <w:rFonts w:ascii="Times New Roman" w:hAnsi="Times New Roman" w:eastAsia="Times New Roman" w:cs="Times New Roman"/>
                 <w:b w:val="0"/>
                 <w:color w:val="232323"/>
                 <w:sz w:val="17"/>
@@ -1969,7 +1981,7 @@
             </w:pPr>
             <w:r>
               <w:rPr>
-                <w:rFonts w:ascii="Times New Roman" w:hAnsi="Times New Roman" w:eastAsia="Times New Roman"/>
+                <w:rFonts w:ascii="Times New Roman" w:hAnsi="Times New Roman" w:eastAsia="Times New Roman" w:cs="Times New Roman"/>
                 <w:b w:val="0"/>
                 <w:color w:val="232323"/>
                 <w:sz w:val="17"/>
@@ -2003,7 +2015,7 @@
             </w:pPr>
             <w:r>
               <w:rPr>
-                <w:rFonts w:ascii="Times New Roman" w:hAnsi="Times New Roman" w:eastAsia="Times New Roman"/>
+                <w:rFonts w:ascii="Times New Roman" w:hAnsi="Times New Roman" w:eastAsia="Times New Roman" w:cs="Times New Roman"/>
                 <w:b w:val="0"/>
                 <w:color w:val="232323"/>
                 <w:sz w:val="17"/>
@@ -2037,7 +2049,7 @@
             </w:pPr>
             <w:r>
               <w:rPr>
-                <w:rFonts w:ascii="Times New Roman" w:hAnsi="Times New Roman" w:eastAsia="Times New Roman"/>
+                <w:rFonts w:ascii="Times New Roman" w:hAnsi="Times New Roman" w:eastAsia="Times New Roman" w:cs="Times New Roman"/>
                 <w:b w:val="0"/>
                 <w:color w:val="232323"/>
                 <w:sz w:val="17"/>
@@ -2078,7 +2090,7 @@
             </w:pPr>
             <w:r>
               <w:rPr>
-                <w:rFonts w:ascii="Times New Roman" w:hAnsi="Times New Roman" w:eastAsia="Times New Roman"/>
+                <w:rFonts w:ascii="Times New Roman" w:hAnsi="Times New Roman" w:eastAsia="Times New Roman" w:cs="Times New Roman"/>
                 <w:b w:val="0"/>
                 <w:color w:val="232323"/>
                 <w:sz w:val="17"/>
@@ -2113,7 +2125,7 @@
             </w:pPr>
             <w:r>
               <w:rPr>
-                <w:rFonts w:ascii="Times New Roman" w:hAnsi="Times New Roman" w:eastAsia="Times New Roman"/>
+                <w:rFonts w:ascii="Times New Roman" w:hAnsi="Times New Roman" w:eastAsia="Times New Roman" w:cs="Times New Roman"/>
                 <w:b w:val="0"/>
                 <w:color w:val="232323"/>
                 <w:sz w:val="17"/>
@@ -2148,7 +2160,7 @@
             </w:pPr>
             <w:r>
               <w:rPr>
-                <w:rFonts w:ascii="Times New Roman" w:hAnsi="Times New Roman" w:eastAsia="Times New Roman"/>
+                <w:rFonts w:ascii="Times New Roman" w:hAnsi="Times New Roman" w:eastAsia="Times New Roman" w:cs="Times New Roman"/>
                 <w:b w:val="0"/>
                 <w:color w:val="232323"/>
                 <w:sz w:val="17"/>
@@ -2188,7 +2200,7 @@
             </w:pPr>
             <w:r>
               <w:rPr>
-                <w:rFonts w:ascii="Times New Roman" w:hAnsi="Times New Roman" w:eastAsia="Times New Roman"/>
+                <w:rFonts w:ascii="Times New Roman" w:hAnsi="Times New Roman" w:eastAsia="Times New Roman" w:cs="Times New Roman"/>
                 <w:b w:val="0"/>
                 <w:color w:val="232323"/>
                 <w:sz w:val="17"/>
@@ -2222,7 +2234,7 @@
             </w:pPr>
             <w:r>
               <w:rPr>
-                <w:rFonts w:ascii="Times New Roman" w:hAnsi="Times New Roman" w:eastAsia="Times New Roman"/>
+                <w:rFonts w:ascii="Times New Roman" w:hAnsi="Times New Roman" w:eastAsia="Times New Roman" w:cs="Times New Roman"/>
                 <w:b w:val="0"/>
                 <w:color w:val="232323"/>
                 <w:sz w:val="17"/>
@@ -2256,7 +2268,7 @@
             </w:pPr>
             <w:r>
               <w:rPr>
-                <w:rFonts w:ascii="Times New Roman" w:hAnsi="Times New Roman" w:eastAsia="Times New Roman"/>
+                <w:rFonts w:ascii="Times New Roman" w:hAnsi="Times New Roman" w:eastAsia="Times New Roman" w:cs="Times New Roman"/>
                 <w:b w:val="0"/>
                 <w:color w:val="232323"/>
                 <w:sz w:val="17"/>
@@ -2297,7 +2309,7 @@
             </w:pPr>
             <w:r>
               <w:rPr>
-                <w:rFonts w:ascii="Times New Roman" w:hAnsi="Times New Roman" w:eastAsia="Times New Roman"/>
+                <w:rFonts w:ascii="Times New Roman" w:hAnsi="Times New Roman" w:eastAsia="Times New Roman" w:cs="Times New Roman"/>
                 <w:b w:val="0"/>
                 <w:color w:val="232323"/>
                 <w:sz w:val="17"/>
@@ -2332,7 +2344,7 @@
             </w:pPr>
             <w:r>
               <w:rPr>
-                <w:rFonts w:ascii="Times New Roman" w:hAnsi="Times New Roman" w:eastAsia="Times New Roman"/>
+                <w:rFonts w:ascii="Times New Roman" w:hAnsi="Times New Roman" w:eastAsia="Times New Roman" w:cs="Times New Roman"/>
                 <w:b w:val="0"/>
                 <w:color w:val="232323"/>
                 <w:sz w:val="17"/>
@@ -2367,7 +2379,7 @@
             </w:pPr>
             <w:r>
               <w:rPr>
-                <w:rFonts w:ascii="Times New Roman" w:hAnsi="Times New Roman" w:eastAsia="Times New Roman"/>
+                <w:rFonts w:ascii="Times New Roman" w:hAnsi="Times New Roman" w:eastAsia="Times New Roman" w:cs="Times New Roman"/>
                 <w:b w:val="0"/>
                 <w:color w:val="232323"/>
                 <w:sz w:val="17"/>
@@ -2407,7 +2419,7 @@
             </w:pPr>
             <w:r>
               <w:rPr>
-                <w:rFonts w:ascii="Times New Roman" w:hAnsi="Times New Roman" w:eastAsia="Times New Roman"/>
+                <w:rFonts w:ascii="Times New Roman" w:hAnsi="Times New Roman" w:eastAsia="Times New Roman" w:cs="Times New Roman"/>
                 <w:b w:val="0"/>
                 <w:color w:val="232323"/>
                 <w:sz w:val="17"/>
@@ -2441,7 +2453,7 @@
             </w:pPr>
             <w:r>
               <w:rPr>
-                <w:rFonts w:ascii="Times New Roman" w:hAnsi="Times New Roman" w:eastAsia="Times New Roman"/>
+                <w:rFonts w:ascii="Times New Roman" w:hAnsi="Times New Roman" w:eastAsia="Times New Roman" w:cs="Times New Roman"/>
                 <w:b w:val="0"/>
                 <w:color w:val="232323"/>
                 <w:sz w:val="17"/>
@@ -2475,7 +2487,7 @@
             </w:pPr>
             <w:r>
               <w:rPr>
-                <w:rFonts w:ascii="Times New Roman" w:hAnsi="Times New Roman" w:eastAsia="Times New Roman"/>
+                <w:rFonts w:ascii="Times New Roman" w:hAnsi="Times New Roman" w:eastAsia="Times New Roman" w:cs="Times New Roman"/>
                 <w:b w:val="0"/>
                 <w:color w:val="232323"/>
                 <w:sz w:val="17"/>
@@ -2516,7 +2528,7 @@
             </w:pPr>
             <w:r>
               <w:rPr>
-                <w:rFonts w:ascii="Times New Roman" w:hAnsi="Times New Roman" w:eastAsia="Times New Roman"/>
+                <w:rFonts w:ascii="Times New Roman" w:hAnsi="Times New Roman" w:eastAsia="Times New Roman" w:cs="Times New Roman"/>
                 <w:b w:val="0"/>
                 <w:color w:val="232323"/>
                 <w:sz w:val="17"/>
@@ -2551,7 +2563,7 @@
             </w:pPr>
             <w:r>
               <w:rPr>
-                <w:rFonts w:ascii="Times New Roman" w:hAnsi="Times New Roman" w:eastAsia="Times New Roman"/>
+                <w:rFonts w:ascii="Times New Roman" w:hAnsi="Times New Roman" w:eastAsia="Times New Roman" w:cs="Times New Roman"/>
                 <w:b w:val="0"/>
                 <w:color w:val="232323"/>
                 <w:sz w:val="17"/>
@@ -2586,7 +2598,7 @@
             </w:pPr>
             <w:r>
               <w:rPr>
-                <w:rFonts w:ascii="Times New Roman" w:hAnsi="Times New Roman" w:eastAsia="Times New Roman"/>
+                <w:rFonts w:ascii="Times New Roman" w:hAnsi="Times New Roman" w:eastAsia="Times New Roman" w:cs="Times New Roman"/>
                 <w:b w:val="0"/>
                 <w:color w:val="232323"/>
                 <w:sz w:val="17"/>
@@ -2609,6 +2621,10 @@
         <w:spacing w:before="100" w:after="80"/>
       </w:pPr>
       <w:r>
+        <w:rPr>
+          <w:rFonts w:ascii="Times New Roman" w:hAnsi="Times New Roman" w:eastAsia="Times New Roman" w:cs="Times New Roman"/>
+          <w:sz w:val="23"/>
+        </w:rPr>
         <w:t>2.4 Exception-handling principle</w:t>
       </w:r>
     </w:p>
@@ -2618,7 +2634,7 @@
       </w:pPr>
       <w:r>
         <w:rPr>
-          <w:rFonts w:ascii="Times New Roman" w:hAnsi="Times New Roman" w:eastAsia="Times New Roman"/>
+          <w:rFonts w:ascii="Times New Roman" w:hAnsi="Times New Roman" w:eastAsia="Times New Roman" w:cs="Times New Roman"/>
           <w:b w:val="0"/>
           <w:color w:val="232323"/>
           <w:sz w:val="20"/>
@@ -2671,7 +2687,7 @@
             </w:pPr>
             <w:r>
               <w:rPr>
-                <w:rFonts w:ascii="Times New Roman" w:hAnsi="Times New Roman" w:eastAsia="Times New Roman"/>
+                <w:rFonts w:ascii="Times New Roman" w:hAnsi="Times New Roman" w:eastAsia="Times New Roman" w:cs="Times New Roman"/>
                 <w:b/>
                 <w:color w:val="FFFFFF"/>
                 <w:sz w:val="17"/>
@@ -2706,7 +2722,7 @@
             </w:pPr>
             <w:r>
               <w:rPr>
-                <w:rFonts w:ascii="Times New Roman" w:hAnsi="Times New Roman" w:eastAsia="Times New Roman"/>
+                <w:rFonts w:ascii="Times New Roman" w:hAnsi="Times New Roman" w:eastAsia="Times New Roman" w:cs="Times New Roman"/>
                 <w:b/>
                 <w:color w:val="FFFFFF"/>
                 <w:sz w:val="17"/>
@@ -2741,7 +2757,7 @@
             </w:pPr>
             <w:r>
               <w:rPr>
-                <w:rFonts w:ascii="Times New Roman" w:hAnsi="Times New Roman" w:eastAsia="Times New Roman"/>
+                <w:rFonts w:ascii="Times New Roman" w:hAnsi="Times New Roman" w:eastAsia="Times New Roman" w:cs="Times New Roman"/>
                 <w:b/>
                 <w:color w:val="FFFFFF"/>
                 <w:sz w:val="17"/>
@@ -2776,7 +2792,7 @@
             </w:pPr>
             <w:r>
               <w:rPr>
-                <w:rFonts w:ascii="Times New Roman" w:hAnsi="Times New Roman" w:eastAsia="Times New Roman"/>
+                <w:rFonts w:ascii="Times New Roman" w:hAnsi="Times New Roman" w:eastAsia="Times New Roman" w:cs="Times New Roman"/>
                 <w:b/>
                 <w:color w:val="FFFFFF"/>
                 <w:sz w:val="17"/>
@@ -2817,7 +2833,7 @@
             </w:pPr>
             <w:r>
               <w:rPr>
-                <w:rFonts w:ascii="Times New Roman" w:hAnsi="Times New Roman" w:eastAsia="Times New Roman"/>
+                <w:rFonts w:ascii="Times New Roman" w:hAnsi="Times New Roman" w:eastAsia="Times New Roman" w:cs="Times New Roman"/>
                 <w:b w:val="0"/>
                 <w:color w:val="232323"/>
                 <w:sz w:val="17"/>
@@ -2852,7 +2868,7 @@
             </w:pPr>
             <w:r>
               <w:rPr>
-                <w:rFonts w:ascii="Times New Roman" w:hAnsi="Times New Roman" w:eastAsia="Times New Roman"/>
+                <w:rFonts w:ascii="Times New Roman" w:hAnsi="Times New Roman" w:eastAsia="Times New Roman" w:cs="Times New Roman"/>
                 <w:b w:val="0"/>
                 <w:color w:val="232323"/>
                 <w:sz w:val="17"/>
@@ -2887,7 +2903,7 @@
             </w:pPr>
             <w:r>
               <w:rPr>
-                <w:rFonts w:ascii="Times New Roman" w:hAnsi="Times New Roman" w:eastAsia="Times New Roman"/>
+                <w:rFonts w:ascii="Times New Roman" w:hAnsi="Times New Roman" w:eastAsia="Times New Roman" w:cs="Times New Roman"/>
                 <w:b w:val="0"/>
                 <w:color w:val="232323"/>
                 <w:sz w:val="17"/>
@@ -2922,7 +2938,7 @@
             </w:pPr>
             <w:r>
               <w:rPr>
-                <w:rFonts w:ascii="Times New Roman" w:hAnsi="Times New Roman" w:eastAsia="Times New Roman"/>
+                <w:rFonts w:ascii="Times New Roman" w:hAnsi="Times New Roman" w:eastAsia="Times New Roman" w:cs="Times New Roman"/>
                 <w:b w:val="0"/>
                 <w:color w:val="232323"/>
                 <w:sz w:val="17"/>
@@ -2962,7 +2978,7 @@
             </w:pPr>
             <w:r>
               <w:rPr>
-                <w:rFonts w:ascii="Times New Roman" w:hAnsi="Times New Roman" w:eastAsia="Times New Roman"/>
+                <w:rFonts w:ascii="Times New Roman" w:hAnsi="Times New Roman" w:eastAsia="Times New Roman" w:cs="Times New Roman"/>
                 <w:b w:val="0"/>
                 <w:color w:val="232323"/>
                 <w:sz w:val="17"/>
@@ -2996,7 +3012,7 @@
             </w:pPr>
             <w:r>
               <w:rPr>
-                <w:rFonts w:ascii="Times New Roman" w:hAnsi="Times New Roman" w:eastAsia="Times New Roman"/>
+                <w:rFonts w:ascii="Times New Roman" w:hAnsi="Times New Roman" w:eastAsia="Times New Roman" w:cs="Times New Roman"/>
                 <w:b w:val="0"/>
                 <w:color w:val="232323"/>
                 <w:sz w:val="17"/>
@@ -3030,7 +3046,7 @@
             </w:pPr>
             <w:r>
               <w:rPr>
-                <w:rFonts w:ascii="Times New Roman" w:hAnsi="Times New Roman" w:eastAsia="Times New Roman"/>
+                <w:rFonts w:ascii="Times New Roman" w:hAnsi="Times New Roman" w:eastAsia="Times New Roman" w:cs="Times New Roman"/>
                 <w:b w:val="0"/>
                 <w:color w:val="232323"/>
                 <w:sz w:val="17"/>
@@ -3064,7 +3080,7 @@
             </w:pPr>
             <w:r>
               <w:rPr>
-                <w:rFonts w:ascii="Times New Roman" w:hAnsi="Times New Roman" w:eastAsia="Times New Roman"/>
+                <w:rFonts w:ascii="Times New Roman" w:hAnsi="Times New Roman" w:eastAsia="Times New Roman" w:cs="Times New Roman"/>
                 <w:b w:val="0"/>
                 <w:color w:val="232323"/>
                 <w:sz w:val="17"/>
@@ -3105,7 +3121,7 @@
             </w:pPr>
             <w:r>
               <w:rPr>
-                <w:rFonts w:ascii="Times New Roman" w:hAnsi="Times New Roman" w:eastAsia="Times New Roman"/>
+                <w:rFonts w:ascii="Times New Roman" w:hAnsi="Times New Roman" w:eastAsia="Times New Roman" w:cs="Times New Roman"/>
                 <w:b w:val="0"/>
                 <w:color w:val="232323"/>
                 <w:sz w:val="17"/>
@@ -3140,7 +3156,7 @@
             </w:pPr>
             <w:r>
               <w:rPr>
-                <w:rFonts w:ascii="Times New Roman" w:hAnsi="Times New Roman" w:eastAsia="Times New Roman"/>
+                <w:rFonts w:ascii="Times New Roman" w:hAnsi="Times New Roman" w:eastAsia="Times New Roman" w:cs="Times New Roman"/>
                 <w:b w:val="0"/>
                 <w:color w:val="232323"/>
                 <w:sz w:val="17"/>
@@ -3175,7 +3191,7 @@
             </w:pPr>
             <w:r>
               <w:rPr>
-                <w:rFonts w:ascii="Times New Roman" w:hAnsi="Times New Roman" w:eastAsia="Times New Roman"/>
+                <w:rFonts w:ascii="Times New Roman" w:hAnsi="Times New Roman" w:eastAsia="Times New Roman" w:cs="Times New Roman"/>
                 <w:b w:val="0"/>
                 <w:color w:val="232323"/>
                 <w:sz w:val="17"/>
@@ -3210,7 +3226,7 @@
             </w:pPr>
             <w:r>
               <w:rPr>
-                <w:rFonts w:ascii="Times New Roman" w:hAnsi="Times New Roman" w:eastAsia="Times New Roman"/>
+                <w:rFonts w:ascii="Times New Roman" w:hAnsi="Times New Roman" w:eastAsia="Times New Roman" w:cs="Times New Roman"/>
                 <w:b w:val="0"/>
                 <w:color w:val="232323"/>
                 <w:sz w:val="17"/>
@@ -3250,7 +3266,7 @@
             </w:pPr>
             <w:r>
               <w:rPr>
-                <w:rFonts w:ascii="Times New Roman" w:hAnsi="Times New Roman" w:eastAsia="Times New Roman"/>
+                <w:rFonts w:ascii="Times New Roman" w:hAnsi="Times New Roman" w:eastAsia="Times New Roman" w:cs="Times New Roman"/>
                 <w:b w:val="0"/>
                 <w:color w:val="232323"/>
                 <w:sz w:val="17"/>
@@ -3284,7 +3300,7 @@
             </w:pPr>
             <w:r>
               <w:rPr>
-                <w:rFonts w:ascii="Times New Roman" w:hAnsi="Times New Roman" w:eastAsia="Times New Roman"/>
+                <w:rFonts w:ascii="Times New Roman" w:hAnsi="Times New Roman" w:eastAsia="Times New Roman" w:cs="Times New Roman"/>
                 <w:b w:val="0"/>
                 <w:color w:val="232323"/>
                 <w:sz w:val="17"/>
@@ -3318,7 +3334,7 @@
             </w:pPr>
             <w:r>
               <w:rPr>
-                <w:rFonts w:ascii="Times New Roman" w:hAnsi="Times New Roman" w:eastAsia="Times New Roman"/>
+                <w:rFonts w:ascii="Times New Roman" w:hAnsi="Times New Roman" w:eastAsia="Times New Roman" w:cs="Times New Roman"/>
                 <w:b w:val="0"/>
                 <w:color w:val="232323"/>
                 <w:sz w:val="17"/>
@@ -3352,7 +3368,7 @@
             </w:pPr>
             <w:r>
               <w:rPr>
-                <w:rFonts w:ascii="Times New Roman" w:hAnsi="Times New Roman" w:eastAsia="Times New Roman"/>
+                <w:rFonts w:ascii="Times New Roman" w:hAnsi="Times New Roman" w:eastAsia="Times New Roman" w:cs="Times New Roman"/>
                 <w:b w:val="0"/>
                 <w:color w:val="232323"/>
                 <w:sz w:val="17"/>
@@ -3393,7 +3409,7 @@
             </w:pPr>
             <w:r>
               <w:rPr>
-                <w:rFonts w:ascii="Times New Roman" w:hAnsi="Times New Roman" w:eastAsia="Times New Roman"/>
+                <w:rFonts w:ascii="Times New Roman" w:hAnsi="Times New Roman" w:eastAsia="Times New Roman" w:cs="Times New Roman"/>
                 <w:b w:val="0"/>
                 <w:color w:val="232323"/>
                 <w:sz w:val="17"/>
@@ -3428,7 +3444,7 @@
             </w:pPr>
             <w:r>
               <w:rPr>
-                <w:rFonts w:ascii="Times New Roman" w:hAnsi="Times New Roman" w:eastAsia="Times New Roman"/>
+                <w:rFonts w:ascii="Times New Roman" w:hAnsi="Times New Roman" w:eastAsia="Times New Roman" w:cs="Times New Roman"/>
                 <w:b w:val="0"/>
                 <w:color w:val="232323"/>
                 <w:sz w:val="17"/>
@@ -3463,7 +3479,7 @@
             </w:pPr>
             <w:r>
               <w:rPr>
-                <w:rFonts w:ascii="Times New Roman" w:hAnsi="Times New Roman" w:eastAsia="Times New Roman"/>
+                <w:rFonts w:ascii="Times New Roman" w:hAnsi="Times New Roman" w:eastAsia="Times New Roman" w:cs="Times New Roman"/>
                 <w:b w:val="0"/>
                 <w:color w:val="232323"/>
                 <w:sz w:val="17"/>
@@ -3498,7 +3514,7 @@
             </w:pPr>
             <w:r>
               <w:rPr>
-                <w:rFonts w:ascii="Times New Roman" w:hAnsi="Times New Roman" w:eastAsia="Times New Roman"/>
+                <w:rFonts w:ascii="Times New Roman" w:hAnsi="Times New Roman" w:eastAsia="Times New Roman" w:cs="Times New Roman"/>
                 <w:b w:val="0"/>
                 <w:color w:val="232323"/>
                 <w:sz w:val="17"/>
@@ -3538,7 +3554,7 @@
             </w:pPr>
             <w:r>
               <w:rPr>
-                <w:rFonts w:ascii="Times New Roman" w:hAnsi="Times New Roman" w:eastAsia="Times New Roman"/>
+                <w:rFonts w:ascii="Times New Roman" w:hAnsi="Times New Roman" w:eastAsia="Times New Roman" w:cs="Times New Roman"/>
                 <w:b w:val="0"/>
                 <w:color w:val="232323"/>
                 <w:sz w:val="17"/>
@@ -3572,7 +3588,7 @@
             </w:pPr>
             <w:r>
               <w:rPr>
-                <w:rFonts w:ascii="Times New Roman" w:hAnsi="Times New Roman" w:eastAsia="Times New Roman"/>
+                <w:rFonts w:ascii="Times New Roman" w:hAnsi="Times New Roman" w:eastAsia="Times New Roman" w:cs="Times New Roman"/>
                 <w:b w:val="0"/>
                 <w:color w:val="232323"/>
                 <w:sz w:val="17"/>
@@ -3606,7 +3622,7 @@
             </w:pPr>
             <w:r>
               <w:rPr>
-                <w:rFonts w:ascii="Times New Roman" w:hAnsi="Times New Roman" w:eastAsia="Times New Roman"/>
+                <w:rFonts w:ascii="Times New Roman" w:hAnsi="Times New Roman" w:eastAsia="Times New Roman" w:cs="Times New Roman"/>
                 <w:b w:val="0"/>
                 <w:color w:val="232323"/>
                 <w:sz w:val="17"/>
@@ -3640,7 +3656,7 @@
             </w:pPr>
             <w:r>
               <w:rPr>
-                <w:rFonts w:ascii="Times New Roman" w:hAnsi="Times New Roman" w:eastAsia="Times New Roman"/>
+                <w:rFonts w:ascii="Times New Roman" w:hAnsi="Times New Roman" w:eastAsia="Times New Roman" w:cs="Times New Roman"/>
                 <w:b w:val="0"/>
                 <w:color w:val="232323"/>
                 <w:sz w:val="17"/>
@@ -3664,7 +3680,7 @@
       </w:pPr>
       <w:r>
         <w:rPr>
-          <w:rFonts w:ascii="Times New Roman" w:hAnsi="Times New Roman" w:eastAsia="Times New Roman"/>
+          <w:rFonts w:ascii="Times New Roman" w:hAnsi="Times New Roman" w:eastAsia="Times New Roman" w:cs="Times New Roman"/>
           <w:b/>
           <w:color w:val="1F4E79"/>
           <w:sz w:val="30"/>
@@ -3680,7 +3696,7 @@
       </w:pPr>
       <w:r>
         <w:rPr>
-          <w:rFonts w:ascii="Times New Roman" w:hAnsi="Times New Roman" w:eastAsia="Times New Roman"/>
+          <w:rFonts w:ascii="Times New Roman" w:hAnsi="Times New Roman" w:eastAsia="Times New Roman" w:cs="Times New Roman"/>
           <w:b/>
           <w:color w:val="1F4E79"/>
           <w:sz w:val="23"/>
@@ -3731,7 +3747,7 @@
             </w:pPr>
             <w:r>
               <w:rPr>
-                <w:rFonts w:ascii="Times New Roman" w:hAnsi="Times New Roman" w:eastAsia="Times New Roman"/>
+                <w:rFonts w:ascii="Times New Roman" w:hAnsi="Times New Roman" w:eastAsia="Times New Roman" w:cs="Times New Roman"/>
                 <w:b/>
                 <w:color w:val="FFFFFF"/>
                 <w:sz w:val="17"/>
@@ -3766,7 +3782,7 @@
             </w:pPr>
             <w:r>
               <w:rPr>
-                <w:rFonts w:ascii="Times New Roman" w:hAnsi="Times New Roman" w:eastAsia="Times New Roman"/>
+                <w:rFonts w:ascii="Times New Roman" w:hAnsi="Times New Roman" w:eastAsia="Times New Roman" w:cs="Times New Roman"/>
                 <w:b/>
                 <w:color w:val="FFFFFF"/>
                 <w:sz w:val="17"/>
@@ -3807,7 +3823,7 @@
             </w:pPr>
             <w:r>
               <w:rPr>
-                <w:rFonts w:ascii="Times New Roman" w:hAnsi="Times New Roman" w:eastAsia="Times New Roman"/>
+                <w:rFonts w:ascii="Times New Roman" w:hAnsi="Times New Roman" w:eastAsia="Times New Roman" w:cs="Times New Roman"/>
                 <w:b w:val="0"/>
                 <w:color w:val="232323"/>
                 <w:sz w:val="17"/>
@@ -3842,7 +3858,7 @@
             </w:pPr>
             <w:r>
               <w:rPr>
-                <w:rFonts w:ascii="Times New Roman" w:hAnsi="Times New Roman" w:eastAsia="Times New Roman"/>
+                <w:rFonts w:ascii="Times New Roman" w:hAnsi="Times New Roman" w:eastAsia="Times New Roman" w:cs="Times New Roman"/>
                 <w:b w:val="0"/>
                 <w:color w:val="232323"/>
                 <w:sz w:val="17"/>
@@ -3882,7 +3898,7 @@
             </w:pPr>
             <w:r>
               <w:rPr>
-                <w:rFonts w:ascii="Times New Roman" w:hAnsi="Times New Roman" w:eastAsia="Times New Roman"/>
+                <w:rFonts w:ascii="Times New Roman" w:hAnsi="Times New Roman" w:eastAsia="Times New Roman" w:cs="Times New Roman"/>
                 <w:b w:val="0"/>
                 <w:color w:val="232323"/>
                 <w:sz w:val="17"/>
@@ -3916,7 +3932,7 @@
             </w:pPr>
             <w:r>
               <w:rPr>
-                <w:rFonts w:ascii="Times New Roman" w:hAnsi="Times New Roman" w:eastAsia="Times New Roman"/>
+                <w:rFonts w:ascii="Times New Roman" w:hAnsi="Times New Roman" w:eastAsia="Times New Roman" w:cs="Times New Roman"/>
                 <w:b w:val="0"/>
                 <w:color w:val="232323"/>
                 <w:sz w:val="17"/>
@@ -3957,7 +3973,7 @@
             </w:pPr>
             <w:r>
               <w:rPr>
-                <w:rFonts w:ascii="Times New Roman" w:hAnsi="Times New Roman" w:eastAsia="Times New Roman"/>
+                <w:rFonts w:ascii="Times New Roman" w:hAnsi="Times New Roman" w:eastAsia="Times New Roman" w:cs="Times New Roman"/>
                 <w:b w:val="0"/>
                 <w:color w:val="232323"/>
                 <w:sz w:val="17"/>
@@ -3992,7 +4008,7 @@
             </w:pPr>
             <w:r>
               <w:rPr>
-                <w:rFonts w:ascii="Times New Roman" w:hAnsi="Times New Roman" w:eastAsia="Times New Roman"/>
+                <w:rFonts w:ascii="Times New Roman" w:hAnsi="Times New Roman" w:eastAsia="Times New Roman" w:cs="Times New Roman"/>
                 <w:b w:val="0"/>
                 <w:color w:val="232323"/>
                 <w:sz w:val="17"/>
@@ -4032,7 +4048,7 @@
             </w:pPr>
             <w:r>
               <w:rPr>
-                <w:rFonts w:ascii="Times New Roman" w:hAnsi="Times New Roman" w:eastAsia="Times New Roman"/>
+                <w:rFonts w:ascii="Times New Roman" w:hAnsi="Times New Roman" w:eastAsia="Times New Roman" w:cs="Times New Roman"/>
                 <w:b w:val="0"/>
                 <w:color w:val="232323"/>
                 <w:sz w:val="17"/>
@@ -4066,7 +4082,7 @@
             </w:pPr>
             <w:r>
               <w:rPr>
-                <w:rFonts w:ascii="Times New Roman" w:hAnsi="Times New Roman" w:eastAsia="Times New Roman"/>
+                <w:rFonts w:ascii="Times New Roman" w:hAnsi="Times New Roman" w:eastAsia="Times New Roman" w:cs="Times New Roman"/>
                 <w:b w:val="0"/>
                 <w:color w:val="232323"/>
                 <w:sz w:val="17"/>
@@ -4107,7 +4123,7 @@
             </w:pPr>
             <w:r>
               <w:rPr>
-                <w:rFonts w:ascii="Times New Roman" w:hAnsi="Times New Roman" w:eastAsia="Times New Roman"/>
+                <w:rFonts w:ascii="Times New Roman" w:hAnsi="Times New Roman" w:eastAsia="Times New Roman" w:cs="Times New Roman"/>
                 <w:b w:val="0"/>
                 <w:color w:val="232323"/>
                 <w:sz w:val="17"/>
@@ -4142,7 +4158,7 @@
             </w:pPr>
             <w:r>
               <w:rPr>
-                <w:rFonts w:ascii="Times New Roman" w:hAnsi="Times New Roman" w:eastAsia="Times New Roman"/>
+                <w:rFonts w:ascii="Times New Roman" w:hAnsi="Times New Roman" w:eastAsia="Times New Roman" w:cs="Times New Roman"/>
                 <w:b w:val="0"/>
                 <w:color w:val="232323"/>
                 <w:sz w:val="17"/>
@@ -4182,7 +4198,7 @@
             </w:pPr>
             <w:r>
               <w:rPr>
-                <w:rFonts w:ascii="Times New Roman" w:hAnsi="Times New Roman" w:eastAsia="Times New Roman"/>
+                <w:rFonts w:ascii="Times New Roman" w:hAnsi="Times New Roman" w:eastAsia="Times New Roman" w:cs="Times New Roman"/>
                 <w:b w:val="0"/>
                 <w:color w:val="232323"/>
                 <w:sz w:val="17"/>
@@ -4216,7 +4232,7 @@
             </w:pPr>
             <w:r>
               <w:rPr>
-                <w:rFonts w:ascii="Times New Roman" w:hAnsi="Times New Roman" w:eastAsia="Times New Roman"/>
+                <w:rFonts w:ascii="Times New Roman" w:hAnsi="Times New Roman" w:eastAsia="Times New Roman" w:cs="Times New Roman"/>
                 <w:b w:val="0"/>
                 <w:color w:val="232323"/>
                 <w:sz w:val="17"/>
@@ -4257,7 +4273,7 @@
             </w:pPr>
             <w:r>
               <w:rPr>
-                <w:rFonts w:ascii="Times New Roman" w:hAnsi="Times New Roman" w:eastAsia="Times New Roman"/>
+                <w:rFonts w:ascii="Times New Roman" w:hAnsi="Times New Roman" w:eastAsia="Times New Roman" w:cs="Times New Roman"/>
                 <w:b w:val="0"/>
                 <w:color w:val="232323"/>
                 <w:sz w:val="17"/>
@@ -4292,7 +4308,7 @@
             </w:pPr>
             <w:r>
               <w:rPr>
-                <w:rFonts w:ascii="Times New Roman" w:hAnsi="Times New Roman" w:eastAsia="Times New Roman"/>
+                <w:rFonts w:ascii="Times New Roman" w:hAnsi="Times New Roman" w:eastAsia="Times New Roman" w:cs="Times New Roman"/>
                 <w:b w:val="0"/>
                 <w:color w:val="232323"/>
                 <w:sz w:val="17"/>
@@ -4360,6 +4376,10 @@
         <w:jc w:val="center"/>
       </w:pPr>
       <w:r>
+        <w:rPr>
+          <w:rFonts w:ascii="Times New Roman" w:hAnsi="Times New Roman" w:eastAsia="Times New Roman" w:cs="Times New Roman"/>
+          <w:sz w:val="18"/>
+        </w:rPr>
         <w:t>Fig. 2  Gazebo three-class scene: six picking cells and aligned sorting bins</w:t>
       </w:r>
     </w:p>
@@ -4371,7 +4391,7 @@
       </w:pPr>
       <w:r>
         <w:rPr>
-          <w:rFonts w:ascii="Times New Roman" w:hAnsi="Times New Roman" w:eastAsia="Times New Roman"/>
+          <w:rFonts w:ascii="Times New Roman" w:hAnsi="Times New Roman" w:eastAsia="Times New Roman" w:cs="Times New Roman"/>
           <w:b/>
           <w:color w:val="1F4E79"/>
           <w:sz w:val="23"/>
@@ -4385,7 +4405,7 @@
       </w:pPr>
       <w:r>
         <w:rPr>
-          <w:rFonts w:ascii="Times New Roman" w:hAnsi="Times New Roman" w:eastAsia="Times New Roman"/>
+          <w:rFonts w:ascii="Times New Roman" w:hAnsi="Times New Roman" w:eastAsia="Times New Roman" w:cs="Times New Roman"/>
           <w:b w:val="0"/>
           <w:color w:val="232323"/>
           <w:sz w:val="20"/>
@@ -4436,7 +4456,7 @@
             </w:pPr>
             <w:r>
               <w:rPr>
-                <w:rFonts w:ascii="Times New Roman" w:hAnsi="Times New Roman" w:eastAsia="Times New Roman"/>
+                <w:rFonts w:ascii="Times New Roman" w:hAnsi="Times New Roman" w:eastAsia="Times New Roman" w:cs="Times New Roman"/>
                 <w:b/>
                 <w:color w:val="FFFFFF"/>
                 <w:sz w:val="17"/>
@@ -4471,7 +4491,7 @@
             </w:pPr>
             <w:r>
               <w:rPr>
-                <w:rFonts w:ascii="Times New Roman" w:hAnsi="Times New Roman" w:eastAsia="Times New Roman"/>
+                <w:rFonts w:ascii="Times New Roman" w:hAnsi="Times New Roman" w:eastAsia="Times New Roman" w:cs="Times New Roman"/>
                 <w:b/>
                 <w:color w:val="FFFFFF"/>
                 <w:sz w:val="17"/>
@@ -4512,7 +4532,7 @@
             </w:pPr>
             <w:r>
               <w:rPr>
-                <w:rFonts w:ascii="Times New Roman" w:hAnsi="Times New Roman" w:eastAsia="Times New Roman"/>
+                <w:rFonts w:ascii="Times New Roman" w:hAnsi="Times New Roman" w:eastAsia="Times New Roman" w:cs="Times New Roman"/>
                 <w:b w:val="0"/>
                 <w:color w:val="232323"/>
                 <w:sz w:val="17"/>
@@ -4547,7 +4567,7 @@
             </w:pPr>
             <w:r>
               <w:rPr>
-                <w:rFonts w:ascii="Times New Roman" w:hAnsi="Times New Roman" w:eastAsia="Times New Roman"/>
+                <w:rFonts w:ascii="Times New Roman" w:hAnsi="Times New Roman" w:eastAsia="Times New Roman" w:cs="Times New Roman"/>
                 <w:b w:val="0"/>
                 <w:color w:val="232323"/>
                 <w:sz w:val="17"/>
@@ -4587,7 +4607,7 @@
             </w:pPr>
             <w:r>
               <w:rPr>
-                <w:rFonts w:ascii="Times New Roman" w:hAnsi="Times New Roman" w:eastAsia="Times New Roman"/>
+                <w:rFonts w:ascii="Times New Roman" w:hAnsi="Times New Roman" w:eastAsia="Times New Roman" w:cs="Times New Roman"/>
                 <w:b w:val="0"/>
                 <w:color w:val="232323"/>
                 <w:sz w:val="17"/>
@@ -4621,7 +4641,7 @@
             </w:pPr>
             <w:r>
               <w:rPr>
-                <w:rFonts w:ascii="Times New Roman" w:hAnsi="Times New Roman" w:eastAsia="Times New Roman"/>
+                <w:rFonts w:ascii="Times New Roman" w:hAnsi="Times New Roman" w:eastAsia="Times New Roman" w:cs="Times New Roman"/>
                 <w:b w:val="0"/>
                 <w:color w:val="232323"/>
                 <w:sz w:val="17"/>
@@ -4662,7 +4682,7 @@
             </w:pPr>
             <w:r>
               <w:rPr>
-                <w:rFonts w:ascii="Times New Roman" w:hAnsi="Times New Roman" w:eastAsia="Times New Roman"/>
+                <w:rFonts w:ascii="Times New Roman" w:hAnsi="Times New Roman" w:eastAsia="Times New Roman" w:cs="Times New Roman"/>
                 <w:b w:val="0"/>
                 <w:color w:val="232323"/>
                 <w:sz w:val="17"/>
@@ -4697,7 +4717,7 @@
             </w:pPr>
             <w:r>
               <w:rPr>
-                <w:rFonts w:ascii="Times New Roman" w:hAnsi="Times New Roman" w:eastAsia="Times New Roman"/>
+                <w:rFonts w:ascii="Times New Roman" w:hAnsi="Times New Roman" w:eastAsia="Times New Roman" w:cs="Times New Roman"/>
                 <w:b w:val="0"/>
                 <w:color w:val="232323"/>
                 <w:sz w:val="17"/>
@@ -4737,7 +4757,7 @@
             </w:pPr>
             <w:r>
               <w:rPr>
-                <w:rFonts w:ascii="Times New Roman" w:hAnsi="Times New Roman" w:eastAsia="Times New Roman"/>
+                <w:rFonts w:ascii="Times New Roman" w:hAnsi="Times New Roman" w:eastAsia="Times New Roman" w:cs="Times New Roman"/>
                 <w:b w:val="0"/>
                 <w:color w:val="232323"/>
                 <w:sz w:val="17"/>
@@ -4771,7 +4791,7 @@
             </w:pPr>
             <w:r>
               <w:rPr>
-                <w:rFonts w:ascii="Times New Roman" w:hAnsi="Times New Roman" w:eastAsia="Times New Roman"/>
+                <w:rFonts w:ascii="Times New Roman" w:hAnsi="Times New Roman" w:eastAsia="Times New Roman" w:cs="Times New Roman"/>
                 <w:b w:val="0"/>
                 <w:color w:val="232323"/>
                 <w:sz w:val="17"/>
@@ -4812,7 +4832,7 @@
             </w:pPr>
             <w:r>
               <w:rPr>
-                <w:rFonts w:ascii="Times New Roman" w:hAnsi="Times New Roman" w:eastAsia="Times New Roman"/>
+                <w:rFonts w:ascii="Times New Roman" w:hAnsi="Times New Roman" w:eastAsia="Times New Roman" w:cs="Times New Roman"/>
                 <w:b w:val="0"/>
                 <w:color w:val="232323"/>
                 <w:sz w:val="17"/>
@@ -4847,7 +4867,7 @@
             </w:pPr>
             <w:r>
               <w:rPr>
-                <w:rFonts w:ascii="Times New Roman" w:hAnsi="Times New Roman" w:eastAsia="Times New Roman"/>
+                <w:rFonts w:ascii="Times New Roman" w:hAnsi="Times New Roman" w:eastAsia="Times New Roman" w:cs="Times New Roman"/>
                 <w:b w:val="0"/>
                 <w:color w:val="232323"/>
                 <w:sz w:val="17"/>
@@ -4887,7 +4907,7 @@
             </w:pPr>
             <w:r>
               <w:rPr>
-                <w:rFonts w:ascii="Times New Roman" w:hAnsi="Times New Roman" w:eastAsia="Times New Roman"/>
+                <w:rFonts w:ascii="Times New Roman" w:hAnsi="Times New Roman" w:eastAsia="Times New Roman" w:cs="Times New Roman"/>
                 <w:b w:val="0"/>
                 <w:color w:val="232323"/>
                 <w:sz w:val="17"/>
@@ -4916,7 +4936,7 @@
           <w:p>
             <w:r>
               <w:rPr>
-                <w:rFonts w:ascii="Times New Roman" w:hAnsi="Times New Roman" w:eastAsia="SimSun"/>
+                <w:rFonts w:ascii="Times New Roman" w:hAnsi="Times New Roman" w:eastAsia="Times New Roman" w:cs="Times New Roman"/>
                 <w:sz w:val="18"/>
               </w:rPr>
               <w:t>Publish the trained eraser/lock/stapler classes through ROS after calibration and class-map alignment</w:t>
@@ -4955,7 +4975,7 @@
             </w:pPr>
             <w:r>
               <w:rPr>
-                <w:rFonts w:ascii="Times New Roman" w:hAnsi="Times New Roman" w:eastAsia="Times New Roman"/>
+                <w:rFonts w:ascii="Times New Roman" w:hAnsi="Times New Roman" w:eastAsia="Times New Roman" w:cs="Times New Roman"/>
                 <w:b w:val="0"/>
                 <w:color w:val="232323"/>
                 <w:sz w:val="17"/>
@@ -4985,7 +5005,7 @@
           <w:p>
             <w:r>
               <w:rPr>
-                <w:rFonts w:ascii="Times New Roman" w:hAnsi="Times New Roman" w:eastAsia="SimSun"/>
+                <w:rFonts w:ascii="Times New Roman" w:hAnsi="Times New Roman" w:eastAsia="Times New Roman" w:cs="Times New Roman"/>
                 <w:sz w:val="18"/>
               </w:rPr>
               <w:t>To be measured in a camera-driven robot run</w:t>
@@ -5007,7 +5027,7 @@
       </w:pPr>
       <w:r>
         <w:rPr>
-          <w:rFonts w:ascii="Times New Roman" w:hAnsi="Times New Roman" w:eastAsia="Times New Roman"/>
+          <w:rFonts w:ascii="Times New Roman" w:hAnsi="Times New Roman" w:eastAsia="Times New Roman" w:cs="Times New Roman"/>
           <w:b/>
           <w:color w:val="1F4E79"/>
           <w:sz w:val="30"/>
@@ -5023,7 +5043,7 @@
       </w:pPr>
       <w:r>
         <w:rPr>
-          <w:rFonts w:ascii="Times New Roman" w:hAnsi="Times New Roman" w:eastAsia="Times New Roman"/>
+          <w:rFonts w:ascii="Times New Roman" w:hAnsi="Times New Roman" w:eastAsia="Times New Roman" w:cs="Times New Roman"/>
           <w:b/>
           <w:color w:val="1F4E79"/>
           <w:sz w:val="23"/>
@@ -5038,6 +5058,10 @@
         <w:spacing w:before="100" w:after="80"/>
       </w:pPr>
       <w:r>
+        <w:rPr>
+          <w:rFonts w:ascii="Times New Roman" w:hAnsi="Times New Roman" w:eastAsia="Times New Roman" w:cs="Times New Roman"/>
+          <w:sz w:val="21"/>
+        </w:rPr>
         <w:t>4.1.1 Scene construction and parameter synchronization</w:t>
       </w:r>
     </w:p>
@@ -5047,7 +5071,7 @@
       </w:pPr>
       <w:r>
         <w:rPr>
-          <w:rFonts w:ascii="Times New Roman" w:hAnsi="Times New Roman" w:eastAsia="Times New Roman"/>
+          <w:rFonts w:ascii="Times New Roman" w:hAnsi="Times New Roman" w:eastAsia="Times New Roman" w:cs="Times New Roman"/>
           <w:b w:val="0"/>
           <w:color w:val="232323"/>
           <w:sz w:val="20"/>
@@ -5062,6 +5086,10 @@
         <w:spacing w:before="100" w:after="80"/>
       </w:pPr>
       <w:r>
+        <w:rPr>
+          <w:rFonts w:ascii="Times New Roman" w:hAnsi="Times New Roman" w:eastAsia="Times New Roman" w:cs="Times New Roman"/>
+          <w:sz w:val="21"/>
+        </w:rPr>
         <w:t>4.1.2 Manual teaching and single-object debugging</w:t>
       </w:r>
     </w:p>
@@ -5071,7 +5099,7 @@
       </w:pPr>
       <w:r>
         <w:rPr>
-          <w:rFonts w:ascii="Times New Roman" w:hAnsi="Times New Roman" w:eastAsia="Times New Roman"/>
+          <w:rFonts w:ascii="Times New Roman" w:hAnsi="Times New Roman" w:eastAsia="Times New Roman" w:cs="Times New Roman"/>
           <w:b w:val="0"/>
           <w:color w:val="232323"/>
           <w:sz w:val="20"/>
@@ -5131,6 +5159,10 @@
         <w:jc w:val="center"/>
       </w:pPr>
       <w:r>
+        <w:rPr>
+          <w:rFonts w:ascii="Times New Roman" w:hAnsi="Times New Roman" w:eastAsia="Times New Roman" w:cs="Times New Roman"/>
+          <w:sz w:val="18"/>
+        </w:rPr>
         <w:t>Fig. 3  Manual control panel, six-joint adjustment, and semantic waypoint editing</w:t>
       </w:r>
     </w:p>
@@ -5141,6 +5173,10 @@
         <w:spacing w:before="100" w:after="80"/>
       </w:pPr>
       <w:r>
+        <w:rPr>
+          <w:rFonts w:ascii="Times New Roman" w:hAnsi="Times New Roman" w:eastAsia="Times New Roman" w:cs="Times New Roman"/>
+          <w:sz w:val="21"/>
+        </w:rPr>
         <w:t>4.1.3 Automatic playback and one-command launch</w:t>
       </w:r>
     </w:p>
@@ -5150,7 +5186,7 @@
       </w:pPr>
       <w:r>
         <w:rPr>
-          <w:rFonts w:ascii="Times New Roman" w:hAnsi="Times New Roman" w:eastAsia="Times New Roman"/>
+          <w:rFonts w:ascii="Times New Roman" w:hAnsi="Times New Roman" w:eastAsia="Times New Roman" w:cs="Times New Roman"/>
           <w:b w:val="0"/>
           <w:color w:val="232323"/>
           <w:sz w:val="20"/>
@@ -5210,6 +5246,10 @@
         <w:jc w:val="center"/>
       </w:pPr>
       <w:r>
+        <w:rPr>
+          <w:rFonts w:ascii="Times New Roman" w:hAnsi="Times New Roman" w:eastAsia="Times New Roman" w:cs="Times New Roman"/>
+          <w:sz w:val="18"/>
+        </w:rPr>
         <w:t>Fig. 4  Six target subsequences and the 34-step automatic playback timing</w:t>
       </w:r>
     </w:p>
@@ -5220,6 +5260,10 @@
         <w:spacing w:before="100" w:after="80"/>
       </w:pPr>
       <w:r>
+        <w:rPr>
+          <w:rFonts w:ascii="Times New Roman" w:hAnsi="Times New Roman" w:eastAsia="Times New Roman" w:cs="Times New Roman"/>
+          <w:sz w:val="21"/>
+        </w:rPr>
         <w:t>4.1.4 Grasping, transfer, and release</w:t>
       </w:r>
     </w:p>
@@ -5229,7 +5273,7 @@
       </w:pPr>
       <w:r>
         <w:rPr>
-          <w:rFonts w:ascii="Times New Roman" w:hAnsi="Times New Roman" w:eastAsia="Times New Roman"/>
+          <w:rFonts w:ascii="Times New Roman" w:hAnsi="Times New Roman" w:eastAsia="Times New Roman" w:cs="Times New Roman"/>
           <w:b w:val="0"/>
           <w:color w:val="232323"/>
           <w:sz w:val="20"/>
@@ -5289,6 +5333,10 @@
         <w:jc w:val="center"/>
       </w:pPr>
       <w:r>
+        <w:rPr>
+          <w:rFonts w:ascii="Times New Roman" w:hAnsi="Times New Roman" w:eastAsia="Times New Roman" w:cs="Times New Roman"/>
+          <w:sz w:val="18"/>
+        </w:rPr>
         <w:t>Fig. 5  Gripper approach, closure, distance check, attachment, and lift</w:t>
       </w:r>
     </w:p>
@@ -5344,6 +5392,10 @@
         <w:jc w:val="center"/>
       </w:pPr>
       <w:r>
+        <w:rPr>
+          <w:rFonts w:ascii="Times New Roman" w:hAnsi="Times New Roman" w:eastAsia="Times New Roman" w:cs="Times New Roman"/>
+          <w:sz w:val="18"/>
+        </w:rPr>
         <w:t>Fig. 6  Alignment above the sorting bin, vertical release, and drop-point acceptance</w:t>
       </w:r>
     </w:p>
@@ -5354,6 +5406,10 @@
         <w:spacing w:before="100" w:after="80"/>
       </w:pPr>
       <w:r>
+        <w:rPr>
+          <w:rFonts w:ascii="Times New Roman" w:hAnsi="Times New Roman" w:eastAsia="Times New Roman" w:cs="Times New Roman"/>
+          <w:sz w:val="21"/>
+        </w:rPr>
         <w:t>4.1.5 Simulation acceptance records</w:t>
       </w:r>
     </w:p>
@@ -5363,7 +5419,7 @@
       </w:pPr>
       <w:r>
         <w:rPr>
-          <w:rFonts w:ascii="Times New Roman" w:hAnsi="Times New Roman" w:eastAsia="Times New Roman"/>
+          <w:rFonts w:ascii="Times New Roman" w:hAnsi="Times New Roman" w:eastAsia="Times New Roman" w:cs="Times New Roman"/>
           <w:b w:val="0"/>
           <w:color w:val="232323"/>
           <w:sz w:val="20"/>
@@ -5377,6 +5433,10 @@
         <w:spacing w:line="276" w:lineRule="auto" w:after="100"/>
       </w:pPr>
       <w:r>
+        <w:rPr>
+          <w:rFonts w:ascii="Times New Roman" w:hAnsi="Times New Roman" w:eastAsia="Times New Roman" w:cs="Times New Roman"/>
+          <w:sz w:val="23"/>
+        </w:rPr>
         <w:t>4.2 Three-class detector and external-camera test</w:t>
       </w:r>
     </w:p>
@@ -5386,7 +5446,7 @@
       </w:pPr>
       <w:r>
         <w:rPr>
-          <w:rFonts w:ascii="Times New Roman" w:hAnsi="Times New Roman" w:eastAsia="Times New Roman"/>
+          <w:rFonts w:ascii="Times New Roman" w:hAnsi="Times New Roman" w:eastAsia="Times New Roman" w:cs="Times New Roman"/>
           <w:b w:val="0"/>
           <w:color w:val="232323"/>
           <w:sz w:val="20"/>
@@ -5400,7 +5460,7 @@
       </w:pPr>
       <w:r>
         <w:rPr>
-          <w:rFonts w:ascii="Times New Roman" w:hAnsi="Times New Roman" w:eastAsia="Times New Roman"/>
+          <w:rFonts w:ascii="Times New Roman" w:hAnsi="Times New Roman" w:eastAsia="Times New Roman" w:cs="Times New Roman"/>
           <w:b w:val="0"/>
           <w:color w:val="232323"/>
           <w:sz w:val="20"/>
@@ -5414,7 +5474,8 @@
       </w:pPr>
       <w:r>
         <w:rPr>
-          <w:sz w:val="21"/>
+          <w:rFonts w:ascii="Times New Roman" w:hAnsi="Times New Roman" w:eastAsia="Times New Roman" w:cs="Times New Roman"/>
+          <w:sz w:val="20"/>
         </w:rPr>
         <w:t>The iteration process addressed lock-stapler confusion, stapler-eraser confusion at specific angles, dilution of early samples after new data were added, and the gap between validation images and external-camera scenes. The corresponding actions were class-balanced sampling, same-frame comparison samples, a stronger classification-loss contribution, higher sampling weight for early samples, and targeted camera-data collection. Overall mAP50-95 improved from 0.938 to 0.995. Figure 7 shows external-camera results under two grid arrangements. Erasers, the lock, and the stapler are correctly localized with confidence from 0.84 to 0.95, while the displayed end-to-end rate is 31.7-32.0 FPS. The reported 1.1 ms is the single-image model inference time; the displayed FPS also includes camera capture and rendering overhead.</w:t>
       </w:r>
@@ -5425,7 +5486,7 @@
       </w:pPr>
       <w:r>
         <w:rPr>
-          <w:rFonts w:ascii="Times New Roman" w:hAnsi="Times New Roman" w:eastAsia="SimSun"/>
+          <w:rFonts w:ascii="Times New Roman" w:hAnsi="Times New Roman" w:eastAsia="Times New Roman" w:cs="Times New Roman"/>
           <w:sz w:val="20"/>
         </w:rPr>
         <w:t>The external-camera test establishes detection performance for erasers, locks, and staplers. Its class labels and desktop coordinates will need to be aligned with the robot sorting configuration before the weight is used for a physical pick-and-place experiment. The weight is archived in models/ with the supplied camera evidence.</w:t>
@@ -5517,7 +5578,8 @@
       </w:pPr>
       <w:r>
         <w:rPr>
-          <w:sz w:val="21"/>
+          <w:rFonts w:ascii="Times New Roman" w:hAnsi="Times New Roman" w:eastAsia="Times New Roman" w:cs="Times New Roman"/>
+          <w:sz w:val="18"/>
         </w:rPr>
         <w:t>Fig. 7  Three-class detection under two grid arrangements (left: arrangement 1; right: arrangement 2)</w:t>
       </w:r>
@@ -5529,12 +5591,20 @@
         <w:spacing w:before="100" w:after="80"/>
       </w:pPr>
       <w:r>
+        <w:rPr>
+          <w:rFonts w:ascii="Times New Roman" w:hAnsi="Times New Roman" w:eastAsia="Times New Roman" w:cs="Times New Roman"/>
+          <w:sz w:val="23"/>
+        </w:rPr>
         <w:t>4.3 Physical-arm demonstration method and integration plan</w:t>
       </w:r>
     </w:p>
     <w:p>
       <w:pPr/>
       <w:r>
+        <w:rPr>
+          <w:rFonts w:ascii="Times New Roman" w:hAnsi="Times New Roman" w:eastAsia="Times New Roman" w:cs="Times New Roman"/>
+          <w:sz w:val="20"/>
+        </w:rPr>
         <w:t>To examine whether the approach, grasp, and lift motions established in simulation could be transferred to the physical arm, the team performed a low-speed single-target demonstration on a tabletop grid marked with blue tape. The arm approached a small yellow lock from above, descended vertically until the two fingers were positioned on opposite sides, closed the gripper, and lifted the target. Figure 8 is taken at 01:22 and is used to inspect the approach direction, grasp position, and lift height.</w:t>
       </w:r>
     </w:p>
@@ -5584,12 +5654,20 @@
         <w:jc w:val="center"/>
       </w:pPr>
       <w:r>
+        <w:rPr>
+          <w:rFonts w:ascii="Times New Roman" w:hAnsi="Times New Roman" w:eastAsia="Times New Roman" w:cs="Times New Roman"/>
+          <w:sz w:val="18"/>
+        </w:rPr>
         <w:t>Fig. 8  Physical-arm demonstration: a small lock held above the desktop grid (video at 01:22)</w:t>
       </w:r>
     </w:p>
     <w:p>
       <w:pPr/>
       <w:r>
+        <w:rPr>
+          <w:rFonts w:ascii="Times New Roman" w:hAnsi="Times New Roman" w:eastAsia="Times New Roman" w:cs="Times New Roman"/>
+          <w:sz w:val="20"/>
+        </w:rPr>
         <w:t>The hardware materials document object recognition, correction handling, and robot grasping. The recognition-and-correction video shows the six objects in two classes being identified and the task continuing after a correction is applied; the grasp video is used to inspect the physical approach, closure, and lift. The following subsections summarize the deployment, interface, and acceptance procedure.</w:t>
       </w:r>
     </w:p>
@@ -5600,6 +5678,10 @@
         <w:spacing w:before="100" w:after="80"/>
       </w:pPr>
       <w:r>
+        <w:rPr>
+          <w:rFonts w:ascii="Times New Roman" w:hAnsi="Times New Roman" w:eastAsia="Times New Roman" w:cs="Times New Roman"/>
+          <w:sz w:val="21"/>
+        </w:rPr>
         <w:t>4.3.1 Hardware deployment and calibration</w:t>
       </w:r>
     </w:p>
@@ -5608,6 +5690,10 @@
         <w:spacing w:line="276" w:lineRule="auto" w:after="100"/>
       </w:pPr>
       <w:r>
+        <w:rPr>
+          <w:rFonts w:ascii="Times New Roman" w:hAnsi="Times New Roman" w:eastAsia="Times New Roman" w:cs="Times New Roman"/>
+          <w:sz w:val="20"/>
+        </w:rPr>
         <w:t>For the integrated hardware run, the perception, task, and execution nodes will be deployed on Jetson. A fixed overhead RGB camera and a calibration board or homography will establish the pixel-to-desktop transformation. HOME, PICK1–PICK6, and each PLACE pose will be taught at low speed, with approach height, gripper opening, release wait time, and emergency-stop distance recorded.</w:t>
       </w:r>
     </w:p>
@@ -5618,6 +5704,10 @@
         <w:spacing w:before="100" w:after="80"/>
       </w:pPr>
       <w:r>
+        <w:rPr>
+          <w:rFonts w:ascii="Times New Roman" w:hAnsi="Times New Roman" w:eastAsia="Times New Roman" w:cs="Times New Roman"/>
+          <w:sz w:val="21"/>
+        </w:rPr>
         <w:t>4.3.2 Detection node and task interface</w:t>
       </w:r>
     </w:p>
@@ -5627,7 +5717,7 @@
       </w:pPr>
       <w:r>
         <w:rPr>
-          <w:rFonts w:ascii="Times New Roman" w:hAnsi="Times New Roman" w:eastAsia="SimSun"/>
+          <w:rFonts w:ascii="Times New Roman" w:hAnsi="Times New Roman" w:eastAsia="Times New Roman" w:cs="Times New Roman"/>
           <w:sz w:val="20"/>
         </w:rPr>
         <w:t>For hardware integration, the detector node must publish its class, box, and confidence as Detection2DArray. The chosen real objects and sorting bins must use the same class map as the trained weight, and camera pixels must be calibrated to the picking grid. The task node can then be tested with one target before extending to the six-object run.</w:t>
@@ -5640,6 +5730,10 @@
         <w:spacing w:before="100" w:after="80"/>
       </w:pPr>
       <w:r>
+        <w:rPr>
+          <w:rFonts w:ascii="Times New Roman" w:hAnsi="Times New Roman" w:eastAsia="Times New Roman" w:cs="Times New Roman"/>
+          <w:sz w:val="21"/>
+        </w:rPr>
         <w:t>4.3.3 Validation sequence from one target to six targets</w:t>
       </w:r>
     </w:p>
@@ -5649,7 +5743,7 @@
       </w:pPr>
       <w:r>
         <w:rPr>
-          <w:rFonts w:ascii="Times New Roman" w:hAnsi="Times New Roman" w:eastAsia="Times New Roman"/>
+          <w:rFonts w:ascii="Times New Roman" w:hAnsi="Times New Roman" w:eastAsia="Times New Roman" w:cs="Times New Roman"/>
           <w:b w:val="0"/>
           <w:color w:val="232323"/>
           <w:sz w:val="20"/>
@@ -5664,6 +5758,10 @@
         <w:spacing w:before="100" w:after="80"/>
       </w:pPr>
       <w:r>
+        <w:rPr>
+          <w:rFonts w:ascii="Times New Roman" w:hAnsi="Times New Roman" w:eastAsia="Times New Roman" w:cs="Times New Roman"/>
+          <w:sz w:val="21"/>
+        </w:rPr>
         <w:t>4.3.4 Real-robot acceptance checklist</w:t>
       </w:r>
     </w:p>
@@ -5711,7 +5809,7 @@
             </w:pPr>
             <w:r>
               <w:rPr>
-                <w:rFonts w:ascii="Times New Roman" w:hAnsi="Times New Roman" w:eastAsia="Times New Roman"/>
+                <w:rFonts w:ascii="Times New Roman" w:hAnsi="Times New Roman" w:eastAsia="Times New Roman" w:cs="Times New Roman"/>
                 <w:b/>
                 <w:color w:val="FFFFFF"/>
                 <w:sz w:val="17"/>
@@ -5746,7 +5844,7 @@
             </w:pPr>
             <w:r>
               <w:rPr>
-                <w:rFonts w:ascii="Times New Roman" w:hAnsi="Times New Roman" w:eastAsia="Times New Roman"/>
+                <w:rFonts w:ascii="Times New Roman" w:hAnsi="Times New Roman" w:eastAsia="Times New Roman" w:cs="Times New Roman"/>
                 <w:b/>
                 <w:color w:val="FFFFFF"/>
                 <w:sz w:val="17"/>
@@ -5781,7 +5879,7 @@
             </w:pPr>
             <w:r>
               <w:rPr>
-                <w:rFonts w:ascii="Times New Roman" w:hAnsi="Times New Roman" w:eastAsia="Times New Roman"/>
+                <w:rFonts w:ascii="Times New Roman" w:hAnsi="Times New Roman" w:eastAsia="Times New Roman" w:cs="Times New Roman"/>
                 <w:b/>
                 <w:color w:val="FFFFFF"/>
                 <w:sz w:val="17"/>
@@ -5822,7 +5920,7 @@
             </w:pPr>
             <w:r>
               <w:rPr>
-                <w:rFonts w:ascii="Times New Roman" w:hAnsi="Times New Roman" w:eastAsia="Times New Roman"/>
+                <w:rFonts w:ascii="Times New Roman" w:hAnsi="Times New Roman" w:eastAsia="Times New Roman" w:cs="Times New Roman"/>
                 <w:b w:val="0"/>
                 <w:color w:val="232323"/>
                 <w:sz w:val="17"/>
@@ -5857,7 +5955,7 @@
             </w:pPr>
             <w:r>
               <w:rPr>
-                <w:rFonts w:ascii="Times New Roman" w:hAnsi="Times New Roman" w:eastAsia="Times New Roman"/>
+                <w:rFonts w:ascii="Times New Roman" w:hAnsi="Times New Roman" w:eastAsia="Times New Roman" w:cs="Times New Roman"/>
                 <w:b w:val="0"/>
                 <w:color w:val="232323"/>
                 <w:sz w:val="17"/>
@@ -5892,7 +5990,7 @@
             </w:pPr>
             <w:r>
               <w:rPr>
-                <w:rFonts w:ascii="Times New Roman" w:hAnsi="Times New Roman" w:eastAsia="Times New Roman"/>
+                <w:rFonts w:ascii="Times New Roman" w:hAnsi="Times New Roman" w:eastAsia="Times New Roman" w:cs="Times New Roman"/>
                 <w:b w:val="0"/>
                 <w:color w:val="232323"/>
                 <w:sz w:val="17"/>
@@ -5932,7 +6030,7 @@
             </w:pPr>
             <w:r>
               <w:rPr>
-                <w:rFonts w:ascii="Times New Roman" w:hAnsi="Times New Roman" w:eastAsia="Times New Roman"/>
+                <w:rFonts w:ascii="Times New Roman" w:hAnsi="Times New Roman" w:eastAsia="Times New Roman" w:cs="Times New Roman"/>
                 <w:b w:val="0"/>
                 <w:color w:val="232323"/>
                 <w:sz w:val="17"/>
@@ -5966,7 +6064,7 @@
             </w:pPr>
             <w:r>
               <w:rPr>
-                <w:rFonts w:ascii="Times New Roman" w:hAnsi="Times New Roman" w:eastAsia="Times New Roman"/>
+                <w:rFonts w:ascii="Times New Roman" w:hAnsi="Times New Roman" w:eastAsia="Times New Roman" w:cs="Times New Roman"/>
                 <w:b w:val="0"/>
                 <w:color w:val="232323"/>
                 <w:sz w:val="17"/>
@@ -6000,7 +6098,7 @@
             </w:pPr>
             <w:r>
               <w:rPr>
-                <w:rFonts w:ascii="Times New Roman" w:hAnsi="Times New Roman" w:eastAsia="Times New Roman"/>
+                <w:rFonts w:ascii="Times New Roman" w:hAnsi="Times New Roman" w:eastAsia="Times New Roman" w:cs="Times New Roman"/>
                 <w:b w:val="0"/>
                 <w:color w:val="232323"/>
                 <w:sz w:val="17"/>
@@ -6041,7 +6139,7 @@
             </w:pPr>
             <w:r>
               <w:rPr>
-                <w:rFonts w:ascii="Times New Roman" w:hAnsi="Times New Roman" w:eastAsia="Times New Roman"/>
+                <w:rFonts w:ascii="Times New Roman" w:hAnsi="Times New Roman" w:eastAsia="Times New Roman" w:cs="Times New Roman"/>
                 <w:b w:val="0"/>
                 <w:color w:val="232323"/>
                 <w:sz w:val="17"/>
@@ -6076,7 +6174,7 @@
             </w:pPr>
             <w:r>
               <w:rPr>
-                <w:rFonts w:ascii="Times New Roman" w:hAnsi="Times New Roman" w:eastAsia="Times New Roman"/>
+                <w:rFonts w:ascii="Times New Roman" w:hAnsi="Times New Roman" w:eastAsia="Times New Roman" w:cs="Times New Roman"/>
                 <w:b w:val="0"/>
                 <w:color w:val="232323"/>
                 <w:sz w:val="17"/>
@@ -6111,7 +6209,7 @@
             </w:pPr>
             <w:r>
               <w:rPr>
-                <w:rFonts w:ascii="Times New Roman" w:hAnsi="Times New Roman" w:eastAsia="Times New Roman"/>
+                <w:rFonts w:ascii="Times New Roman" w:hAnsi="Times New Roman" w:eastAsia="Times New Roman" w:cs="Times New Roman"/>
                 <w:b w:val="0"/>
                 <w:color w:val="232323"/>
                 <w:sz w:val="17"/>
@@ -6151,7 +6249,7 @@
             </w:pPr>
             <w:r>
               <w:rPr>
-                <w:rFonts w:ascii="Times New Roman" w:hAnsi="Times New Roman" w:eastAsia="Times New Roman"/>
+                <w:rFonts w:ascii="Times New Roman" w:hAnsi="Times New Roman" w:eastAsia="Times New Roman" w:cs="Times New Roman"/>
                 <w:b w:val="0"/>
                 <w:color w:val="232323"/>
                 <w:sz w:val="17"/>
@@ -6185,7 +6283,7 @@
             </w:pPr>
             <w:r>
               <w:rPr>
-                <w:rFonts w:ascii="Times New Roman" w:hAnsi="Times New Roman" w:eastAsia="Times New Roman"/>
+                <w:rFonts w:ascii="Times New Roman" w:hAnsi="Times New Roman" w:eastAsia="Times New Roman" w:cs="Times New Roman"/>
                 <w:b w:val="0"/>
                 <w:color w:val="232323"/>
                 <w:sz w:val="17"/>
@@ -6219,7 +6317,7 @@
             </w:pPr>
             <w:r>
               <w:rPr>
-                <w:rFonts w:ascii="Times New Roman" w:hAnsi="Times New Roman" w:eastAsia="Times New Roman"/>
+                <w:rFonts w:ascii="Times New Roman" w:hAnsi="Times New Roman" w:eastAsia="Times New Roman" w:cs="Times New Roman"/>
                 <w:b w:val="0"/>
                 <w:color w:val="232323"/>
                 <w:sz w:val="17"/>
@@ -6260,7 +6358,7 @@
             </w:pPr>
             <w:r>
               <w:rPr>
-                <w:rFonts w:ascii="Times New Roman" w:hAnsi="Times New Roman" w:eastAsia="Times New Roman"/>
+                <w:rFonts w:ascii="Times New Roman" w:hAnsi="Times New Roman" w:eastAsia="Times New Roman" w:cs="Times New Roman"/>
                 <w:b w:val="0"/>
                 <w:color w:val="232323"/>
                 <w:sz w:val="17"/>
@@ -6295,7 +6393,7 @@
             </w:pPr>
             <w:r>
               <w:rPr>
-                <w:rFonts w:ascii="Times New Roman" w:hAnsi="Times New Roman" w:eastAsia="Times New Roman"/>
+                <w:rFonts w:ascii="Times New Roman" w:hAnsi="Times New Roman" w:eastAsia="Times New Roman" w:cs="Times New Roman"/>
                 <w:b w:val="0"/>
                 <w:color w:val="232323"/>
                 <w:sz w:val="17"/>
@@ -6330,7 +6428,7 @@
             </w:pPr>
             <w:r>
               <w:rPr>
-                <w:rFonts w:ascii="Times New Roman" w:hAnsi="Times New Roman" w:eastAsia="Times New Roman"/>
+                <w:rFonts w:ascii="Times New Roman" w:hAnsi="Times New Roman" w:eastAsia="Times New Roman" w:cs="Times New Roman"/>
                 <w:b w:val="0"/>
                 <w:color w:val="232323"/>
                 <w:sz w:val="17"/>
@@ -6370,7 +6468,7 @@
             </w:pPr>
             <w:r>
               <w:rPr>
-                <w:rFonts w:ascii="Times New Roman" w:hAnsi="Times New Roman" w:eastAsia="Times New Roman"/>
+                <w:rFonts w:ascii="Times New Roman" w:hAnsi="Times New Roman" w:eastAsia="Times New Roman" w:cs="Times New Roman"/>
                 <w:b w:val="0"/>
                 <w:color w:val="232323"/>
                 <w:sz w:val="17"/>
@@ -6404,7 +6502,7 @@
             </w:pPr>
             <w:r>
               <w:rPr>
-                <w:rFonts w:ascii="Times New Roman" w:hAnsi="Times New Roman" w:eastAsia="Times New Roman"/>
+                <w:rFonts w:ascii="Times New Roman" w:hAnsi="Times New Roman" w:eastAsia="Times New Roman" w:cs="Times New Roman"/>
                 <w:b w:val="0"/>
                 <w:color w:val="232323"/>
                 <w:sz w:val="17"/>
@@ -6438,7 +6536,7 @@
             </w:pPr>
             <w:r>
               <w:rPr>
-                <w:rFonts w:ascii="Times New Roman" w:hAnsi="Times New Roman" w:eastAsia="Times New Roman"/>
+                <w:rFonts w:ascii="Times New Roman" w:hAnsi="Times New Roman" w:eastAsia="Times New Roman" w:cs="Times New Roman"/>
                 <w:b w:val="0"/>
                 <w:color w:val="232323"/>
                 <w:sz w:val="17"/>
@@ -6462,7 +6560,7 @@
       </w:pPr>
       <w:r>
         <w:rPr>
-          <w:rFonts w:ascii="Times New Roman" w:hAnsi="Times New Roman" w:eastAsia="Times New Roman"/>
+          <w:rFonts w:ascii="Times New Roman" w:hAnsi="Times New Roman" w:eastAsia="Times New Roman" w:cs="Times New Roman"/>
           <w:b/>
           <w:color w:val="1F4E79"/>
           <w:sz w:val="30"/>
@@ -6478,7 +6576,7 @@
       </w:pPr>
       <w:r>
         <w:rPr>
-          <w:rFonts w:ascii="Times New Roman" w:hAnsi="Times New Roman" w:eastAsia="Times New Roman"/>
+          <w:rFonts w:ascii="Times New Roman" w:hAnsi="Times New Roman" w:eastAsia="Times New Roman" w:cs="Times New Roman"/>
           <w:b/>
           <w:color w:val="1F4E79"/>
           <w:sz w:val="23"/>
@@ -6530,7 +6628,7 @@
             </w:pPr>
             <w:r>
               <w:rPr>
-                <w:rFonts w:ascii="Times New Roman" w:hAnsi="Times New Roman" w:eastAsia="Times New Roman"/>
+                <w:rFonts w:ascii="Times New Roman" w:hAnsi="Times New Roman" w:eastAsia="Times New Roman" w:cs="Times New Roman"/>
                 <w:b/>
                 <w:color w:val="FFFFFF"/>
                 <w:sz w:val="17"/>
@@ -6565,7 +6663,7 @@
             </w:pPr>
             <w:r>
               <w:rPr>
-                <w:rFonts w:ascii="Times New Roman" w:hAnsi="Times New Roman" w:eastAsia="Times New Roman"/>
+                <w:rFonts w:ascii="Times New Roman" w:hAnsi="Times New Roman" w:eastAsia="Times New Roman" w:cs="Times New Roman"/>
                 <w:b/>
                 <w:color w:val="FFFFFF"/>
                 <w:sz w:val="17"/>
@@ -6600,7 +6698,7 @@
             </w:pPr>
             <w:r>
               <w:rPr>
-                <w:rFonts w:ascii="Times New Roman" w:hAnsi="Times New Roman" w:eastAsia="Times New Roman"/>
+                <w:rFonts w:ascii="Times New Roman" w:hAnsi="Times New Roman" w:eastAsia="Times New Roman" w:cs="Times New Roman"/>
                 <w:b/>
                 <w:color w:val="FFFFFF"/>
                 <w:sz w:val="17"/>
@@ -6641,7 +6739,7 @@
             </w:pPr>
             <w:r>
               <w:rPr>
-                <w:rFonts w:ascii="Times New Roman" w:hAnsi="Times New Roman" w:eastAsia="Times New Roman"/>
+                <w:rFonts w:ascii="Times New Roman" w:hAnsi="Times New Roman" w:eastAsia="Times New Roman" w:cs="Times New Roman"/>
                 <w:b w:val="0"/>
                 <w:color w:val="232323"/>
                 <w:sz w:val="17"/>
@@ -6676,7 +6774,7 @@
             </w:pPr>
             <w:r>
               <w:rPr>
-                <w:rFonts w:ascii="Times New Roman" w:hAnsi="Times New Roman" w:eastAsia="Times New Roman"/>
+                <w:rFonts w:ascii="Times New Roman" w:hAnsi="Times New Roman" w:eastAsia="Times New Roman" w:cs="Times New Roman"/>
                 <w:b w:val="0"/>
                 <w:color w:val="232323"/>
                 <w:sz w:val="17"/>
@@ -6711,7 +6809,7 @@
             </w:pPr>
             <w:r>
               <w:rPr>
-                <w:rFonts w:ascii="Times New Roman" w:hAnsi="Times New Roman" w:eastAsia="Times New Roman"/>
+                <w:rFonts w:ascii="Times New Roman" w:hAnsi="Times New Roman" w:eastAsia="Times New Roman" w:cs="Times New Roman"/>
                 <w:b w:val="0"/>
                 <w:color w:val="232323"/>
                 <w:sz w:val="17"/>
@@ -6751,7 +6849,7 @@
             </w:pPr>
             <w:r>
               <w:rPr>
-                <w:rFonts w:ascii="Times New Roman" w:hAnsi="Times New Roman" w:eastAsia="Times New Roman"/>
+                <w:rFonts w:ascii="Times New Roman" w:hAnsi="Times New Roman" w:eastAsia="Times New Roman" w:cs="Times New Roman"/>
                 <w:b w:val="0"/>
                 <w:color w:val="232323"/>
                 <w:sz w:val="17"/>
@@ -6785,7 +6883,7 @@
             </w:pPr>
             <w:r>
               <w:rPr>
-                <w:rFonts w:ascii="Times New Roman" w:hAnsi="Times New Roman" w:eastAsia="Times New Roman"/>
+                <w:rFonts w:ascii="Times New Roman" w:hAnsi="Times New Roman" w:eastAsia="Times New Roman" w:cs="Times New Roman"/>
                 <w:b w:val="0"/>
                 <w:color w:val="232323"/>
                 <w:sz w:val="17"/>
@@ -6819,7 +6917,7 @@
             </w:pPr>
             <w:r>
               <w:rPr>
-                <w:rFonts w:ascii="Times New Roman" w:hAnsi="Times New Roman" w:eastAsia="Times New Roman"/>
+                <w:rFonts w:ascii="Times New Roman" w:hAnsi="Times New Roman" w:eastAsia="Times New Roman" w:cs="Times New Roman"/>
                 <w:b w:val="0"/>
                 <w:color w:val="232323"/>
                 <w:sz w:val="17"/>
@@ -6860,7 +6958,7 @@
             </w:pPr>
             <w:r>
               <w:rPr>
-                <w:rFonts w:ascii="Times New Roman" w:hAnsi="Times New Roman" w:eastAsia="Times New Roman"/>
+                <w:rFonts w:ascii="Times New Roman" w:hAnsi="Times New Roman" w:eastAsia="Times New Roman" w:cs="Times New Roman"/>
                 <w:b w:val="0"/>
                 <w:color w:val="232323"/>
                 <w:sz w:val="17"/>
@@ -6895,7 +6993,7 @@
             </w:pPr>
             <w:r>
               <w:rPr>
-                <w:rFonts w:ascii="Times New Roman" w:hAnsi="Times New Roman" w:eastAsia="Times New Roman"/>
+                <w:rFonts w:ascii="Times New Roman" w:hAnsi="Times New Roman" w:eastAsia="Times New Roman" w:cs="Times New Roman"/>
                 <w:b w:val="0"/>
                 <w:color w:val="232323"/>
                 <w:sz w:val="17"/>
@@ -6930,7 +7028,7 @@
             </w:pPr>
             <w:r>
               <w:rPr>
-                <w:rFonts w:ascii="Times New Roman" w:hAnsi="Times New Roman" w:eastAsia="Times New Roman"/>
+                <w:rFonts w:ascii="Times New Roman" w:hAnsi="Times New Roman" w:eastAsia="Times New Roman" w:cs="Times New Roman"/>
                 <w:b w:val="0"/>
                 <w:color w:val="232323"/>
                 <w:sz w:val="17"/>
@@ -6970,7 +7068,7 @@
             </w:pPr>
             <w:r>
               <w:rPr>
-                <w:rFonts w:ascii="Times New Roman" w:hAnsi="Times New Roman" w:eastAsia="Times New Roman"/>
+                <w:rFonts w:ascii="Times New Roman" w:hAnsi="Times New Roman" w:eastAsia="Times New Roman" w:cs="Times New Roman"/>
                 <w:b w:val="0"/>
                 <w:color w:val="232323"/>
                 <w:sz w:val="17"/>
@@ -7004,7 +7102,7 @@
             </w:pPr>
             <w:r>
               <w:rPr>
-                <w:rFonts w:ascii="Times New Roman" w:hAnsi="Times New Roman" w:eastAsia="Times New Roman"/>
+                <w:rFonts w:ascii="Times New Roman" w:hAnsi="Times New Roman" w:eastAsia="Times New Roman" w:cs="Times New Roman"/>
                 <w:b w:val="0"/>
                 <w:color w:val="232323"/>
                 <w:sz w:val="17"/>
@@ -7038,7 +7136,7 @@
             </w:pPr>
             <w:r>
               <w:rPr>
-                <w:rFonts w:ascii="Times New Roman" w:hAnsi="Times New Roman" w:eastAsia="Times New Roman"/>
+                <w:rFonts w:ascii="Times New Roman" w:hAnsi="Times New Roman" w:eastAsia="Times New Roman" w:cs="Times New Roman"/>
                 <w:b w:val="0"/>
                 <w:color w:val="232323"/>
                 <w:sz w:val="17"/>
@@ -7079,7 +7177,7 @@
             </w:pPr>
             <w:r>
               <w:rPr>
-                <w:rFonts w:ascii="Times New Roman" w:hAnsi="Times New Roman" w:eastAsia="Times New Roman"/>
+                <w:rFonts w:ascii="Times New Roman" w:hAnsi="Times New Roman" w:eastAsia="Times New Roman" w:cs="Times New Roman"/>
                 <w:b w:val="0"/>
                 <w:color w:val="232323"/>
                 <w:sz w:val="17"/>
@@ -7114,7 +7212,7 @@
             </w:pPr>
             <w:r>
               <w:rPr>
-                <w:rFonts w:ascii="Times New Roman" w:hAnsi="Times New Roman" w:eastAsia="Times New Roman"/>
+                <w:rFonts w:ascii="Times New Roman" w:hAnsi="Times New Roman" w:eastAsia="Times New Roman" w:cs="Times New Roman"/>
                 <w:b w:val="0"/>
                 <w:color w:val="232323"/>
                 <w:sz w:val="17"/>
@@ -7149,7 +7247,7 @@
             </w:pPr>
             <w:r>
               <w:rPr>
-                <w:rFonts w:ascii="Times New Roman" w:hAnsi="Times New Roman" w:eastAsia="Times New Roman"/>
+                <w:rFonts w:ascii="Times New Roman" w:hAnsi="Times New Roman" w:eastAsia="Times New Roman" w:cs="Times New Roman"/>
                 <w:b w:val="0"/>
                 <w:color w:val="232323"/>
                 <w:sz w:val="17"/>
@@ -7173,7 +7271,7 @@
       </w:pPr>
       <w:r>
         <w:rPr>
-          <w:rFonts w:ascii="Times New Roman" w:hAnsi="Times New Roman" w:eastAsia="Times New Roman"/>
+          <w:rFonts w:ascii="Times New Roman" w:hAnsi="Times New Roman" w:eastAsia="Times New Roman" w:cs="Times New Roman"/>
           <w:b/>
           <w:color w:val="1F4E79"/>
           <w:sz w:val="23"/>
@@ -7225,7 +7323,7 @@
             </w:pPr>
             <w:r>
               <w:rPr>
-                <w:rFonts w:ascii="Times New Roman" w:hAnsi="Times New Roman" w:eastAsia="Times New Roman"/>
+                <w:rFonts w:ascii="Times New Roman" w:hAnsi="Times New Roman" w:eastAsia="Times New Roman" w:cs="Times New Roman"/>
                 <w:b/>
                 <w:color w:val="FFFFFF"/>
                 <w:sz w:val="17"/>
@@ -7260,7 +7358,7 @@
             </w:pPr>
             <w:r>
               <w:rPr>
-                <w:rFonts w:ascii="Times New Roman" w:hAnsi="Times New Roman" w:eastAsia="Times New Roman"/>
+                <w:rFonts w:ascii="Times New Roman" w:hAnsi="Times New Roman" w:eastAsia="Times New Roman" w:cs="Times New Roman"/>
                 <w:b/>
                 <w:color w:val="FFFFFF"/>
                 <w:sz w:val="17"/>
@@ -7295,7 +7393,7 @@
             </w:pPr>
             <w:r>
               <w:rPr>
-                <w:rFonts w:ascii="Times New Roman" w:hAnsi="Times New Roman" w:eastAsia="Times New Roman"/>
+                <w:rFonts w:ascii="Times New Roman" w:hAnsi="Times New Roman" w:eastAsia="Times New Roman" w:cs="Times New Roman"/>
                 <w:b/>
                 <w:color w:val="FFFFFF"/>
                 <w:sz w:val="17"/>
@@ -7336,7 +7434,7 @@
             </w:pPr>
             <w:r>
               <w:rPr>
-                <w:rFonts w:ascii="Times New Roman" w:hAnsi="Times New Roman" w:eastAsia="Times New Roman"/>
+                <w:rFonts w:ascii="Times New Roman" w:hAnsi="Times New Roman" w:eastAsia="Times New Roman" w:cs="Times New Roman"/>
                 <w:b w:val="0"/>
                 <w:color w:val="232323"/>
                 <w:sz w:val="17"/>
@@ -7371,7 +7469,7 @@
             </w:pPr>
             <w:r>
               <w:rPr>
-                <w:rFonts w:ascii="Times New Roman" w:hAnsi="Times New Roman" w:eastAsia="Times New Roman"/>
+                <w:rFonts w:ascii="Times New Roman" w:hAnsi="Times New Roman" w:eastAsia="Times New Roman" w:cs="Times New Roman"/>
                 <w:b w:val="0"/>
                 <w:color w:val="232323"/>
                 <w:sz w:val="17"/>
@@ -7406,7 +7504,7 @@
             </w:pPr>
             <w:r>
               <w:rPr>
-                <w:rFonts w:ascii="Times New Roman" w:hAnsi="Times New Roman" w:eastAsia="Times New Roman"/>
+                <w:rFonts w:ascii="Times New Roman" w:hAnsi="Times New Roman" w:eastAsia="Times New Roman" w:cs="Times New Roman"/>
                 <w:b w:val="0"/>
                 <w:color w:val="232323"/>
                 <w:sz w:val="17"/>
@@ -7446,7 +7544,7 @@
             </w:pPr>
             <w:r>
               <w:rPr>
-                <w:rFonts w:ascii="Times New Roman" w:hAnsi="Times New Roman" w:eastAsia="Times New Roman"/>
+                <w:rFonts w:ascii="Times New Roman" w:hAnsi="Times New Roman" w:eastAsia="Times New Roman" w:cs="Times New Roman"/>
                 <w:b w:val="0"/>
                 <w:color w:val="232323"/>
                 <w:sz w:val="17"/>
@@ -7480,7 +7578,7 @@
             </w:pPr>
             <w:r>
               <w:rPr>
-                <w:rFonts w:ascii="Times New Roman" w:hAnsi="Times New Roman" w:eastAsia="Times New Roman"/>
+                <w:rFonts w:ascii="Times New Roman" w:hAnsi="Times New Roman" w:eastAsia="Times New Roman" w:cs="Times New Roman"/>
                 <w:b w:val="0"/>
                 <w:color w:val="232323"/>
                 <w:sz w:val="17"/>
@@ -7514,7 +7612,7 @@
             </w:pPr>
             <w:r>
               <w:rPr>
-                <w:rFonts w:ascii="Times New Roman" w:hAnsi="Times New Roman" w:eastAsia="Times New Roman"/>
+                <w:rFonts w:ascii="Times New Roman" w:hAnsi="Times New Roman" w:eastAsia="Times New Roman" w:cs="Times New Roman"/>
                 <w:b w:val="0"/>
                 <w:color w:val="232323"/>
                 <w:sz w:val="17"/>
@@ -7555,7 +7653,7 @@
             </w:pPr>
             <w:r>
               <w:rPr>
-                <w:rFonts w:ascii="Times New Roman" w:hAnsi="Times New Roman" w:eastAsia="Times New Roman"/>
+                <w:rFonts w:ascii="Times New Roman" w:hAnsi="Times New Roman" w:eastAsia="Times New Roman" w:cs="Times New Roman"/>
                 <w:b w:val="0"/>
                 <w:color w:val="232323"/>
                 <w:sz w:val="17"/>
@@ -7590,7 +7688,7 @@
             </w:pPr>
             <w:r>
               <w:rPr>
-                <w:rFonts w:ascii="Times New Roman" w:hAnsi="Times New Roman" w:eastAsia="Times New Roman"/>
+                <w:rFonts w:ascii="Times New Roman" w:hAnsi="Times New Roman" w:eastAsia="Times New Roman" w:cs="Times New Roman"/>
                 <w:b w:val="0"/>
                 <w:color w:val="232323"/>
                 <w:sz w:val="17"/>
@@ -7625,7 +7723,7 @@
             </w:pPr>
             <w:r>
               <w:rPr>
-                <w:rFonts w:ascii="Times New Roman" w:hAnsi="Times New Roman" w:eastAsia="Times New Roman"/>
+                <w:rFonts w:ascii="Times New Roman" w:hAnsi="Times New Roman" w:eastAsia="Times New Roman" w:cs="Times New Roman"/>
                 <w:b w:val="0"/>
                 <w:color w:val="232323"/>
                 <w:sz w:val="17"/>
@@ -7665,7 +7763,7 @@
             </w:pPr>
             <w:r>
               <w:rPr>
-                <w:rFonts w:ascii="Times New Roman" w:hAnsi="Times New Roman" w:eastAsia="Times New Roman"/>
+                <w:rFonts w:ascii="Times New Roman" w:hAnsi="Times New Roman" w:eastAsia="Times New Roman" w:cs="Times New Roman"/>
                 <w:b w:val="0"/>
                 <w:color w:val="232323"/>
                 <w:sz w:val="17"/>
@@ -7699,7 +7797,7 @@
             </w:pPr>
             <w:r>
               <w:rPr>
-                <w:rFonts w:ascii="Times New Roman" w:hAnsi="Times New Roman" w:eastAsia="Times New Roman"/>
+                <w:rFonts w:ascii="Times New Roman" w:hAnsi="Times New Roman" w:eastAsia="Times New Roman" w:cs="Times New Roman"/>
                 <w:b w:val="0"/>
                 <w:color w:val="232323"/>
                 <w:sz w:val="17"/>
@@ -7733,7 +7831,7 @@
             </w:pPr>
             <w:r>
               <w:rPr>
-                <w:rFonts w:ascii="Times New Roman" w:hAnsi="Times New Roman" w:eastAsia="Times New Roman"/>
+                <w:rFonts w:ascii="Times New Roman" w:hAnsi="Times New Roman" w:eastAsia="Times New Roman" w:cs="Times New Roman"/>
                 <w:b w:val="0"/>
                 <w:color w:val="232323"/>
                 <w:sz w:val="17"/>
@@ -7774,7 +7872,7 @@
             </w:pPr>
             <w:r>
               <w:rPr>
-                <w:rFonts w:ascii="Times New Roman" w:hAnsi="Times New Roman" w:eastAsia="Times New Roman"/>
+                <w:rFonts w:ascii="Times New Roman" w:hAnsi="Times New Roman" w:eastAsia="Times New Roman" w:cs="Times New Roman"/>
                 <w:b w:val="0"/>
                 <w:color w:val="232323"/>
                 <w:sz w:val="17"/>
@@ -7809,7 +7907,7 @@
             </w:pPr>
             <w:r>
               <w:rPr>
-                <w:rFonts w:ascii="Times New Roman" w:hAnsi="Times New Roman" w:eastAsia="Times New Roman"/>
+                <w:rFonts w:ascii="Times New Roman" w:hAnsi="Times New Roman" w:eastAsia="Times New Roman" w:cs="Times New Roman"/>
                 <w:b w:val="0"/>
                 <w:color w:val="232323"/>
                 <w:sz w:val="17"/>
@@ -7844,7 +7942,7 @@
             </w:pPr>
             <w:r>
               <w:rPr>
-                <w:rFonts w:ascii="Times New Roman" w:hAnsi="Times New Roman" w:eastAsia="Times New Roman"/>
+                <w:rFonts w:ascii="Times New Roman" w:hAnsi="Times New Roman" w:eastAsia="Times New Roman" w:cs="Times New Roman"/>
                 <w:b w:val="0"/>
                 <w:color w:val="232323"/>
                 <w:sz w:val="17"/>
@@ -7868,7 +7966,7 @@
       </w:pPr>
       <w:r>
         <w:rPr>
-          <w:rFonts w:ascii="Times New Roman" w:hAnsi="Times New Roman" w:eastAsia="Times New Roman"/>
+          <w:rFonts w:ascii="Times New Roman" w:hAnsi="Times New Roman" w:eastAsia="Times New Roman" w:cs="Times New Roman"/>
           <w:b/>
           <w:color w:val="1F4E79"/>
           <w:sz w:val="23"/>
@@ -7882,7 +7980,7 @@
       </w:pPr>
       <w:r>
         <w:rPr>
-          <w:rFonts w:ascii="Times New Roman" w:hAnsi="Times New Roman" w:eastAsia="Times New Roman"/>
+          <w:rFonts w:ascii="Times New Roman" w:hAnsi="Times New Roman" w:eastAsia="Times New Roman" w:cs="Times New Roman"/>
           <w:b w:val="0"/>
           <w:color w:val="232323"/>
           <w:sz w:val="20"/>
@@ -7896,7 +7994,7 @@
       </w:pPr>
       <w:r>
         <w:rPr>
-          <w:rFonts w:ascii="Times New Roman" w:hAnsi="Times New Roman" w:eastAsia="Times New Roman"/>
+          <w:rFonts w:ascii="Times New Roman" w:hAnsi="Times New Roman" w:eastAsia="Times New Roman" w:cs="Times New Roman"/>
           <w:b w:val="0"/>
           <w:color w:val="232323"/>
           <w:sz w:val="20"/>
@@ -7912,7 +8010,7 @@
       </w:pPr>
       <w:r>
         <w:rPr>
-          <w:rFonts w:ascii="Times New Roman" w:hAnsi="Times New Roman" w:eastAsia="Times New Roman"/>
+          <w:rFonts w:ascii="Times New Roman" w:hAnsi="Times New Roman" w:eastAsia="Times New Roman" w:cs="Times New Roman"/>
           <w:b/>
           <w:color w:val="1F4E79"/>
           <w:sz w:val="30"/>
@@ -7927,6 +8025,10 @@
         <w:spacing w:before="100" w:after="80"/>
       </w:pPr>
       <w:r>
+        <w:rPr>
+          <w:rFonts w:ascii="Times New Roman" w:hAnsi="Times New Roman" w:eastAsia="Times New Roman" w:cs="Times New Roman"/>
+          <w:sz w:val="23"/>
+        </w:rPr>
         <w:t>6.1 Quantitative red–blue baseline with six objects</w:t>
       </w:r>
     </w:p>
@@ -7936,7 +8038,7 @@
       </w:pPr>
       <w:r>
         <w:rPr>
-          <w:rFonts w:ascii="Times New Roman" w:hAnsi="Times New Roman" w:eastAsia="Times New Roman"/>
+          <w:rFonts w:ascii="Times New Roman" w:hAnsi="Times New Roman" w:eastAsia="Times New Roman" w:cs="Times New Roman"/>
           <w:b w:val="0"/>
           <w:color w:val="232323"/>
           <w:sz w:val="20"/>
@@ -7992,7 +8094,7 @@
             </w:pPr>
             <w:r>
               <w:rPr>
-                <w:rFonts w:ascii="Times New Roman" w:hAnsi="Times New Roman" w:eastAsia="Times New Roman"/>
+                <w:rFonts w:ascii="Times New Roman" w:hAnsi="Times New Roman" w:eastAsia="Times New Roman" w:cs="Times New Roman"/>
                 <w:b/>
                 <w:color w:val="FFFFFF"/>
                 <w:sz w:val="17"/>
@@ -8027,7 +8129,7 @@
             </w:pPr>
             <w:r>
               <w:rPr>
-                <w:rFonts w:ascii="Times New Roman" w:hAnsi="Times New Roman" w:eastAsia="Times New Roman"/>
+                <w:rFonts w:ascii="Times New Roman" w:hAnsi="Times New Roman" w:eastAsia="Times New Roman" w:cs="Times New Roman"/>
                 <w:b/>
                 <w:color w:val="FFFFFF"/>
                 <w:sz w:val="17"/>
@@ -8062,7 +8164,7 @@
             </w:pPr>
             <w:r>
               <w:rPr>
-                <w:rFonts w:ascii="Times New Roman" w:hAnsi="Times New Roman" w:eastAsia="Times New Roman"/>
+                <w:rFonts w:ascii="Times New Roman" w:hAnsi="Times New Roman" w:eastAsia="Times New Roman" w:cs="Times New Roman"/>
                 <w:b/>
                 <w:color w:val="FFFFFF"/>
                 <w:sz w:val="17"/>
@@ -8097,7 +8199,7 @@
             </w:pPr>
             <w:r>
               <w:rPr>
-                <w:rFonts w:ascii="Times New Roman" w:hAnsi="Times New Roman" w:eastAsia="Times New Roman"/>
+                <w:rFonts w:ascii="Times New Roman" w:hAnsi="Times New Roman" w:eastAsia="Times New Roman" w:cs="Times New Roman"/>
                 <w:b/>
                 <w:color w:val="FFFFFF"/>
                 <w:sz w:val="17"/>
@@ -8132,7 +8234,7 @@
             </w:pPr>
             <w:r>
               <w:rPr>
-                <w:rFonts w:ascii="Times New Roman" w:hAnsi="Times New Roman" w:eastAsia="Times New Roman"/>
+                <w:rFonts w:ascii="Times New Roman" w:hAnsi="Times New Roman" w:eastAsia="Times New Roman" w:cs="Times New Roman"/>
                 <w:b/>
                 <w:color w:val="FFFFFF"/>
                 <w:sz w:val="17"/>
@@ -8167,7 +8269,7 @@
             </w:pPr>
             <w:r>
               <w:rPr>
-                <w:rFonts w:ascii="Times New Roman" w:hAnsi="Times New Roman" w:eastAsia="Times New Roman"/>
+                <w:rFonts w:ascii="Times New Roman" w:hAnsi="Times New Roman" w:eastAsia="Times New Roman" w:cs="Times New Roman"/>
                 <w:b/>
                 <w:color w:val="FFFFFF"/>
                 <w:sz w:val="17"/>
@@ -8202,7 +8304,7 @@
             </w:pPr>
             <w:r>
               <w:rPr>
-                <w:rFonts w:ascii="Times New Roman" w:hAnsi="Times New Roman" w:eastAsia="Times New Roman"/>
+                <w:rFonts w:ascii="Times New Roman" w:hAnsi="Times New Roman" w:eastAsia="Times New Roman" w:cs="Times New Roman"/>
                 <w:b/>
                 <w:color w:val="FFFFFF"/>
                 <w:sz w:val="17"/>
@@ -8243,7 +8345,7 @@
             </w:pPr>
             <w:r>
               <w:rPr>
-                <w:rFonts w:ascii="Times New Roman" w:hAnsi="Times New Roman" w:eastAsia="Times New Roman"/>
+                <w:rFonts w:ascii="Times New Roman" w:hAnsi="Times New Roman" w:eastAsia="Times New Roman" w:cs="Times New Roman"/>
                 <w:b w:val="0"/>
                 <w:color w:val="232323"/>
                 <w:sz w:val="17"/>
@@ -8278,7 +8380,7 @@
             </w:pPr>
             <w:r>
               <w:rPr>
-                <w:rFonts w:ascii="Times New Roman" w:hAnsi="Times New Roman" w:eastAsia="Times New Roman"/>
+                <w:rFonts w:ascii="Times New Roman" w:hAnsi="Times New Roman" w:eastAsia="Times New Roman" w:cs="Times New Roman"/>
                 <w:b w:val="0"/>
                 <w:color w:val="232323"/>
                 <w:sz w:val="17"/>
@@ -8313,7 +8415,7 @@
             </w:pPr>
             <w:r>
               <w:rPr>
-                <w:rFonts w:ascii="Times New Roman" w:hAnsi="Times New Roman" w:eastAsia="Times New Roman"/>
+                <w:rFonts w:ascii="Times New Roman" w:hAnsi="Times New Roman" w:eastAsia="Times New Roman" w:cs="Times New Roman"/>
                 <w:b w:val="0"/>
                 <w:color w:val="232323"/>
                 <w:sz w:val="17"/>
@@ -8348,7 +8450,7 @@
             </w:pPr>
             <w:r>
               <w:rPr>
-                <w:rFonts w:ascii="Times New Roman" w:hAnsi="Times New Roman" w:eastAsia="Times New Roman"/>
+                <w:rFonts w:ascii="Times New Roman" w:hAnsi="Times New Roman" w:eastAsia="Times New Roman" w:cs="Times New Roman"/>
                 <w:b w:val="0"/>
                 <w:color w:val="232323"/>
                 <w:sz w:val="17"/>
@@ -8383,7 +8485,7 @@
             </w:pPr>
             <w:r>
               <w:rPr>
-                <w:rFonts w:ascii="Times New Roman" w:hAnsi="Times New Roman" w:eastAsia="Times New Roman"/>
+                <w:rFonts w:ascii="Times New Roman" w:hAnsi="Times New Roman" w:eastAsia="Times New Roman" w:cs="Times New Roman"/>
                 <w:b w:val="0"/>
                 <w:color w:val="232323"/>
                 <w:sz w:val="17"/>
@@ -8418,7 +8520,7 @@
             </w:pPr>
             <w:r>
               <w:rPr>
-                <w:rFonts w:ascii="Times New Roman" w:hAnsi="Times New Roman" w:eastAsia="Times New Roman"/>
+                <w:rFonts w:ascii="Times New Roman" w:hAnsi="Times New Roman" w:eastAsia="Times New Roman" w:cs="Times New Roman"/>
                 <w:b w:val="0"/>
                 <w:color w:val="232323"/>
                 <w:sz w:val="17"/>
@@ -8453,7 +8555,7 @@
             </w:pPr>
             <w:r>
               <w:rPr>
-                <w:rFonts w:ascii="Times New Roman" w:hAnsi="Times New Roman" w:eastAsia="Times New Roman"/>
+                <w:rFonts w:ascii="Times New Roman" w:hAnsi="Times New Roman" w:eastAsia="Times New Roman" w:cs="Times New Roman"/>
                 <w:b w:val="0"/>
                 <w:color w:val="232323"/>
                 <w:sz w:val="17"/>
@@ -8493,7 +8595,7 @@
             </w:pPr>
             <w:r>
               <w:rPr>
-                <w:rFonts w:ascii="Times New Roman" w:hAnsi="Times New Roman" w:eastAsia="Times New Roman"/>
+                <w:rFonts w:ascii="Times New Roman" w:hAnsi="Times New Roman" w:eastAsia="Times New Roman" w:cs="Times New Roman"/>
                 <w:b w:val="0"/>
                 <w:color w:val="232323"/>
                 <w:sz w:val="17"/>
@@ -8527,7 +8629,7 @@
             </w:pPr>
             <w:r>
               <w:rPr>
-                <w:rFonts w:ascii="Times New Roman" w:hAnsi="Times New Roman" w:eastAsia="Times New Roman"/>
+                <w:rFonts w:ascii="Times New Roman" w:hAnsi="Times New Roman" w:eastAsia="Times New Roman" w:cs="Times New Roman"/>
                 <w:b w:val="0"/>
                 <w:color w:val="232323"/>
                 <w:sz w:val="17"/>
@@ -8561,7 +8663,7 @@
             </w:pPr>
             <w:r>
               <w:rPr>
-                <w:rFonts w:ascii="Times New Roman" w:hAnsi="Times New Roman" w:eastAsia="Times New Roman"/>
+                <w:rFonts w:ascii="Times New Roman" w:hAnsi="Times New Roman" w:eastAsia="Times New Roman" w:cs="Times New Roman"/>
                 <w:b w:val="0"/>
                 <w:color w:val="232323"/>
                 <w:sz w:val="17"/>
@@ -8595,7 +8697,7 @@
             </w:pPr>
             <w:r>
               <w:rPr>
-                <w:rFonts w:ascii="Times New Roman" w:hAnsi="Times New Roman" w:eastAsia="Times New Roman"/>
+                <w:rFonts w:ascii="Times New Roman" w:hAnsi="Times New Roman" w:eastAsia="Times New Roman" w:cs="Times New Roman"/>
                 <w:b w:val="0"/>
                 <w:color w:val="232323"/>
                 <w:sz w:val="17"/>
@@ -8629,7 +8731,7 @@
             </w:pPr>
             <w:r>
               <w:rPr>
-                <w:rFonts w:ascii="Times New Roman" w:hAnsi="Times New Roman" w:eastAsia="Times New Roman"/>
+                <w:rFonts w:ascii="Times New Roman" w:hAnsi="Times New Roman" w:eastAsia="Times New Roman" w:cs="Times New Roman"/>
                 <w:b w:val="0"/>
                 <w:color w:val="232323"/>
                 <w:sz w:val="17"/>
@@ -8663,7 +8765,7 @@
             </w:pPr>
             <w:r>
               <w:rPr>
-                <w:rFonts w:ascii="Times New Roman" w:hAnsi="Times New Roman" w:eastAsia="Times New Roman"/>
+                <w:rFonts w:ascii="Times New Roman" w:hAnsi="Times New Roman" w:eastAsia="Times New Roman" w:cs="Times New Roman"/>
                 <w:b w:val="0"/>
                 <w:color w:val="232323"/>
                 <w:sz w:val="17"/>
@@ -8697,7 +8799,7 @@
             </w:pPr>
             <w:r>
               <w:rPr>
-                <w:rFonts w:ascii="Times New Roman" w:hAnsi="Times New Roman" w:eastAsia="Times New Roman"/>
+                <w:rFonts w:ascii="Times New Roman" w:hAnsi="Times New Roman" w:eastAsia="Times New Roman" w:cs="Times New Roman"/>
                 <w:b w:val="0"/>
                 <w:color w:val="232323"/>
                 <w:sz w:val="17"/>
@@ -8738,7 +8840,7 @@
             </w:pPr>
             <w:r>
               <w:rPr>
-                <w:rFonts w:ascii="Times New Roman" w:hAnsi="Times New Roman" w:eastAsia="Times New Roman"/>
+                <w:rFonts w:ascii="Times New Roman" w:hAnsi="Times New Roman" w:eastAsia="Times New Roman" w:cs="Times New Roman"/>
                 <w:b w:val="0"/>
                 <w:color w:val="232323"/>
                 <w:sz w:val="17"/>
@@ -8773,7 +8875,7 @@
             </w:pPr>
             <w:r>
               <w:rPr>
-                <w:rFonts w:ascii="Times New Roman" w:hAnsi="Times New Roman" w:eastAsia="Times New Roman"/>
+                <w:rFonts w:ascii="Times New Roman" w:hAnsi="Times New Roman" w:eastAsia="Times New Roman" w:cs="Times New Roman"/>
                 <w:b w:val="0"/>
                 <w:color w:val="232323"/>
                 <w:sz w:val="17"/>
@@ -8808,7 +8910,7 @@
             </w:pPr>
             <w:r>
               <w:rPr>
-                <w:rFonts w:ascii="Times New Roman" w:hAnsi="Times New Roman" w:eastAsia="Times New Roman"/>
+                <w:rFonts w:ascii="Times New Roman" w:hAnsi="Times New Roman" w:eastAsia="Times New Roman" w:cs="Times New Roman"/>
                 <w:b w:val="0"/>
                 <w:color w:val="232323"/>
                 <w:sz w:val="17"/>
@@ -8843,7 +8945,7 @@
             </w:pPr>
             <w:r>
               <w:rPr>
-                <w:rFonts w:ascii="Times New Roman" w:hAnsi="Times New Roman" w:eastAsia="Times New Roman"/>
+                <w:rFonts w:ascii="Times New Roman" w:hAnsi="Times New Roman" w:eastAsia="Times New Roman" w:cs="Times New Roman"/>
                 <w:b w:val="0"/>
                 <w:color w:val="232323"/>
                 <w:sz w:val="17"/>
@@ -8878,7 +8980,7 @@
             </w:pPr>
             <w:r>
               <w:rPr>
-                <w:rFonts w:ascii="Times New Roman" w:hAnsi="Times New Roman" w:eastAsia="Times New Roman"/>
+                <w:rFonts w:ascii="Times New Roman" w:hAnsi="Times New Roman" w:eastAsia="Times New Roman" w:cs="Times New Roman"/>
                 <w:b w:val="0"/>
                 <w:color w:val="232323"/>
                 <w:sz w:val="17"/>
@@ -8913,7 +9015,7 @@
             </w:pPr>
             <w:r>
               <w:rPr>
-                <w:rFonts w:ascii="Times New Roman" w:hAnsi="Times New Roman" w:eastAsia="Times New Roman"/>
+                <w:rFonts w:ascii="Times New Roman" w:hAnsi="Times New Roman" w:eastAsia="Times New Roman" w:cs="Times New Roman"/>
                 <w:b w:val="0"/>
                 <w:color w:val="232323"/>
                 <w:sz w:val="17"/>
@@ -8948,7 +9050,7 @@
             </w:pPr>
             <w:r>
               <w:rPr>
-                <w:rFonts w:ascii="Times New Roman" w:hAnsi="Times New Roman" w:eastAsia="Times New Roman"/>
+                <w:rFonts w:ascii="Times New Roman" w:hAnsi="Times New Roman" w:eastAsia="Times New Roman" w:cs="Times New Roman"/>
                 <w:b w:val="0"/>
                 <w:color w:val="232323"/>
                 <w:sz w:val="17"/>
@@ -8988,7 +9090,7 @@
             </w:pPr>
             <w:r>
               <w:rPr>
-                <w:rFonts w:ascii="Times New Roman" w:hAnsi="Times New Roman" w:eastAsia="Times New Roman"/>
+                <w:rFonts w:ascii="Times New Roman" w:hAnsi="Times New Roman" w:eastAsia="Times New Roman" w:cs="Times New Roman"/>
                 <w:b w:val="0"/>
                 <w:color w:val="232323"/>
                 <w:sz w:val="17"/>
@@ -9022,7 +9124,7 @@
             </w:pPr>
             <w:r>
               <w:rPr>
-                <w:rFonts w:ascii="Times New Roman" w:hAnsi="Times New Roman" w:eastAsia="Times New Roman"/>
+                <w:rFonts w:ascii="Times New Roman" w:hAnsi="Times New Roman" w:eastAsia="Times New Roman" w:cs="Times New Roman"/>
                 <w:b w:val="0"/>
                 <w:color w:val="232323"/>
                 <w:sz w:val="17"/>
@@ -9056,7 +9158,7 @@
             </w:pPr>
             <w:r>
               <w:rPr>
-                <w:rFonts w:ascii="Times New Roman" w:hAnsi="Times New Roman" w:eastAsia="Times New Roman"/>
+                <w:rFonts w:ascii="Times New Roman" w:hAnsi="Times New Roman" w:eastAsia="Times New Roman" w:cs="Times New Roman"/>
                 <w:b w:val="0"/>
                 <w:color w:val="232323"/>
                 <w:sz w:val="17"/>
@@ -9090,7 +9192,7 @@
             </w:pPr>
             <w:r>
               <w:rPr>
-                <w:rFonts w:ascii="Times New Roman" w:hAnsi="Times New Roman" w:eastAsia="Times New Roman"/>
+                <w:rFonts w:ascii="Times New Roman" w:hAnsi="Times New Roman" w:eastAsia="Times New Roman" w:cs="Times New Roman"/>
                 <w:b w:val="0"/>
                 <w:color w:val="232323"/>
                 <w:sz w:val="17"/>
@@ -9124,7 +9226,7 @@
             </w:pPr>
             <w:r>
               <w:rPr>
-                <w:rFonts w:ascii="Times New Roman" w:hAnsi="Times New Roman" w:eastAsia="Times New Roman"/>
+                <w:rFonts w:ascii="Times New Roman" w:hAnsi="Times New Roman" w:eastAsia="Times New Roman" w:cs="Times New Roman"/>
                 <w:b w:val="0"/>
                 <w:color w:val="232323"/>
                 <w:sz w:val="17"/>
@@ -9158,7 +9260,7 @@
             </w:pPr>
             <w:r>
               <w:rPr>
-                <w:rFonts w:ascii="Times New Roman" w:hAnsi="Times New Roman" w:eastAsia="Times New Roman"/>
+                <w:rFonts w:ascii="Times New Roman" w:hAnsi="Times New Roman" w:eastAsia="Times New Roman" w:cs="Times New Roman"/>
                 <w:b w:val="0"/>
                 <w:color w:val="232323"/>
                 <w:sz w:val="17"/>
@@ -9192,7 +9294,7 @@
             </w:pPr>
             <w:r>
               <w:rPr>
-                <w:rFonts w:ascii="Times New Roman" w:hAnsi="Times New Roman" w:eastAsia="Times New Roman"/>
+                <w:rFonts w:ascii="Times New Roman" w:hAnsi="Times New Roman" w:eastAsia="Times New Roman" w:cs="Times New Roman"/>
                 <w:b w:val="0"/>
                 <w:color w:val="232323"/>
                 <w:sz w:val="17"/>
@@ -9233,7 +9335,7 @@
             </w:pPr>
             <w:r>
               <w:rPr>
-                <w:rFonts w:ascii="Times New Roman" w:hAnsi="Times New Roman" w:eastAsia="Times New Roman"/>
+                <w:rFonts w:ascii="Times New Roman" w:hAnsi="Times New Roman" w:eastAsia="Times New Roman" w:cs="Times New Roman"/>
                 <w:b w:val="0"/>
                 <w:color w:val="232323"/>
                 <w:sz w:val="17"/>
@@ -9268,7 +9370,7 @@
             </w:pPr>
             <w:r>
               <w:rPr>
-                <w:rFonts w:ascii="Times New Roman" w:hAnsi="Times New Roman" w:eastAsia="Times New Roman"/>
+                <w:rFonts w:ascii="Times New Roman" w:hAnsi="Times New Roman" w:eastAsia="Times New Roman" w:cs="Times New Roman"/>
                 <w:b w:val="0"/>
                 <w:color w:val="232323"/>
                 <w:sz w:val="17"/>
@@ -9303,7 +9405,7 @@
             </w:pPr>
             <w:r>
               <w:rPr>
-                <w:rFonts w:ascii="Times New Roman" w:hAnsi="Times New Roman" w:eastAsia="Times New Roman"/>
+                <w:rFonts w:ascii="Times New Roman" w:hAnsi="Times New Roman" w:eastAsia="Times New Roman" w:cs="Times New Roman"/>
                 <w:b w:val="0"/>
                 <w:color w:val="232323"/>
                 <w:sz w:val="17"/>
@@ -9338,7 +9440,7 @@
             </w:pPr>
             <w:r>
               <w:rPr>
-                <w:rFonts w:ascii="Times New Roman" w:hAnsi="Times New Roman" w:eastAsia="Times New Roman"/>
+                <w:rFonts w:ascii="Times New Roman" w:hAnsi="Times New Roman" w:eastAsia="Times New Roman" w:cs="Times New Roman"/>
                 <w:b w:val="0"/>
                 <w:color w:val="232323"/>
                 <w:sz w:val="17"/>
@@ -9373,7 +9475,7 @@
             </w:pPr>
             <w:r>
               <w:rPr>
-                <w:rFonts w:ascii="Times New Roman" w:hAnsi="Times New Roman" w:eastAsia="Times New Roman"/>
+                <w:rFonts w:ascii="Times New Roman" w:hAnsi="Times New Roman" w:eastAsia="Times New Roman" w:cs="Times New Roman"/>
                 <w:b w:val="0"/>
                 <w:color w:val="232323"/>
                 <w:sz w:val="17"/>
@@ -9408,7 +9510,7 @@
             </w:pPr>
             <w:r>
               <w:rPr>
-                <w:rFonts w:ascii="Times New Roman" w:hAnsi="Times New Roman" w:eastAsia="Times New Roman"/>
+                <w:rFonts w:ascii="Times New Roman" w:hAnsi="Times New Roman" w:eastAsia="Times New Roman" w:cs="Times New Roman"/>
                 <w:b w:val="0"/>
                 <w:color w:val="232323"/>
                 <w:sz w:val="17"/>
@@ -9443,7 +9545,7 @@
             </w:pPr>
             <w:r>
               <w:rPr>
-                <w:rFonts w:ascii="Times New Roman" w:hAnsi="Times New Roman" w:eastAsia="Times New Roman"/>
+                <w:rFonts w:ascii="Times New Roman" w:hAnsi="Times New Roman" w:eastAsia="Times New Roman" w:cs="Times New Roman"/>
                 <w:b w:val="0"/>
                 <w:color w:val="232323"/>
                 <w:sz w:val="17"/>
@@ -9483,7 +9585,7 @@
             </w:pPr>
             <w:r>
               <w:rPr>
-                <w:rFonts w:ascii="Times New Roman" w:hAnsi="Times New Roman" w:eastAsia="Times New Roman"/>
+                <w:rFonts w:ascii="Times New Roman" w:hAnsi="Times New Roman" w:eastAsia="Times New Roman" w:cs="Times New Roman"/>
                 <w:b w:val="0"/>
                 <w:color w:val="232323"/>
                 <w:sz w:val="17"/>
@@ -9517,7 +9619,7 @@
             </w:pPr>
             <w:r>
               <w:rPr>
-                <w:rFonts w:ascii="Times New Roman" w:hAnsi="Times New Roman" w:eastAsia="Times New Roman"/>
+                <w:rFonts w:ascii="Times New Roman" w:hAnsi="Times New Roman" w:eastAsia="Times New Roman" w:cs="Times New Roman"/>
                 <w:b w:val="0"/>
                 <w:color w:val="232323"/>
                 <w:sz w:val="17"/>
@@ -9551,7 +9653,7 @@
             </w:pPr>
             <w:r>
               <w:rPr>
-                <w:rFonts w:ascii="Times New Roman" w:hAnsi="Times New Roman" w:eastAsia="Times New Roman"/>
+                <w:rFonts w:ascii="Times New Roman" w:hAnsi="Times New Roman" w:eastAsia="Times New Roman" w:cs="Times New Roman"/>
                 <w:b w:val="0"/>
                 <w:color w:val="232323"/>
                 <w:sz w:val="17"/>
@@ -9585,7 +9687,7 @@
             </w:pPr>
             <w:r>
               <w:rPr>
-                <w:rFonts w:ascii="Times New Roman" w:hAnsi="Times New Roman" w:eastAsia="Times New Roman"/>
+                <w:rFonts w:ascii="Times New Roman" w:hAnsi="Times New Roman" w:eastAsia="Times New Roman" w:cs="Times New Roman"/>
                 <w:b w:val="0"/>
                 <w:color w:val="232323"/>
                 <w:sz w:val="17"/>
@@ -9619,7 +9721,7 @@
             </w:pPr>
             <w:r>
               <w:rPr>
-                <w:rFonts w:ascii="Times New Roman" w:hAnsi="Times New Roman" w:eastAsia="Times New Roman"/>
+                <w:rFonts w:ascii="Times New Roman" w:hAnsi="Times New Roman" w:eastAsia="Times New Roman" w:cs="Times New Roman"/>
                 <w:b w:val="0"/>
                 <w:color w:val="232323"/>
                 <w:sz w:val="17"/>
@@ -9653,7 +9755,7 @@
             </w:pPr>
             <w:r>
               <w:rPr>
-                <w:rFonts w:ascii="Times New Roman" w:hAnsi="Times New Roman" w:eastAsia="Times New Roman"/>
+                <w:rFonts w:ascii="Times New Roman" w:hAnsi="Times New Roman" w:eastAsia="Times New Roman" w:cs="Times New Roman"/>
                 <w:b w:val="0"/>
                 <w:color w:val="232323"/>
                 <w:sz w:val="17"/>
@@ -9687,7 +9789,7 @@
             </w:pPr>
             <w:r>
               <w:rPr>
-                <w:rFonts w:ascii="Times New Roman" w:hAnsi="Times New Roman" w:eastAsia="Times New Roman"/>
+                <w:rFonts w:ascii="Times New Roman" w:hAnsi="Times New Roman" w:eastAsia="Times New Roman" w:cs="Times New Roman"/>
                 <w:b w:val="0"/>
                 <w:color w:val="232323"/>
                 <w:sz w:val="17"/>
@@ -9710,6 +9812,10 @@
         <w:spacing w:before="100" w:after="80"/>
       </w:pPr>
       <w:r>
+        <w:rPr>
+          <w:rFonts w:ascii="Times New Roman" w:hAnsi="Times New Roman" w:eastAsia="Times New Roman" w:cs="Times New Roman"/>
+          <w:sz w:val="23"/>
+        </w:rPr>
         <w:t>6.2 Three-class extension</w:t>
       </w:r>
     </w:p>
@@ -9719,7 +9825,7 @@
       </w:pPr>
       <w:r>
         <w:rPr>
-          <w:rFonts w:ascii="Times New Roman" w:hAnsi="Times New Roman" w:eastAsia="Times New Roman"/>
+          <w:rFonts w:ascii="Times New Roman" w:hAnsi="Times New Roman" w:eastAsia="Times New Roman" w:cs="Times New Roman"/>
           <w:b w:val="0"/>
           <w:color w:val="232323"/>
           <w:sz w:val="20"/>
@@ -9732,6 +9838,10 @@
         <w:pStyle w:val="Heading2"/>
       </w:pPr>
       <w:r>
+        <w:rPr>
+          <w:rFonts w:ascii="Times New Roman" w:hAnsi="Times New Roman" w:eastAsia="Times New Roman" w:cs="Times New Roman"/>
+          <w:sz w:val="23"/>
+        </w:rPr>
         <w:t>6.3 Three-class detector evaluation</w:t>
       </w:r>
     </w:p>
@@ -9739,7 +9849,8 @@
       <w:pPr/>
       <w:r>
         <w:rPr>
-          <w:sz w:val="21"/>
+          <w:rFonts w:ascii="Times New Roman" w:hAnsi="Times New Roman" w:eastAsia="Times New Roman" w:cs="Times New Roman"/>
+          <w:sz w:val="20"/>
         </w:rPr>
         <w:t>The independent validation record reports overall and per-class mAP50=0.995 and mAP50-95=0.995, with precision=1.0 and recall=1.0. The two external-camera views in Fig. 7 further demonstrate detection of erasers, a lock, and a stapler when grid positions and object arrangements change. Confidence ranges from 0.84 to 0.95, and the displayed rates are 31.7 FPS and 32.0 FPS. This evidence evaluates external-camera visual detection; the system-level recognition and correction process is verified by the physical test video in Section 6.4.</w:t>
       </w:r>
@@ -9749,6 +9860,10 @@
         <w:pStyle w:val="Heading2"/>
       </w:pPr>
       <w:r>
+        <w:rPr>
+          <w:rFonts w:ascii="Times New Roman" w:hAnsi="Times New Roman" w:eastAsia="Times New Roman" w:cs="Times New Roman"/>
+          <w:sz w:val="23"/>
+        </w:rPr>
         <w:t>6.4 Recognition, correction, and physical-arm results</w:t>
       </w:r>
     </w:p>
@@ -9756,7 +9871,7 @@
       <w:pPr/>
       <w:r>
         <w:rPr>
-          <w:rFonts w:ascii="Times New Roman" w:hAnsi="Times New Roman" w:eastAsia="SimSun"/>
+          <w:rFonts w:ascii="Times New Roman" w:hAnsi="Times New Roman" w:eastAsia="Times New Roman" w:cs="Times New Roman"/>
           <w:sz w:val="20"/>
         </w:rPr>
         <w:t>The hardware acceptance contains two complementary videos. A 1 min 11 s recording verifies correct recognition of six objects in two classes and shows the system entering its correction process, confirming the target again, and continuing the task after a recognition or execution deviation. The second video records the arm moving above the grid, descending to both sides of a lock, closing the gripper, and lifting it from the table; at 01:22, the lock is visibly held between the fingers above the surface.</w:t>
@@ -9766,7 +9881,7 @@
       <w:pPr/>
       <w:r>
         <w:rPr>
-          <w:rFonts w:ascii="Times New Roman" w:hAnsi="Times New Roman" w:eastAsia="SimSun"/>
+          <w:rFonts w:ascii="Times New Roman" w:hAnsi="Times New Roman" w:eastAsia="Times New Roman" w:cs="Times New Roman"/>
           <w:sz w:val="20"/>
         </w:rPr>
         <w:t>Together, the recordings verify target recognition, correction handling, and the physical approach, grasp, and lift. The recognition output, correction process, and robot motion can be reviewed directly from the videos, so the real-robot acceptance item for six objects in two classes is recorded as passed.</w:t>
@@ -9779,6 +9894,10 @@
         <w:spacing w:before="100" w:after="80"/>
       </w:pPr>
       <w:r>
+        <w:rPr>
+          <w:rFonts w:ascii="Times New Roman" w:hAnsi="Times New Roman" w:eastAsia="Times New Roman" w:cs="Times New Roman"/>
+          <w:sz w:val="23"/>
+        </w:rPr>
         <w:t>6.5 Multi-layer evidence chain</w:t>
       </w:r>
     </w:p>
@@ -9788,7 +9907,7 @@
       </w:pPr>
       <w:r>
         <w:rPr>
-          <w:rFonts w:ascii="Times New Roman" w:hAnsi="Times New Roman" w:eastAsia="Times New Roman"/>
+          <w:rFonts w:ascii="Times New Roman" w:hAnsi="Times New Roman" w:eastAsia="Times New Roman" w:cs="Times New Roman"/>
           <w:b w:val="0"/>
           <w:color w:val="232323"/>
           <w:sz w:val="20"/>
@@ -9848,6 +9967,10 @@
         <w:jc w:val="center"/>
       </w:pPr>
       <w:r>
+        <w:rPr>
+          <w:rFonts w:ascii="Times New Roman" w:hAnsi="Times New Roman" w:eastAsia="Times New Roman" w:cs="Times New Roman"/>
+          <w:sz w:val="18"/>
+        </w:rPr>
         <w:t>Fig. 9  GUI, state, event, pose, and object-level CSV form the acceptance evidence chain</w:t>
       </w:r>
     </w:p>
@@ -9859,7 +9982,7 @@
       </w:pPr>
       <w:r>
         <w:rPr>
-          <w:rFonts w:ascii="Times New Roman" w:hAnsi="Times New Roman" w:eastAsia="Times New Roman"/>
+          <w:rFonts w:ascii="Times New Roman" w:hAnsi="Times New Roman" w:eastAsia="Times New Roman" w:cs="Times New Roman"/>
           <w:b/>
           <w:color w:val="1F4E79"/>
           <w:sz w:val="30"/>
@@ -9873,7 +9996,7 @@
       </w:pPr>
       <w:r>
         <w:rPr>
-          <w:rFonts w:ascii="Times New Roman" w:hAnsi="Times New Roman" w:eastAsia="SimSun"/>
+          <w:rFonts w:ascii="Times New Roman" w:hAnsi="Times New Roman" w:eastAsia="Times New Roman" w:cs="Times New Roman"/>
           <w:sz w:val="20"/>
         </w:rPr>
         <w:t>The group divided the work into camera-model training, Gazebo scene and synthetic-detection setup, task decisions, robot execution, and integration testing. The camera test and Gazebo sorting run have separate evidence: detection frames and object-level execution records. Integrating these interfaces remains part of the hardware phase.</w:t>
@@ -9923,7 +10046,7 @@
             </w:pPr>
             <w:r>
               <w:rPr>
-                <w:rFonts w:ascii="Times New Roman" w:hAnsi="Times New Roman" w:eastAsia="Times New Roman"/>
+                <w:rFonts w:ascii="Times New Roman" w:hAnsi="Times New Roman" w:eastAsia="Times New Roman" w:cs="Times New Roman"/>
                 <w:b/>
                 <w:color w:val="FFFFFF"/>
                 <w:sz w:val="17"/>
@@ -9958,7 +10081,7 @@
             </w:pPr>
             <w:r>
               <w:rPr>
-                <w:rFonts w:ascii="Times New Roman" w:hAnsi="Times New Roman" w:eastAsia="Times New Roman"/>
+                <w:rFonts w:ascii="Times New Roman" w:hAnsi="Times New Roman" w:eastAsia="Times New Roman" w:cs="Times New Roman"/>
                 <w:b/>
                 <w:color w:val="FFFFFF"/>
                 <w:sz w:val="17"/>
@@ -9993,7 +10116,7 @@
             </w:pPr>
             <w:r>
               <w:rPr>
-                <w:rFonts w:ascii="Times New Roman" w:hAnsi="Times New Roman" w:eastAsia="Times New Roman"/>
+                <w:rFonts w:ascii="Times New Roman" w:hAnsi="Times New Roman" w:eastAsia="Times New Roman" w:cs="Times New Roman"/>
                 <w:b/>
                 <w:color w:val="FFFFFF"/>
                 <w:sz w:val="17"/>
@@ -10029,7 +10152,7 @@
           <w:p>
             <w:r>
               <w:rPr>
-                <w:rFonts w:ascii="Times New Roman" w:hAnsi="Times New Roman" w:eastAsia="Times New Roman"/>
+                <w:rFonts w:ascii="Times New Roman" w:hAnsi="Times New Roman" w:eastAsia="Times New Roman" w:cs="Times New Roman"/>
                 <w:b w:val="0"/>
                 <w:color w:val="232323"/>
                 <w:sz w:val="17"/>
@@ -10059,7 +10182,7 @@
           <w:p>
             <w:r>
               <w:rPr>
-                <w:rFonts w:ascii="Times New Roman" w:hAnsi="Times New Roman" w:eastAsia="Times New Roman"/>
+                <w:rFonts w:ascii="Times New Roman" w:hAnsi="Times New Roman" w:eastAsia="Times New Roman" w:cs="Times New Roman"/>
                 <w:b w:val="0"/>
                 <w:color w:val="232323"/>
                 <w:sz w:val="17"/>
@@ -10089,7 +10212,7 @@
           <w:p>
             <w:r>
               <w:rPr>
-                <w:rFonts w:ascii="Times New Roman" w:hAnsi="Times New Roman" w:eastAsia="Times New Roman"/>
+                <w:rFonts w:ascii="Times New Roman" w:hAnsi="Times New Roman" w:eastAsia="Times New Roman" w:cs="Times New Roman"/>
                 <w:b w:val="0"/>
                 <w:color w:val="232323"/>
                 <w:sz w:val="17"/>
@@ -10129,7 +10252,7 @@
             </w:pPr>
             <w:r>
               <w:rPr>
-                <w:rFonts w:ascii="Times New Roman" w:hAnsi="Times New Roman" w:eastAsia="Times New Roman"/>
+                <w:rFonts w:ascii="Times New Roman" w:hAnsi="Times New Roman" w:eastAsia="Times New Roman" w:cs="Times New Roman"/>
                 <w:b w:val="0"/>
                 <w:color w:val="232323"/>
                 <w:sz w:val="17"/>
@@ -10163,7 +10286,7 @@
             </w:pPr>
             <w:r>
               <w:rPr>
-                <w:rFonts w:ascii="Times New Roman" w:hAnsi="Times New Roman" w:eastAsia="Times New Roman"/>
+                <w:rFonts w:ascii="Times New Roman" w:hAnsi="Times New Roman" w:eastAsia="Times New Roman" w:cs="Times New Roman"/>
                 <w:b w:val="0"/>
                 <w:color w:val="232323"/>
                 <w:sz w:val="17"/>
@@ -10197,7 +10320,7 @@
             </w:pPr>
             <w:r>
               <w:rPr>
-                <w:rFonts w:ascii="Times New Roman" w:hAnsi="Times New Roman" w:eastAsia="Times New Roman"/>
+                <w:rFonts w:ascii="Times New Roman" w:hAnsi="Times New Roman" w:eastAsia="Times New Roman" w:cs="Times New Roman"/>
                 <w:b w:val="0"/>
                 <w:color w:val="232323"/>
                 <w:sz w:val="17"/>
@@ -10238,7 +10361,7 @@
             </w:pPr>
             <w:r>
               <w:rPr>
-                <w:rFonts w:ascii="Times New Roman" w:hAnsi="Times New Roman" w:eastAsia="Times New Roman"/>
+                <w:rFonts w:ascii="Times New Roman" w:hAnsi="Times New Roman" w:eastAsia="Times New Roman" w:cs="Times New Roman"/>
                 <w:b w:val="0"/>
                 <w:color w:val="232323"/>
                 <w:sz w:val="17"/>
@@ -10273,7 +10396,7 @@
             </w:pPr>
             <w:r>
               <w:rPr>
-                <w:rFonts w:ascii="Times New Roman" w:hAnsi="Times New Roman" w:eastAsia="Times New Roman"/>
+                <w:rFonts w:ascii="Times New Roman" w:hAnsi="Times New Roman" w:eastAsia="Times New Roman" w:cs="Times New Roman"/>
                 <w:b w:val="0"/>
                 <w:color w:val="232323"/>
                 <w:sz w:val="17"/>
@@ -10308,7 +10431,7 @@
             </w:pPr>
             <w:r>
               <w:rPr>
-                <w:rFonts w:ascii="Times New Roman" w:hAnsi="Times New Roman" w:eastAsia="Times New Roman"/>
+                <w:rFonts w:ascii="Times New Roman" w:hAnsi="Times New Roman" w:eastAsia="Times New Roman" w:cs="Times New Roman"/>
                 <w:b w:val="0"/>
                 <w:color w:val="232323"/>
                 <w:sz w:val="17"/>
@@ -10348,7 +10471,7 @@
             </w:pPr>
             <w:r>
               <w:rPr>
-                <w:rFonts w:ascii="Times New Roman" w:hAnsi="Times New Roman" w:eastAsia="Times New Roman"/>
+                <w:rFonts w:ascii="Times New Roman" w:hAnsi="Times New Roman" w:eastAsia="Times New Roman" w:cs="Times New Roman"/>
                 <w:b w:val="0"/>
                 <w:color w:val="232323"/>
                 <w:sz w:val="17"/>
@@ -10382,7 +10505,7 @@
             </w:pPr>
             <w:r>
               <w:rPr>
-                <w:rFonts w:ascii="Times New Roman" w:hAnsi="Times New Roman" w:eastAsia="Times New Roman"/>
+                <w:rFonts w:ascii="Times New Roman" w:hAnsi="Times New Roman" w:eastAsia="Times New Roman" w:cs="Times New Roman"/>
                 <w:b w:val="0"/>
                 <w:color w:val="232323"/>
                 <w:sz w:val="17"/>
@@ -10416,7 +10539,7 @@
             </w:pPr>
             <w:r>
               <w:rPr>
-                <w:rFonts w:ascii="Times New Roman" w:hAnsi="Times New Roman" w:eastAsia="Times New Roman"/>
+                <w:rFonts w:ascii="Times New Roman" w:hAnsi="Times New Roman" w:eastAsia="Times New Roman" w:cs="Times New Roman"/>
                 <w:b w:val="0"/>
                 <w:color w:val="232323"/>
                 <w:sz w:val="17"/>
@@ -10451,7 +10574,7 @@
           <w:p>
             <w:r>
               <w:rPr>
-                <w:rFonts w:ascii="Times New Roman" w:hAnsi="Times New Roman" w:eastAsia="Times New Roman"/>
+                <w:rFonts w:ascii="Times New Roman" w:hAnsi="Times New Roman" w:eastAsia="Times New Roman" w:cs="Times New Roman"/>
                 <w:b w:val="0"/>
                 <w:color w:val="232323"/>
                 <w:sz w:val="17"/>
@@ -10480,7 +10603,7 @@
           <w:p>
             <w:r>
               <w:rPr>
-                <w:rFonts w:ascii="Times New Roman" w:hAnsi="Times New Roman" w:eastAsia="Times New Roman"/>
+                <w:rFonts w:ascii="Times New Roman" w:hAnsi="Times New Roman" w:eastAsia="Times New Roman" w:cs="Times New Roman"/>
                 <w:b w:val="0"/>
                 <w:color w:val="232323"/>
                 <w:sz w:val="17"/>
@@ -10509,7 +10632,7 @@
           <w:p>
             <w:r>
               <w:rPr>
-                <w:rFonts w:ascii="Times New Roman" w:hAnsi="Times New Roman" w:eastAsia="Times New Roman"/>
+                <w:rFonts w:ascii="Times New Roman" w:hAnsi="Times New Roman" w:eastAsia="Times New Roman" w:cs="Times New Roman"/>
                 <w:b w:val="0"/>
                 <w:color w:val="232323"/>
                 <w:sz w:val="17"/>
@@ -10533,7 +10656,7 @@
       </w:pPr>
       <w:r>
         <w:rPr>
-          <w:rFonts w:ascii="Times New Roman" w:hAnsi="Times New Roman" w:eastAsia="Times New Roman"/>
+          <w:rFonts w:ascii="Times New Roman" w:hAnsi="Times New Roman" w:eastAsia="Times New Roman" w:cs="Times New Roman"/>
           <w:b/>
           <w:color w:val="1F4E79"/>
           <w:sz w:val="30"/>
@@ -10549,7 +10672,7 @@
       </w:pPr>
       <w:r>
         <w:rPr>
-          <w:rFonts w:ascii="Times New Roman" w:hAnsi="Times New Roman" w:eastAsia="Times New Roman"/>
+          <w:rFonts w:ascii="Times New Roman" w:hAnsi="Times New Roman" w:eastAsia="Times New Roman" w:cs="Times New Roman"/>
           <w:b/>
           <w:color w:val="1F4E79"/>
           <w:sz w:val="23"/>
@@ -10562,6 +10685,10 @@
         <w:spacing w:line="276" w:lineRule="auto" w:after="100"/>
       </w:pPr>
       <w:r>
+        <w:rPr>
+          <w:rFonts w:ascii="Times New Roman" w:hAnsi="Times New Roman" w:eastAsia="Times New Roman" w:cs="Times New Roman"/>
+          <w:sz w:val="20"/>
+        </w:rPr>
         <w:t>Experiment 3 extends fixed-point transfer into Gazebo desktop sorting, external-camera detection, and real-robot validation. The Gazebo task integrates Detection2DArray messages, fixed-grid localization, class-to-bin mapping, execution states, and object-level logs, reaching 6/6 in the red-blue baseline. The camera model recognizes erasers, locks, and staplers. Hardware videos verify correct recognition and correction for six objects in two classes, together with a visible grasp and lift of a lock.</w:t>
       </w:r>
     </w:p>
@@ -10571,7 +10698,7 @@
       </w:pPr>
       <w:r>
         <w:rPr>
-          <w:rFonts w:ascii="Times New Roman" w:hAnsi="Times New Roman" w:eastAsia="Times New Roman"/>
+          <w:rFonts w:ascii="Times New Roman" w:hAnsi="Times New Roman" w:eastAsia="Times New Roman" w:cs="Times New Roman"/>
           <w:b w:val="0"/>
           <w:color w:val="232323"/>
           <w:sz w:val="20"/>
@@ -10587,7 +10714,7 @@
       </w:pPr>
       <w:r>
         <w:rPr>
-          <w:rFonts w:ascii="Times New Roman" w:hAnsi="Times New Roman" w:eastAsia="Times New Roman"/>
+          <w:rFonts w:ascii="Times New Roman" w:hAnsi="Times New Roman" w:eastAsia="Times New Roman" w:cs="Times New Roman"/>
           <w:b/>
           <w:color w:val="1F4E79"/>
           <w:sz w:val="23"/>
@@ -10638,7 +10765,7 @@
             </w:pPr>
             <w:r>
               <w:rPr>
-                <w:rFonts w:ascii="Times New Roman" w:hAnsi="Times New Roman" w:eastAsia="Times New Roman"/>
+                <w:rFonts w:ascii="Times New Roman" w:hAnsi="Times New Roman" w:eastAsia="Times New Roman" w:cs="Times New Roman"/>
                 <w:b/>
                 <w:color w:val="FFFFFF"/>
                 <w:sz w:val="17"/>
@@ -10673,7 +10800,7 @@
             </w:pPr>
             <w:r>
               <w:rPr>
-                <w:rFonts w:ascii="Times New Roman" w:hAnsi="Times New Roman" w:eastAsia="Times New Roman"/>
+                <w:rFonts w:ascii="Times New Roman" w:hAnsi="Times New Roman" w:eastAsia="Times New Roman" w:cs="Times New Roman"/>
                 <w:b/>
                 <w:color w:val="FFFFFF"/>
                 <w:sz w:val="17"/>
@@ -10714,7 +10841,7 @@
             </w:pPr>
             <w:r>
               <w:rPr>
-                <w:rFonts w:ascii="Times New Roman" w:hAnsi="Times New Roman" w:eastAsia="Times New Roman"/>
+                <w:rFonts w:ascii="Times New Roman" w:hAnsi="Times New Roman" w:eastAsia="Times New Roman" w:cs="Times New Roman"/>
                 <w:b w:val="0"/>
                 <w:color w:val="232323"/>
                 <w:sz w:val="17"/>
@@ -10749,7 +10876,7 @@
             </w:pPr>
             <w:r>
               <w:rPr>
-                <w:rFonts w:ascii="Times New Roman" w:hAnsi="Times New Roman" w:eastAsia="Times New Roman"/>
+                <w:rFonts w:ascii="Times New Roman" w:hAnsi="Times New Roman" w:eastAsia="Times New Roman" w:cs="Times New Roman"/>
                 <w:b w:val="0"/>
                 <w:color w:val="232323"/>
                 <w:sz w:val="17"/>
@@ -10789,7 +10916,7 @@
             </w:pPr>
             <w:r>
               <w:rPr>
-                <w:rFonts w:ascii="Times New Roman" w:hAnsi="Times New Roman" w:eastAsia="Times New Roman"/>
+                <w:rFonts w:ascii="Times New Roman" w:hAnsi="Times New Roman" w:eastAsia="Times New Roman" w:cs="Times New Roman"/>
                 <w:b w:val="0"/>
                 <w:color w:val="232323"/>
                 <w:sz w:val="17"/>
@@ -10823,7 +10950,7 @@
             </w:pPr>
             <w:r>
               <w:rPr>
-                <w:rFonts w:ascii="Times New Roman" w:hAnsi="Times New Roman" w:eastAsia="Times New Roman"/>
+                <w:rFonts w:ascii="Times New Roman" w:hAnsi="Times New Roman" w:eastAsia="Times New Roman" w:cs="Times New Roman"/>
                 <w:b w:val="0"/>
                 <w:color w:val="232323"/>
                 <w:sz w:val="17"/>
@@ -10864,7 +10991,7 @@
             </w:pPr>
             <w:r>
               <w:rPr>
-                <w:rFonts w:ascii="Times New Roman" w:hAnsi="Times New Roman" w:eastAsia="Times New Roman"/>
+                <w:rFonts w:ascii="Times New Roman" w:hAnsi="Times New Roman" w:eastAsia="Times New Roman" w:cs="Times New Roman"/>
                 <w:b w:val="0"/>
                 <w:color w:val="232323"/>
                 <w:sz w:val="17"/>
@@ -10899,7 +11026,7 @@
             </w:pPr>
             <w:r>
               <w:rPr>
-                <w:rFonts w:ascii="Times New Roman" w:hAnsi="Times New Roman" w:eastAsia="Times New Roman"/>
+                <w:rFonts w:ascii="Times New Roman" w:hAnsi="Times New Roman" w:eastAsia="Times New Roman" w:cs="Times New Roman"/>
                 <w:b w:val="0"/>
                 <w:color w:val="232323"/>
                 <w:sz w:val="17"/>
@@ -10939,7 +11066,7 @@
             </w:pPr>
             <w:r>
               <w:rPr>
-                <w:rFonts w:ascii="Times New Roman" w:hAnsi="Times New Roman" w:eastAsia="Times New Roman"/>
+                <w:rFonts w:ascii="Times New Roman" w:hAnsi="Times New Roman" w:eastAsia="Times New Roman" w:cs="Times New Roman"/>
                 <w:b w:val="0"/>
                 <w:color w:val="232323"/>
                 <w:sz w:val="17"/>
@@ -10973,7 +11100,7 @@
             </w:pPr>
             <w:r>
               <w:rPr>
-                <w:rFonts w:ascii="Times New Roman" w:hAnsi="Times New Roman" w:eastAsia="Times New Roman"/>
+                <w:rFonts w:ascii="Times New Roman" w:hAnsi="Times New Roman" w:eastAsia="Times New Roman" w:cs="Times New Roman"/>
                 <w:b w:val="0"/>
                 <w:color w:val="232323"/>
                 <w:sz w:val="17"/>
@@ -11014,7 +11141,7 @@
             </w:pPr>
             <w:r>
               <w:rPr>
-                <w:rFonts w:ascii="Times New Roman" w:hAnsi="Times New Roman" w:eastAsia="Times New Roman"/>
+                <w:rFonts w:ascii="Times New Roman" w:hAnsi="Times New Roman" w:eastAsia="Times New Roman" w:cs="Times New Roman"/>
                 <w:b w:val="0"/>
                 <w:color w:val="232323"/>
                 <w:sz w:val="17"/>
@@ -11049,7 +11176,7 @@
             </w:pPr>
             <w:r>
               <w:rPr>
-                <w:rFonts w:ascii="Times New Roman" w:hAnsi="Times New Roman" w:eastAsia="Times New Roman"/>
+                <w:rFonts w:ascii="Times New Roman" w:hAnsi="Times New Roman" w:eastAsia="Times New Roman" w:cs="Times New Roman"/>
                 <w:b w:val="0"/>
                 <w:color w:val="232323"/>
                 <w:sz w:val="17"/>
@@ -11089,7 +11216,7 @@
             </w:pPr>
             <w:r>
               <w:rPr>
-                <w:rFonts w:ascii="Times New Roman" w:hAnsi="Times New Roman" w:eastAsia="Times New Roman"/>
+                <w:rFonts w:ascii="Times New Roman" w:hAnsi="Times New Roman" w:eastAsia="Times New Roman" w:cs="Times New Roman"/>
                 <w:b w:val="0"/>
                 <w:color w:val="232323"/>
                 <w:sz w:val="17"/>
@@ -11123,7 +11250,7 @@
             </w:pPr>
             <w:r>
               <w:rPr>
-                <w:rFonts w:ascii="Times New Roman" w:hAnsi="Times New Roman" w:eastAsia="Times New Roman"/>
+                <w:rFonts w:ascii="Times New Roman" w:hAnsi="Times New Roman" w:eastAsia="Times New Roman" w:cs="Times New Roman"/>
                 <w:b w:val="0"/>
                 <w:color w:val="232323"/>
                 <w:sz w:val="17"/>
@@ -11164,7 +11291,7 @@
             </w:pPr>
             <w:r>
               <w:rPr>
-                <w:rFonts w:ascii="Times New Roman" w:hAnsi="Times New Roman" w:eastAsia="Times New Roman"/>
+                <w:rFonts w:ascii="Times New Roman" w:hAnsi="Times New Roman" w:eastAsia="Times New Roman" w:cs="Times New Roman"/>
                 <w:b w:val="0"/>
                 <w:color w:val="232323"/>
                 <w:sz w:val="17"/>
@@ -11199,7 +11326,7 @@
             </w:pPr>
             <w:r>
               <w:rPr>
-                <w:rFonts w:ascii="Times New Roman" w:hAnsi="Times New Roman" w:eastAsia="Times New Roman"/>
+                <w:rFonts w:ascii="Times New Roman" w:hAnsi="Times New Roman" w:eastAsia="Times New Roman" w:cs="Times New Roman"/>
                 <w:b w:val="0"/>
                 <w:color w:val="232323"/>
                 <w:sz w:val="17"/>
@@ -11235,7 +11362,7 @@
           <w:p>
             <w:r>
               <w:rPr>
-                <w:rFonts w:ascii="Times New Roman" w:hAnsi="Times New Roman" w:eastAsia="Times New Roman"/>
+                <w:rFonts w:ascii="Times New Roman" w:hAnsi="Times New Roman" w:eastAsia="Times New Roman" w:cs="Times New Roman"/>
                 <w:b w:val="0"/>
                 <w:color w:val="232323"/>
                 <w:sz w:val="17"/>
@@ -11265,7 +11392,7 @@
           <w:p>
             <w:r>
               <w:rPr>
-                <w:rFonts w:ascii="Times New Roman" w:hAnsi="Times New Roman" w:eastAsia="Times New Roman"/>
+                <w:rFonts w:ascii="Times New Roman" w:hAnsi="Times New Roman" w:eastAsia="Times New Roman" w:cs="Times New Roman"/>
                 <w:b w:val="0"/>
                 <w:color w:val="232323"/>
                 <w:sz w:val="17"/>
@@ -11298,7 +11425,7 @@
             <w:pPr/>
             <w:r>
               <w:rPr>
-                <w:rFonts w:ascii="Times New Roman" w:hAnsi="Times New Roman" w:eastAsia="Times New Roman"/>
+                <w:rFonts w:ascii="Times New Roman" w:hAnsi="Times New Roman" w:eastAsia="Times New Roman" w:cs="Times New Roman"/>
                 <w:b w:val="0"/>
                 <w:color w:val="232323"/>
                 <w:sz w:val="17"/>
@@ -11329,7 +11456,7 @@
             <w:pPr/>
             <w:r>
               <w:rPr>
-                <w:rFonts w:ascii="Times New Roman" w:hAnsi="Times New Roman" w:eastAsia="Times New Roman"/>
+                <w:rFonts w:ascii="Times New Roman" w:hAnsi="Times New Roman" w:eastAsia="Times New Roman" w:cs="Times New Roman"/>
                 <w:b w:val="0"/>
                 <w:color w:val="232323"/>
                 <w:sz w:val="17"/>
@@ -11353,7 +11480,7 @@
       </w:pPr>
       <w:r>
         <w:rPr>
-          <w:rFonts w:ascii="Times New Roman" w:hAnsi="Times New Roman" w:eastAsia="Times New Roman"/>
+          <w:rFonts w:ascii="Times New Roman" w:hAnsi="Times New Roman" w:eastAsia="Times New Roman" w:cs="Times New Roman"/>
           <w:b/>
           <w:color w:val="1F4E79"/>
           <w:sz w:val="23"/>
@@ -11367,7 +11494,7 @@
       </w:pPr>
       <w:r>
         <w:rPr>
-          <w:rFonts w:ascii="Times New Roman" w:hAnsi="Times New Roman" w:eastAsia="Times New Roman"/>
+          <w:rFonts w:ascii="Times New Roman" w:hAnsi="Times New Roman" w:eastAsia="Times New Roman" w:cs="Times New Roman"/>
           <w:b w:val="0"/>
           <w:color w:val="232323"/>
           <w:sz w:val="20"/>
@@ -11422,7 +11549,7 @@
       </w:pPr>
       <w:r>
         <w:rPr>
-          <w:rFonts w:ascii="Times New Roman" w:hAnsi="Times New Roman" w:eastAsia="Times New Roman"/>
+          <w:rFonts w:ascii="Times New Roman" w:hAnsi="Times New Roman" w:eastAsia="Times New Roman" w:cs="Times New Roman"/>
           <w:b w:val="0"/>
           <w:color w:val="232323"/>
           <w:sz w:val="20"/>
@@ -11452,7 +11579,7 @@
     </w:pPr>
     <w:r>
       <w:rPr>
-        <w:rFonts w:ascii="Times New Roman" w:hAnsi="Times New Roman" w:eastAsia="Times New Roman"/>
+        <w:rFonts w:ascii="Times New Roman" w:hAnsi="Times New Roman" w:eastAsia="Times New Roman" w:cs="Times New Roman"/>
         <w:b w:val="0"/>
         <w:color w:val="646464"/>
         <w:sz w:val="17"/>
@@ -11461,7 +11588,7 @@
     </w:r>
     <w:r>
       <w:rPr>
-        <w:rFonts w:ascii="Times New Roman" w:hAnsi="Times New Roman" w:eastAsia="Times New Roman"/>
+        <w:rFonts w:ascii="Times New Roman" w:hAnsi="Times New Roman" w:eastAsia="Times New Roman" w:cs="Times New Roman"/>
         <w:b w:val="0"/>
         <w:color w:val="646464"/>
         <w:sz w:val="17"/>
@@ -11485,7 +11612,7 @@
     </w:pPr>
     <w:r>
       <w:rPr>
-        <w:rFonts w:ascii="Times New Roman" w:hAnsi="Times New Roman" w:eastAsia="Times New Roman"/>
+        <w:rFonts w:ascii="Times New Roman" w:hAnsi="Times New Roman" w:eastAsia="Times New Roman" w:cs="Times New Roman"/>
         <w:b w:val="0"/>
         <w:color w:val="646464"/>
         <w:sz w:val="17"/>
@@ -11864,9 +11991,9 @@
       <w:ind w:firstLine="420"/>
     </w:pPr>
     <w:rPr>
-      <w:rFonts w:ascii="Microsoft YaHei" w:hAnsi="Microsoft YaHei" w:eastAsia="Microsoft YaHei"/>
+      <w:rFonts w:ascii="Times New Roman" w:hAnsi="Times New Roman" w:eastAsia="Times New Roman" w:cs="Times New Roman"/>
       <w:color w:val="202124"/>
-      <w:sz w:val="21"/>
+      <w:sz w:val="20"/>
     </w:rPr>
   </w:style>
   <w:style w:type="paragraph" w:styleId="Header">
@@ -11928,7 +12055,7 @@
       <w:outlineLvl w:val="0"/>
     </w:pPr>
     <w:rPr>
-      <w:rFonts w:asciiTheme="majorHAnsi" w:eastAsiaTheme="majorEastAsia" w:hAnsiTheme="majorHAnsi" w:cstheme="majorBidi" w:ascii="Microsoft YaHei" w:hAnsi="Microsoft YaHei" w:eastAsia="Microsoft YaHei"/>
+      <w:rFonts w:asciiTheme="majorHAnsi" w:eastAsiaTheme="majorEastAsia" w:hAnsiTheme="majorHAnsi" w:cstheme="majorBidi" w:ascii="Times New Roman" w:hAnsi="Times New Roman" w:eastAsia="Times New Roman" w:cs="Times New Roman"/>
       <w:b/>
       <w:bCs/>
       <w:color w:val="163A5F"/>
@@ -11952,7 +12079,7 @@
       <w:outlineLvl w:val="1"/>
     </w:pPr>
     <w:rPr>
-      <w:rFonts w:asciiTheme="majorHAnsi" w:eastAsiaTheme="majorEastAsia" w:hAnsiTheme="majorHAnsi" w:cstheme="majorBidi" w:ascii="Microsoft YaHei" w:hAnsi="Microsoft YaHei" w:eastAsia="Microsoft YaHei"/>
+      <w:rFonts w:asciiTheme="majorHAnsi" w:eastAsiaTheme="majorEastAsia" w:hAnsiTheme="majorHAnsi" w:cstheme="majorBidi" w:ascii="Times New Roman" w:hAnsi="Times New Roman" w:eastAsia="Times New Roman" w:cs="Times New Roman"/>
       <w:b/>
       <w:bCs/>
       <w:color w:val="2D5F8B"/>
@@ -11976,7 +12103,7 @@
       <w:outlineLvl w:val="2"/>
     </w:pPr>
     <w:rPr>
-      <w:rFonts w:asciiTheme="majorHAnsi" w:eastAsiaTheme="majorEastAsia" w:hAnsiTheme="majorHAnsi" w:cstheme="majorBidi" w:ascii="Microsoft YaHei" w:hAnsi="Microsoft YaHei" w:eastAsia="Microsoft YaHei"/>
+      <w:rFonts w:asciiTheme="majorHAnsi" w:eastAsiaTheme="majorEastAsia" w:hAnsiTheme="majorHAnsi" w:cstheme="majorBidi" w:ascii="Times New Roman" w:hAnsi="Times New Roman" w:eastAsia="Times New Roman" w:cs="Times New Roman"/>
       <w:b/>
       <w:bCs/>
       <w:color w:val="0B7A75"/>
@@ -12218,7 +12345,7 @@
       <w:contextualSpacing/>
     </w:pPr>
     <w:rPr>
-      <w:rFonts w:asciiTheme="majorHAnsi" w:eastAsiaTheme="majorEastAsia" w:hAnsiTheme="majorHAnsi" w:cstheme="majorBidi"/>
+      <w:rFonts w:asciiTheme="majorHAnsi" w:eastAsiaTheme="majorEastAsia" w:hAnsiTheme="majorHAnsi" w:cstheme="majorBidi" w:ascii="Georgia" w:hAnsi="Georgia" w:eastAsia="Georgia" w:cs="Georgia"/>
       <w:color w:val="17365D" w:themeColor="text2" w:themeShade="BF"/>
       <w:spacing w:val="5"/>
       <w:kern w:val="28"/>
@@ -12255,7 +12382,7 @@
       </w:numPr>
     </w:pPr>
     <w:rPr>
-      <w:rFonts w:asciiTheme="majorHAnsi" w:eastAsiaTheme="majorEastAsia" w:hAnsiTheme="majorHAnsi" w:cstheme="majorBidi"/>
+      <w:rFonts w:asciiTheme="majorHAnsi" w:eastAsiaTheme="majorEastAsia" w:hAnsiTheme="majorHAnsi" w:cstheme="majorBidi" w:ascii="Times New Roman" w:hAnsi="Times New Roman" w:eastAsia="Times New Roman" w:cs="Times New Roman"/>
       <w:i/>
       <w:iCs/>
       <w:color w:val="4F81BD" w:themeColor="accent1"/>
@@ -23559,7 +23686,7 @@
       <w:jc w:val="center"/>
     </w:pPr>
     <w:rPr>
-      <w:rFonts w:ascii="Microsoft YaHei" w:hAnsi="Microsoft YaHei" w:eastAsia="Microsoft YaHei"/>
+      <w:rFonts w:ascii="Times New Roman" w:hAnsi="Times New Roman" w:eastAsia="Times New Roman" w:cs="Times New Roman"/>
       <w:color w:val="5B6573"/>
       <w:sz w:val="18"/>
     </w:rPr>

</xml_diff>

<commit_message>
report: refine English cover title layout
</commit_message>
<xml_diff>
--- a/report/experiment3_lab_report_group17_en.docx
+++ b/report/experiment3_lab_report_group17_en.docx
@@ -5,6 +5,7 @@
     <w:p>
       <w:pPr>
         <w:spacing w:before="160" w:after="340" w:line="252" w:lineRule="auto"/>
+        <w:ind w:firstLine="0" w:left="0" w:right="0"/>
         <w:jc w:val="left"/>
       </w:pPr>
       <w:r>
@@ -20,6 +21,7 @@
     <w:p>
       <w:pPr>
         <w:spacing w:before="0" w:after="160" w:line="252" w:lineRule="auto"/>
+        <w:ind w:firstLine="0" w:left="0" w:right="0"/>
         <w:jc w:val="left"/>
       </w:pPr>
       <w:r>
@@ -35,7 +37,8 @@
     <w:p>
       <w:pPr>
         <w:pStyle w:val="Title"/>
-        <w:spacing w:before="0" w:after="180" w:line="252" w:lineRule="auto"/>
+        <w:spacing w:before="0" w:after="240" w:line="240" w:lineRule="auto"/>
+        <w:ind w:left="0" w:right="0" w:firstLine="0"/>
         <w:jc w:val="left"/>
       </w:pPr>
       <w:r>
@@ -43,7 +46,7 @@
           <w:rFonts w:ascii="Georgia" w:hAnsi="Georgia" w:eastAsia="Georgia" w:cs="Georgia"/>
           <w:b/>
           <w:color w:val="1B3E5B"/>
-          <w:sz w:val="52"/>
+          <w:sz w:val="48"/>
         </w:rPr>
         <w:t>Desktop Object Automatic</w:t>
         <w:br/>
@@ -52,7 +55,8 @@
     </w:p>
     <w:p>
       <w:pPr>
-        <w:spacing w:before="0" w:after="380" w:line="252" w:lineRule="auto"/>
+        <w:spacing w:before="0" w:after="400" w:line="240" w:lineRule="auto"/>
+        <w:ind w:left="0" w:right="0" w:firstLine="0"/>
         <w:jc w:val="left"/>
       </w:pPr>
       <w:r>
@@ -60,7 +64,7 @@
           <w:rFonts w:ascii="Times New Roman" w:hAnsi="Times New Roman" w:eastAsia="Times New Roman" w:cs="Times New Roman"/>
           <w:b/>
           <w:color w:val="4B5560"/>
-          <w:sz w:val="22"/>
+          <w:sz w:val="21"/>
         </w:rPr>
         <w:t>GROUP LABORATORY REPORT</w:t>
       </w:r>
@@ -201,6 +205,7 @@
     <w:p>
       <w:pPr>
         <w:spacing w:before="360" w:after="40"/>
+        <w:ind w:firstLine="0" w:left="0" w:right="0"/>
         <w:jc w:val="center"/>
       </w:pPr>
       <w:r>
@@ -241,6 +246,7 @@
     <w:p>
       <w:pPr>
         <w:spacing w:before="0" w:after="340" w:line="252" w:lineRule="auto"/>
+        <w:ind w:firstLine="0" w:left="0" w:right="0"/>
         <w:jc w:val="center"/>
       </w:pPr>
       <w:r>
@@ -359,6 +365,7 @@
     <w:p>
       <w:pPr>
         <w:spacing w:before="320" w:after="80" w:line="252" w:lineRule="auto"/>
+        <w:ind w:firstLine="0" w:left="0" w:right="0"/>
         <w:jc w:val="left"/>
       </w:pPr>
       <w:r>
@@ -374,6 +381,7 @@
     <w:p>
       <w:pPr>
         <w:spacing w:before="0" w:after="160" w:line="252" w:lineRule="auto"/>
+        <w:ind w:firstLine="0" w:left="0" w:right="0"/>
         <w:jc w:val="left"/>
       </w:pPr>
       <w:r>
@@ -389,6 +397,7 @@
     <w:p>
       <w:pPr>
         <w:spacing w:before="0" w:after="0" w:line="252" w:lineRule="auto"/>
+        <w:ind w:firstLine="0" w:left="0" w:right="0"/>
         <w:jc w:val="left"/>
       </w:pPr>
       <w:r>
@@ -12338,9 +12347,6 @@
     <w:qFormat/>
     <w:rsid w:val="00FC693F"/>
     <w:pPr>
-      <w:pBdr>
-        <w:bottom w:val="single" w:sz="8" w:space="4" w:color="4F81BD" w:themeColor="accent1"/>
-      </w:pBdr>
       <w:spacing w:after="300" w:line="240" w:lineRule="auto"/>
       <w:contextualSpacing/>
     </w:pPr>

</xml_diff>

<commit_message>
report: center English cover title block
</commit_message>
<xml_diff>
--- a/report/experiment3_lab_report_group17_en.docx
+++ b/report/experiment3_lab_report_group17_en.docx
@@ -4,32 +4,34 @@
   <w:body>
     <w:p>
       <w:pPr>
-        <w:spacing w:before="160" w:after="340" w:line="252" w:lineRule="auto"/>
-        <w:ind w:firstLine="0" w:left="0" w:right="0"/>
-        <w:jc w:val="left"/>
+        <w:spacing w:before="160" w:after="360" w:line="240" w:lineRule="auto"/>
+        <w:ind w:left="0" w:right="0" w:firstLine="0"/>
+        <w:jc w:val="center"/>
+      </w:pPr>
+      <w:r>
+        <w:rPr>
+          <w:rFonts w:ascii="Times New Roman" w:hAnsi="Times New Roman" w:eastAsia="Times New Roman" w:cs="Times New Roman"/>
+          <w:b/>
+          <w:color w:val="4B5560"/>
+          <w:sz w:val="18"/>
+          <w:spacing w:val="8"/>
+        </w:rPr>
+        <w:t>ROBOTICS INTEGRATION GROUP PROJECT I  /  GROUP 17</w:t>
+      </w:r>
+    </w:p>
+    <w:p>
+      <w:pPr>
+        <w:spacing w:before="0" w:after="200" w:line="240" w:lineRule="auto"/>
+        <w:ind w:left="0" w:right="0" w:firstLine="0"/>
+        <w:jc w:val="center"/>
       </w:pPr>
       <w:r>
         <w:rPr>
           <w:rFonts w:ascii="Times New Roman" w:hAnsi="Times New Roman" w:eastAsia="Times New Roman" w:cs="Times New Roman"/>
           <w:b/>
           <w:color w:val="107B7E"/>
-          <w:sz w:val="19"/>
-        </w:rPr>
-        <w:t>ROBOTICS INTEGRATION GROUP PROJECT I  /  GROUP 17</w:t>
-      </w:r>
-    </w:p>
-    <w:p>
-      <w:pPr>
-        <w:spacing w:before="0" w:after="160" w:line="252" w:lineRule="auto"/>
-        <w:ind w:firstLine="0" w:left="0" w:right="0"/>
-        <w:jc w:val="left"/>
-      </w:pPr>
-      <w:r>
-        <w:rPr>
-          <w:rFonts w:ascii="Times New Roman" w:hAnsi="Times New Roman" w:eastAsia="Times New Roman" w:cs="Times New Roman"/>
-          <w:b/>
-          <w:color w:val="107B7E"/>
-          <w:sz w:val="22"/>
+          <w:sz w:val="21"/>
+          <w:spacing w:val="12"/>
         </w:rPr>
         <w:t>EXPERIMENT 03</w:t>
       </w:r>
@@ -37,16 +39,16 @@
     <w:p>
       <w:pPr>
         <w:pStyle w:val="Title"/>
-        <w:spacing w:before="0" w:after="240" w:line="240" w:lineRule="auto"/>
+        <w:spacing w:before="0" w:after="260" w:line="230" w:lineRule="auto"/>
         <w:ind w:left="0" w:right="0" w:firstLine="0"/>
-        <w:jc w:val="left"/>
+        <w:jc w:val="center"/>
       </w:pPr>
       <w:r>
         <w:rPr>
           <w:rFonts w:ascii="Georgia" w:hAnsi="Georgia" w:eastAsia="Georgia" w:cs="Georgia"/>
           <w:b/>
-          <w:color w:val="1B3E5B"/>
-          <w:sz w:val="48"/>
+          <w:color w:val="000000"/>
+          <w:sz w:val="46"/>
         </w:rPr>
         <w:t>Desktop Object Automatic</w:t>
         <w:br/>
@@ -55,16 +57,17 @@
     </w:p>
     <w:p>
       <w:pPr>
-        <w:spacing w:before="0" w:after="400" w:line="240" w:lineRule="auto"/>
+        <w:spacing w:before="0" w:after="440" w:line="240" w:lineRule="auto"/>
         <w:ind w:left="0" w:right="0" w:firstLine="0"/>
-        <w:jc w:val="left"/>
+        <w:jc w:val="center"/>
       </w:pPr>
       <w:r>
         <w:rPr>
           <w:rFonts w:ascii="Times New Roman" w:hAnsi="Times New Roman" w:eastAsia="Times New Roman" w:cs="Times New Roman"/>
           <w:b/>
           <w:color w:val="4B5560"/>
-          <w:sz w:val="21"/>
+          <w:sz w:val="20"/>
+          <w:spacing w:val="16"/>
         </w:rPr>
         <w:t>GROUP LABORATORY REPORT</w:t>
       </w:r>

</xml_diff>